<commit_message>
word doc formatting fixes
</commit_message>
<xml_diff>
--- a/SubPages/Security_Risk/docs/SRM_Final_Reflection.docx
+++ b/SubPages/Security_Risk/docs/SRM_Final_Reflection.docx
@@ -5,14 +5,19 @@
     <w:p>
       <w:pPr>
         <w:pStyle w:val="Title"/>
+        <w:spacing w:line="480" w:lineRule="auto"/>
       </w:pPr>
       <w:r>
         <w:t>Security and Risk Management: Final Reflection</w:t>
       </w:r>
     </w:p>
     <w:p>
+      <w:pPr>
+        <w:spacing w:line="480" w:lineRule="auto"/>
+      </w:pPr>
       <w:r>
         <w:rPr>
+          <w:rFonts w:ascii="Arial" w:hAnsi="Arial" w:cs="Arial" w:eastAsia="Arial"/>
           <w:b/>
         </w:rPr>
         <w:t xml:space="preserve">e-Portfolio: </w:t>
@@ -22,13 +27,20 @@
       </w:r>
     </w:p>
     <w:p>
+      <w:pPr>
+        <w:spacing w:line="480" w:lineRule="auto"/>
+      </w:pPr>
       <w:r>
         <w:t>Ian Stevens  |  Security and Risk Management, October 2025  |  University of Essex Online</w:t>
       </w:r>
     </w:p>
     <w:p>
+      <w:pPr>
+        <w:spacing w:line="480" w:lineRule="auto"/>
+      </w:pPr>
       <w:r>
         <w:rPr>
+          <w:rFonts w:ascii="Arial" w:hAnsi="Arial" w:cs="Arial" w:eastAsia="Arial"/>
           <w:i/>
         </w:rPr>
         <w:t>Structured using the What? So what? Now what? model (Rolfe, Freshwater and Jasper, 2001). 933 words, excluding headings and references.</w:t>
@@ -37,12 +49,16 @@
     <w:p>
       <w:pPr>
         <w:pStyle w:val="Heading1"/>
+        <w:spacing w:line="480" w:lineRule="auto"/>
       </w:pPr>
       <w:r>
         <w:t>What?</w:t>
       </w:r>
     </w:p>
     <w:p>
+      <w:pPr>
+        <w:spacing w:line="480" w:lineRule="auto"/>
+      </w:pPr>
       <w:r>
         <w:t>Over twelve units the module moved from definitions of risk, through threat modelling, standards, quantitative modelling and business continuity, to emerging trends. The thread running through it was Pampered Pets, a four-person pet food retailer deciding whether to digitalise. Our team, Group 2, submitted an ISO 31000 and ISO/IEC 27005 risk assessment at the end of Unit 6, which scored 83 out of 100. My part was the digitalised data flow model, the STRIDE and threat tables, the methodology and standards section and the phased implementation plan, and I did the final edit and the references. My individual executive summary, submitted at the end of Unit 11, added Monte Carlo, fault tree and weighted-sum models and received 55%. Alongside both, I rebuilt published models in Python and then turned the same checks on my own work.</w:t>
       </w:r>
@@ -50,27 +66,40 @@
     <w:p>
       <w:pPr>
         <w:pStyle w:val="Heading1"/>
+        <w:spacing w:line="480" w:lineRule="auto"/>
       </w:pPr>
       <w:r>
         <w:t>So what?</w:t>
       </w:r>
     </w:p>
     <w:p>
+      <w:pPr>
+        <w:spacing w:line="480" w:lineRule="auto"/>
+      </w:pPr>
       <w:r>
         <w:t>The biggest change was in what I think the risk management process produces. I started the module treating it as a way of producing ratings and ended it treating it as a way of making decisions under assumptions that have to be stated. Each step of the module exposed a hidden assumption in our work. Choosing a definition of risk decided whether the possible 50% growth counted at all (Unit 1). Our matrix rated regulatory non-compliance ‘High’ from a low likelihood and a medium impact, the inconsistency Cox (2008) describes (Unit 2). In my own model, the ±0.08% I reported turned out to be simulation error, not uncertainty, and the input that drove the result, how well staff detect a faulty batch, was a human behaviour I had assumed rather than measured (Units 7 and 11). The business impact analysis in Unit 9 showed that the active-active architecture I had recommended had no requirement behind it, and Unit 10 costed it at about £45,000 a year against about £3,400 for a design that met the requirements better. Rebuilding Aijaz and Nazir’s (2024) model in Unit 8, I found its faults faster than I had found my own, which was uncomfortable but taught me that reproducing a number is the minimum test before relying on it.</w:t>
       </w:r>
     </w:p>
     <w:p>
+      <w:pPr>
+        <w:spacing w:line="480" w:lineRule="auto"/>
+      </w:pPr>
       <w:r>
         <w:t>My contribution to the team report carried several of the weaknesses I later criticised. I applied STRIDE once to the whole digital estate rather than to each element of the data flow diagram I had drawn, and the table had no row for elevation of privilege, although the status-quo assessment recorded poor access control. My standards section named ISO 31000 and ISO/IEC 27005, which are guidance, and not the UK GDPR or PCI DSS, which bind the business. Because I compiled the references, the tutor’s comment that ‘very recent sources are expected’ was partly about my work. The phased plan held up best: putting security policy, training and the network upgrade ahead of the website was the right order, and later units only added detail to it. The final edit did not catch the inconsistent rating, which suggests that I edited for length and presentation within the 1,000-word limit rather than checking the report against its own method.</w:t>
       </w:r>
     </w:p>
     <w:p>
+      <w:pPr>
+        <w:spacing w:line="480" w:lineRule="auto"/>
+      </w:pPr>
       <w:r>
         <w:t>The team itself worked well. We agreed a group contract in the first week, divided the work evenly by section and worked without conflict. The weakness of that arrangement was structural, not personal: each section had an owner, but nobody owned the joins, so the business case never met the STRIDE table and the regulatory row was never challenged. We were also all from IT backgrounds, and nobody looked at the warehouse as an operations lead would, which is the multidisciplinary gap Ross, McEvilley and Oren (2016) warn about. The part of the experience I find hardest to accept is that the tutor’s feedback on the team report arrived seven weeks before I submitted my executive summary and named the same faults that cost me most marks: limitations not acknowledged and too few sources. I read it as feedback on the group’s writing rather than on my own habits.</w:t>
       </w:r>
     </w:p>
     <w:p>
+      <w:pPr>
+        <w:spacing w:line="480" w:lineRule="auto"/>
+      </w:pPr>
       <w:r>
         <w:t>For my professional development the main gain is a habit, not a technique. By the end of the module every number I produced came with the formula behind it, a range, a sensitivity analysis and a check in code that others can rerun, and I had learned to read a standard, such as Cyber Essentials v3.3, for the evidence it demands rather than the topics it lists. The Unit 12 debate showed the habit working under pressure: while preparing, I found that the headline time-to-exploit figure mixes zero-days and n-days and conceded the point in the presentation rather than waiting to be challenged. That figure is the kind of metric Nicol et al. (2012) say must be ‘validated’ before it is trusted.</w:t>
       </w:r>
@@ -78,12 +107,16 @@
     <w:p>
       <w:pPr>
         <w:pStyle w:val="Heading1"/>
+        <w:spacing w:line="480" w:lineRule="auto"/>
       </w:pPr>
       <w:r>
         <w:t>Now what?</w:t>
       </w:r>
     </w:p>
     <w:p>
+      <w:pPr>
+        <w:spacing w:line="480" w:lineRule="auto"/>
+      </w:pPr>
       <w:r>
         <w:t>Four actions follow, and the action plan in my e-portfolio sets out how I will check them. First, every assessment I lead will open with the definition of risk in use, the assumptions to be confirmed with the client and a register of the obligations that apply. Second, every figure I report will state what it measures, its range and the date of its source, and will be calculated in code. Third, in team work I will propose an integrator who reviews the whole document against its stated method before submission, and I will keep a log of feedback received so that comments on one piece are applied to the next. Fourth, at work I will try the first two on my next risk review and start a register of automated security rules, each with a named owner, because the Unit 12 work showed that delegated decisions are where risk will increasingly sit.</w:t>
       </w:r>
@@ -91,159 +124,233 @@
     <w:p>
       <w:pPr>
         <w:pStyle w:val="Heading1"/>
+        <w:spacing w:line="480" w:lineRule="auto"/>
       </w:pPr>
       <w:r>
         <w:t>References</w:t>
       </w:r>
     </w:p>
     <w:p>
+      <w:pPr>
+        <w:spacing w:line="480" w:lineRule="auto"/>
+      </w:pPr>
       <w:r>
-        <w:rPr/>
+        <w:rPr>
+          <w:rFonts w:ascii="Arial" w:hAnsi="Arial" w:cs="Arial" w:eastAsia="Arial"/>
+        </w:rPr>
         <w:t xml:space="preserve">Aijaz, M. and Nazir, M. (2024) ‘Modelling and analysis of social engineering threats using the attack tree and the Markov model’, </w:t>
       </w:r>
       <w:r>
         <w:rPr>
+          <w:rFonts w:ascii="Arial" w:hAnsi="Arial" w:cs="Arial" w:eastAsia="Arial"/>
           <w:i/>
         </w:rPr>
         <w:t>International Journal of Information Technology</w:t>
       </w:r>
       <w:r>
-        <w:rPr/>
+        <w:rPr>
+          <w:rFonts w:ascii="Arial" w:hAnsi="Arial" w:cs="Arial" w:eastAsia="Arial"/>
+        </w:rPr>
         <w:t xml:space="preserve">, 16(2), pp. 1231–1238. Available at: </w:t>
       </w:r>
       <w:r>
-        <w:rPr/>
+        <w:rPr>
+          <w:rFonts w:ascii="Arial" w:hAnsi="Arial" w:cs="Arial" w:eastAsia="Arial"/>
+        </w:rPr>
         <w:t>https://doi.org/10.1007/s41870-023-01540-z</w:t>
       </w:r>
       <w:r>
-        <w:rPr/>
+        <w:rPr>
+          <w:rFonts w:ascii="Arial" w:hAnsi="Arial" w:cs="Arial" w:eastAsia="Arial"/>
+        </w:rPr>
         <w:t xml:space="preserve"> (Accessed: 3 October 2026).</w:t>
       </w:r>
     </w:p>
     <w:p>
+      <w:pPr>
+        <w:spacing w:line="480" w:lineRule="auto"/>
+      </w:pPr>
       <w:r>
-        <w:rPr/>
+        <w:rPr>
+          <w:rFonts w:ascii="Arial" w:hAnsi="Arial" w:cs="Arial" w:eastAsia="Arial"/>
+        </w:rPr>
         <w:t xml:space="preserve">Cox, L.A. (2008) ‘What’s wrong with risk matrices?’, </w:t>
       </w:r>
       <w:r>
         <w:rPr>
+          <w:rFonts w:ascii="Arial" w:hAnsi="Arial" w:cs="Arial" w:eastAsia="Arial"/>
           <w:i/>
         </w:rPr>
         <w:t>Risk Analysis</w:t>
       </w:r>
       <w:r>
-        <w:rPr/>
+        <w:rPr>
+          <w:rFonts w:ascii="Arial" w:hAnsi="Arial" w:cs="Arial" w:eastAsia="Arial"/>
+        </w:rPr>
         <w:t xml:space="preserve">, 28(2), pp. 497–512. Available at: </w:t>
       </w:r>
       <w:r>
-        <w:rPr/>
+        <w:rPr>
+          <w:rFonts w:ascii="Arial" w:hAnsi="Arial" w:cs="Arial" w:eastAsia="Arial"/>
+        </w:rPr>
         <w:t>https://doi.org/10.1111/j.1539-6924.2008.01030.x</w:t>
       </w:r>
       <w:r>
-        <w:rPr/>
+        <w:rPr>
+          <w:rFonts w:ascii="Arial" w:hAnsi="Arial" w:cs="Arial" w:eastAsia="Arial"/>
+        </w:rPr>
         <w:t xml:space="preserve"> (Accessed: 3 October 2026).</w:t>
       </w:r>
     </w:p>
     <w:p>
+      <w:pPr>
+        <w:spacing w:line="480" w:lineRule="auto"/>
+      </w:pPr>
       <w:r>
-        <w:rPr/>
+        <w:rPr>
+          <w:rFonts w:ascii="Arial" w:hAnsi="Arial" w:cs="Arial" w:eastAsia="Arial"/>
+        </w:rPr>
         <w:t xml:space="preserve">Group 2 (2025) </w:t>
       </w:r>
       <w:r>
         <w:rPr>
+          <w:rFonts w:ascii="Arial" w:hAnsi="Arial" w:cs="Arial" w:eastAsia="Arial"/>
           <w:i/>
         </w:rPr>
         <w:t>A risk assessment report for Pampered Pets based on ISO/IEC 27005:2022 and ISO 31000:2018</w:t>
       </w:r>
       <w:r>
-        <w:rPr/>
+        <w:rPr>
+          <w:rFonts w:ascii="Arial" w:hAnsi="Arial" w:cs="Arial" w:eastAsia="Arial"/>
+        </w:rPr>
         <w:t>. Unpublished team report, Security and Risk Management module. University of Essex Online.</w:t>
       </w:r>
     </w:p>
     <w:p>
+      <w:pPr>
+        <w:spacing w:line="480" w:lineRule="auto"/>
+      </w:pPr>
       <w:r>
-        <w:rPr/>
+        <w:rPr>
+          <w:rFonts w:ascii="Arial" w:hAnsi="Arial" w:cs="Arial" w:eastAsia="Arial"/>
+        </w:rPr>
         <w:t xml:space="preserve">Nicol, D.M., Sanders, W.H., Scherlis, W.L. and Williams, L.A. (2012) </w:t>
       </w:r>
       <w:r>
         <w:rPr>
+          <w:rFonts w:ascii="Arial" w:hAnsi="Arial" w:cs="Arial" w:eastAsia="Arial"/>
           <w:i/>
         </w:rPr>
         <w:t>Science of security hard problems: a lablet perspective</w:t>
       </w:r>
       <w:r>
-        <w:rPr/>
+        <w:rPr>
+          <w:rFonts w:ascii="Arial" w:hAnsi="Arial" w:cs="Arial" w:eastAsia="Arial"/>
+        </w:rPr>
         <w:t xml:space="preserve">. Science of Security Virtual Organization, 27 November. Available at: </w:t>
       </w:r>
       <w:r>
-        <w:rPr/>
+        <w:rPr>
+          <w:rFonts w:ascii="Arial" w:hAnsi="Arial" w:cs="Arial" w:eastAsia="Arial"/>
+        </w:rPr>
         <w:t>https://sos-vo.org/node/6394</w:t>
       </w:r>
       <w:r>
-        <w:rPr/>
+        <w:rPr>
+          <w:rFonts w:ascii="Arial" w:hAnsi="Arial" w:cs="Arial" w:eastAsia="Arial"/>
+        </w:rPr>
         <w:t xml:space="preserve"> (Accessed: 3 October 2026).</w:t>
       </w:r>
     </w:p>
     <w:p>
+      <w:pPr>
+        <w:spacing w:line="480" w:lineRule="auto"/>
+      </w:pPr>
       <w:r>
-        <w:rPr/>
+        <w:rPr>
+          <w:rFonts w:ascii="Arial" w:hAnsi="Arial" w:cs="Arial" w:eastAsia="Arial"/>
+        </w:rPr>
         <w:t xml:space="preserve">Rolfe, G., Freshwater, D. and Jasper, M. (2001) </w:t>
       </w:r>
       <w:r>
         <w:rPr>
+          <w:rFonts w:ascii="Arial" w:hAnsi="Arial" w:cs="Arial" w:eastAsia="Arial"/>
           <w:i/>
         </w:rPr>
         <w:t>Critical reflection for nursing and the helping professions: a user’s guide</w:t>
       </w:r>
       <w:r>
-        <w:rPr/>
+        <w:rPr>
+          <w:rFonts w:ascii="Arial" w:hAnsi="Arial" w:cs="Arial" w:eastAsia="Arial"/>
+        </w:rPr>
         <w:t>. Basingstoke: Palgrave Macmillan.</w:t>
       </w:r>
     </w:p>
     <w:p>
+      <w:pPr>
+        <w:spacing w:line="480" w:lineRule="auto"/>
+      </w:pPr>
       <w:r>
-        <w:rPr/>
+        <w:rPr>
+          <w:rFonts w:ascii="Arial" w:hAnsi="Arial" w:cs="Arial" w:eastAsia="Arial"/>
+        </w:rPr>
         <w:t xml:space="preserve">Ross, R., McEvilley, M. and Oren, J.C. (2016) </w:t>
       </w:r>
       <w:r>
         <w:rPr>
+          <w:rFonts w:ascii="Arial" w:hAnsi="Arial" w:cs="Arial" w:eastAsia="Arial"/>
           <w:i/>
         </w:rPr>
         <w:t>Systems security engineering: considerations for a multidisciplinary approach in the engineering of trustworthy secure systems</w:t>
       </w:r>
       <w:r>
-        <w:rPr/>
+        <w:rPr>
+          <w:rFonts w:ascii="Arial" w:hAnsi="Arial" w:cs="Arial" w:eastAsia="Arial"/>
+        </w:rPr>
         <w:t xml:space="preserve">. NIST Special Publication 800-160 (withdrawn 21 March 2018 and superseded by SP 800-160 Vol. 1). Gaithersburg, MD: National Institute of Standards and Technology. Available at: </w:t>
       </w:r>
       <w:r>
-        <w:rPr/>
+        <w:rPr>
+          <w:rFonts w:ascii="Arial" w:hAnsi="Arial" w:cs="Arial" w:eastAsia="Arial"/>
+        </w:rPr>
         <w:t>https://doi.org/10.6028/NIST.SP.800-160</w:t>
       </w:r>
       <w:r>
-        <w:rPr/>
+        <w:rPr>
+          <w:rFonts w:ascii="Arial" w:hAnsi="Arial" w:cs="Arial" w:eastAsia="Arial"/>
+        </w:rPr>
         <w:t xml:space="preserve"> (Accessed: 3 October 2026).</w:t>
       </w:r>
     </w:p>
     <w:p>
+      <w:pPr>
+        <w:spacing w:line="480" w:lineRule="auto"/>
+      </w:pPr>
       <w:r>
-        <w:rPr/>
+        <w:rPr>
+          <w:rFonts w:ascii="Arial" w:hAnsi="Arial" w:cs="Arial" w:eastAsia="Arial"/>
+        </w:rPr>
         <w:t xml:space="preserve">Stevens, I. (2026) </w:t>
       </w:r>
       <w:r>
         <w:rPr>
+          <w:rFonts w:ascii="Arial" w:hAnsi="Arial" w:cs="Arial" w:eastAsia="Arial"/>
           <w:i/>
         </w:rPr>
         <w:t>Quantitative risk assessment and digital resilience strategy for Pampered Pets: executive summary</w:t>
       </w:r>
       <w:r>
-        <w:rPr/>
+        <w:rPr>
+          <w:rFonts w:ascii="Arial" w:hAnsi="Arial" w:cs="Arial" w:eastAsia="Arial"/>
+        </w:rPr>
         <w:t>. Unpublished assignment, Security and Risk Management module. University of Essex Online.</w:t>
       </w:r>
     </w:p>
     <w:sectPr>
       <w:headerReference w:type="default" r:id="rId13"/>
-      <w:pgSz w:w="12240" w:h="15840"/>
-      <w:pgMar w:top="1440" w:right="1800" w:bottom="1440" w:left="1800" w:header="720" w:footer="720" w:gutter="0"/>
+      <w:footerReference w:type="default" r:id="rId14"/>
+      <w:pgSz w:w="11906" w:h="16838"/>
+      <w:pgMar w:top="1440" w:right="1440" w:bottom="1440" w:left="1440" w:header="708" w:footer="708" w:gutter="0"/>
       <w:cols w:space="720"/>
       <w:docGrid w:linePitch="360"/>
     </w:sectPr>
@@ -251,18 +358,67 @@
 </w:document>
 </file>
 
+<file path=word/footer1.xml><?xml version="1.0" encoding="utf-8"?>
+<w:ftr xmlns:m="http://schemas.openxmlformats.org/officeDocument/2006/math" xmlns:mc="http://schemas.openxmlformats.org/markup-compatibility/2006" xmlns:mo="http://schemas.microsoft.com/office/mac/office/2008/main" xmlns:mv="urn:schemas-microsoft-com:mac:vml" xmlns:o="urn:schemas-microsoft-com:office:office" xmlns:r="http://schemas.openxmlformats.org/officeDocument/2006/relationships" xmlns:v="urn:schemas-microsoft-com:vml" xmlns:w10="urn:schemas-microsoft-com:office:word" xmlns:w14="http://schemas.microsoft.com/office/word/2010/wordml" xmlns:w="http://schemas.openxmlformats.org/wordprocessingml/2006/main" xmlns:wne="http://schemas.microsoft.com/office/word/2006/wordml" xmlns:wp14="http://schemas.microsoft.com/office/word/2010/wordprocessingDrawing" xmlns:wp="http://schemas.openxmlformats.org/drawingml/2006/wordprocessingDrawing" xmlns:wpc="http://schemas.microsoft.com/office/word/2010/wordprocessingCanvas" xmlns:wpg="http://schemas.microsoft.com/office/word/2010/wordprocessingGroup" xmlns:wpi="http://schemas.microsoft.com/office/word/2010/wordprocessingInk" xmlns:wps="http://schemas.microsoft.com/office/word/2010/wordprocessingShape" mc:Ignorable="w14 wp14">
+  <w:p>
+    <w:pPr>
+      <w:pStyle w:val="Footer"/>
+      <w:spacing w:line="240" w:lineRule="auto"/>
+      <w:jc w:val="center"/>
+    </w:pPr>
+    <w:r>
+      <w:rPr>
+        <w:rFonts w:ascii="Arial" w:hAnsi="Arial" w:cs="Arial" w:eastAsia="Arial"/>
+        <w:sz w:val="24"/>
+        <w:szCs w:val="24"/>
+      </w:rPr>
+      <w:fldChar w:fldCharType="begin"/>
+    </w:r>
+    <w:r>
+      <w:rPr>
+        <w:rFonts w:ascii="Arial" w:hAnsi="Arial" w:cs="Arial" w:eastAsia="Arial"/>
+        <w:sz w:val="24"/>
+        <w:szCs w:val="24"/>
+      </w:rPr>
+      <w:instrText xml:space="preserve"> PAGE </w:instrText>
+    </w:r>
+    <w:r>
+      <w:rPr>
+        <w:rFonts w:ascii="Arial" w:hAnsi="Arial" w:cs="Arial" w:eastAsia="Arial"/>
+        <w:sz w:val="24"/>
+        <w:szCs w:val="24"/>
+      </w:rPr>
+      <w:fldChar w:fldCharType="separate"/>
+    </w:r>
+    <w:r>
+      <w:rPr>
+        <w:rFonts w:ascii="Arial" w:hAnsi="Arial" w:cs="Arial" w:eastAsia="Arial"/>
+        <w:sz w:val="24"/>
+        <w:szCs w:val="24"/>
+      </w:rPr>
+      <w:t>1</w:t>
+    </w:r>
+    <w:r>
+      <w:rPr>
+        <w:rFonts w:ascii="Arial" w:hAnsi="Arial" w:cs="Arial" w:eastAsia="Arial"/>
+        <w:sz w:val="24"/>
+        <w:szCs w:val="24"/>
+      </w:rPr>
+      <w:fldChar w:fldCharType="end"/>
+    </w:r>
+  </w:p>
+</w:ftr>
+</file>
+
 <file path=word/header1.xml><?xml version="1.0" encoding="utf-8"?>
 <w:hdr xmlns:m="http://schemas.openxmlformats.org/officeDocument/2006/math" xmlns:mc="http://schemas.openxmlformats.org/markup-compatibility/2006" xmlns:mo="http://schemas.microsoft.com/office/mac/office/2008/main" xmlns:mv="urn:schemas-microsoft-com:mac:vml" xmlns:o="urn:schemas-microsoft-com:office:office" xmlns:r="http://schemas.openxmlformats.org/officeDocument/2006/relationships" xmlns:v="urn:schemas-microsoft-com:vml" xmlns:w10="urn:schemas-microsoft-com:office:word" xmlns:w14="http://schemas.microsoft.com/office/word/2010/wordml" xmlns:w="http://schemas.openxmlformats.org/wordprocessingml/2006/main" xmlns:wne="http://schemas.microsoft.com/office/word/2006/wordml" xmlns:wp14="http://schemas.microsoft.com/office/word/2010/wordprocessingDrawing" xmlns:wp="http://schemas.openxmlformats.org/drawingml/2006/wordprocessingDrawing" xmlns:wpc="http://schemas.microsoft.com/office/word/2010/wordprocessingCanvas" xmlns:wpg="http://schemas.microsoft.com/office/word/2010/wordprocessingGroup" xmlns:wpi="http://schemas.microsoft.com/office/word/2010/wordprocessingInk" xmlns:wps="http://schemas.microsoft.com/office/word/2010/wordprocessingShape" mc:Ignorable="w14 wp14">
   <w:p>
     <w:pPr>
       <w:pStyle w:val="Header"/>
-    </w:pPr>
-    <w:r/>
+      <w:spacing w:line="240" w:lineRule="auto" w:before="0" w:after="0"/>
+    </w:pPr>
     <w:r>
-      <w:rPr>
-        <w:sz w:val="18"/>
-      </w:rPr>
-      <w:t>e-Portfolio: https://ianstagib.github.io/portfolio/SubPages/Security_Risk/srm_eportfolio_summary.html</w:t>
+      <w:t>https://ianstagib.github.io/portfolio/SubPages/Security_Risk/srm_eportfolio_summary.html</w:t>
     </w:r>
   </w:p>
 </w:hdr>
@@ -476,15 +632,15 @@
   <w:docDefaults>
     <w:rPrDefault>
       <w:rPr>
-        <w:rFonts w:asciiTheme="minorHAnsi" w:eastAsiaTheme="minorEastAsia" w:hAnsiTheme="minorHAnsi" w:cstheme="minorBidi"/>
-        <w:sz w:val="22"/>
-        <w:szCs w:val="22"/>
+        <w:rFonts w:ascii="Arial" w:hAnsi="Arial" w:cs="Arial" w:eastAsia="Arial"/>
+        <w:sz w:val="24"/>
+        <w:szCs w:val="24"/>
         <w:lang w:val="en-US" w:eastAsia="en-US" w:bidi="ar-SA"/>
       </w:rPr>
     </w:rPrDefault>
     <w:pPrDefault>
       <w:pPr>
-        <w:spacing w:after="200" w:line="276" w:lineRule="auto"/>
+        <w:spacing w:after="200" w:line="480" w:lineRule="auto"/>
       </w:pPr>
     </w:pPrDefault>
   </w:docDefaults>
@@ -632,8 +788,8 @@
     <w:qFormat/>
     <w:rsid w:val="00FC693F"/>
     <w:rPr>
-      <w:rFonts w:ascii="Calibri" w:hAnsi="Calibri"/>
-      <w:sz w:val="22"/>
+      <w:rFonts w:ascii="Arial" w:hAnsi="Arial" w:cs="Arial" w:eastAsia="Arial"/>
+      <w:sz w:val="24"/>
     </w:rPr>
   </w:style>
   <w:style w:type="paragraph" w:styleId="Header">
@@ -648,7 +804,7 @@
         <w:tab w:val="center" w:pos="4680"/>
         <w:tab w:val="right" w:pos="9360"/>
       </w:tabs>
-      <w:spacing w:after="0" w:line="240" w:lineRule="auto"/>
+      <w:spacing w:after="0" w:line="480" w:lineRule="auto"/>
     </w:pPr>
   </w:style>
   <w:style w:type="character" w:customStyle="1" w:styleId="HeaderChar">
@@ -670,7 +826,7 @@
         <w:tab w:val="center" w:pos="4680"/>
         <w:tab w:val="right" w:pos="9360"/>
       </w:tabs>
-      <w:spacing w:after="0" w:line="240" w:lineRule="auto"/>
+      <w:spacing w:after="0" w:line="480" w:lineRule="auto"/>
     </w:pPr>
   </w:style>
   <w:style w:type="character" w:customStyle="1" w:styleId="FooterChar">
@@ -695,12 +851,12 @@
       <w:outlineLvl w:val="0"/>
     </w:pPr>
     <w:rPr>
-      <w:rFonts w:asciiTheme="majorHAnsi" w:eastAsiaTheme="majorEastAsia" w:hAnsiTheme="majorHAnsi" w:cstheme="majorBidi"/>
+      <w:rFonts w:ascii="Arial" w:hAnsi="Arial" w:cs="Arial" w:eastAsia="Arial"/>
       <w:b/>
       <w:bCs/>
       <w:color w:val="365F91" w:themeColor="accent1" w:themeShade="BF"/>
-      <w:sz w:val="28"/>
-      <w:szCs w:val="28"/>
+      <w:sz w:val="24"/>
+      <w:szCs w:val="24"/>
     </w:rPr>
   </w:style>
   <w:style w:type="paragraph" w:styleId="Heading2">
@@ -719,12 +875,13 @@
       <w:outlineLvl w:val="1"/>
     </w:pPr>
     <w:rPr>
-      <w:rFonts w:asciiTheme="majorHAnsi" w:eastAsiaTheme="majorEastAsia" w:hAnsiTheme="majorHAnsi" w:cstheme="majorBidi"/>
+      <w:rFonts w:ascii="Arial" w:hAnsi="Arial" w:cs="Arial" w:eastAsia="Arial"/>
       <w:b/>
       <w:bCs/>
+      <w:i/>
       <w:color w:val="4F81BD" w:themeColor="accent1"/>
-      <w:sz w:val="26"/>
-      <w:szCs w:val="26"/>
+      <w:sz w:val="24"/>
+      <w:szCs w:val="24"/>
     </w:rPr>
   </w:style>
   <w:style w:type="paragraph" w:styleId="Heading3">
@@ -743,10 +900,13 @@
       <w:outlineLvl w:val="2"/>
     </w:pPr>
     <w:rPr>
-      <w:rFonts w:asciiTheme="majorHAnsi" w:eastAsiaTheme="majorEastAsia" w:hAnsiTheme="majorHAnsi" w:cstheme="majorBidi"/>
+      <w:rFonts w:ascii="Arial" w:hAnsi="Arial" w:cs="Arial" w:eastAsia="Arial"/>
       <w:b/>
       <w:bCs/>
+      <w:i/>
       <w:color w:val="4F81BD" w:themeColor="accent1"/>
+      <w:sz w:val="24"/>
+      <w:szCs w:val="24"/>
     </w:rPr>
   </w:style>
   <w:style w:type="paragraph" w:styleId="Heading4">
@@ -766,7 +926,7 @@
       <w:outlineLvl w:val="3"/>
     </w:pPr>
     <w:rPr>
-      <w:rFonts w:asciiTheme="majorHAnsi" w:eastAsiaTheme="majorEastAsia" w:hAnsiTheme="majorHAnsi" w:cstheme="majorBidi"/>
+      <w:rFonts w:ascii="Arial" w:hAnsi="Arial" w:cs="Arial" w:eastAsia="Arial"/>
       <w:b/>
       <w:bCs/>
       <w:i/>
@@ -791,7 +951,7 @@
       <w:outlineLvl w:val="4"/>
     </w:pPr>
     <w:rPr>
-      <w:rFonts w:asciiTheme="majorHAnsi" w:eastAsiaTheme="majorEastAsia" w:hAnsiTheme="majorHAnsi" w:cstheme="majorBidi"/>
+      <w:rFonts w:ascii="Arial" w:hAnsi="Arial" w:cs="Arial" w:eastAsia="Arial"/>
       <w:color w:val="243F60" w:themeColor="accent1" w:themeShade="7F"/>
     </w:rPr>
   </w:style>
@@ -812,7 +972,7 @@
       <w:outlineLvl w:val="5"/>
     </w:pPr>
     <w:rPr>
-      <w:rFonts w:asciiTheme="majorHAnsi" w:eastAsiaTheme="majorEastAsia" w:hAnsiTheme="majorHAnsi" w:cstheme="majorBidi"/>
+      <w:rFonts w:ascii="Arial" w:hAnsi="Arial" w:cs="Arial" w:eastAsia="Arial"/>
       <w:i/>
       <w:iCs/>
       <w:color w:val="243F60" w:themeColor="accent1" w:themeShade="7F"/>
@@ -835,7 +995,7 @@
       <w:outlineLvl w:val="6"/>
     </w:pPr>
     <w:rPr>
-      <w:rFonts w:asciiTheme="majorHAnsi" w:eastAsiaTheme="majorEastAsia" w:hAnsiTheme="majorHAnsi" w:cstheme="majorBidi"/>
+      <w:rFonts w:ascii="Arial" w:hAnsi="Arial" w:cs="Arial" w:eastAsia="Arial"/>
       <w:i/>
       <w:iCs/>
       <w:color w:val="404040" w:themeColor="text1" w:themeTint="BF"/>
@@ -858,10 +1018,10 @@
       <w:outlineLvl w:val="7"/>
     </w:pPr>
     <w:rPr>
-      <w:rFonts w:asciiTheme="majorHAnsi" w:eastAsiaTheme="majorEastAsia" w:hAnsiTheme="majorHAnsi" w:cstheme="majorBidi"/>
+      <w:rFonts w:ascii="Arial" w:hAnsi="Arial" w:cs="Arial" w:eastAsia="Arial"/>
       <w:color w:val="4F81BD" w:themeColor="accent1"/>
-      <w:sz w:val="20"/>
-      <w:szCs w:val="20"/>
+      <w:sz w:val="24"/>
+      <w:szCs w:val="24"/>
     </w:rPr>
   </w:style>
   <w:style w:type="paragraph" w:styleId="Heading9">
@@ -881,12 +1041,12 @@
       <w:outlineLvl w:val="8"/>
     </w:pPr>
     <w:rPr>
-      <w:rFonts w:asciiTheme="majorHAnsi" w:eastAsiaTheme="majorEastAsia" w:hAnsiTheme="majorHAnsi" w:cstheme="majorBidi"/>
+      <w:rFonts w:ascii="Arial" w:hAnsi="Arial" w:cs="Arial" w:eastAsia="Arial"/>
       <w:i/>
       <w:iCs/>
       <w:color w:val="404040" w:themeColor="text1" w:themeTint="BF"/>
-      <w:sz w:val="20"/>
-      <w:szCs w:val="20"/>
+      <w:sz w:val="24"/>
+      <w:szCs w:val="24"/>
     </w:rPr>
   </w:style>
   <w:style w:type="character" w:default="1" w:styleId="DefaultParagraphFont">
@@ -922,7 +1082,7 @@
     <w:qFormat/>
     <w:rsid w:val="00FC693F"/>
     <w:pPr>
-      <w:spacing w:after="0" w:line="240" w:lineRule="auto"/>
+      <w:spacing w:after="0" w:line="480" w:lineRule="auto"/>
     </w:pPr>
   </w:style>
   <w:style w:type="character" w:customStyle="1" w:styleId="Heading1Char">
@@ -932,12 +1092,12 @@
     <w:uiPriority w:val="9"/>
     <w:rsid w:val="00FC693F"/>
     <w:rPr>
-      <w:rFonts w:asciiTheme="majorHAnsi" w:eastAsiaTheme="majorEastAsia" w:hAnsiTheme="majorHAnsi" w:cstheme="majorBidi"/>
+      <w:rFonts w:ascii="Arial" w:hAnsi="Arial" w:cs="Arial" w:eastAsia="Arial"/>
       <w:b/>
       <w:bCs/>
       <w:color w:val="365F91" w:themeColor="accent1" w:themeShade="BF"/>
-      <w:sz w:val="28"/>
-      <w:szCs w:val="28"/>
+      <w:sz w:val="24"/>
+      <w:szCs w:val="24"/>
     </w:rPr>
   </w:style>
   <w:style w:type="character" w:customStyle="1" w:styleId="Heading2Char">
@@ -947,12 +1107,12 @@
     <w:uiPriority w:val="9"/>
     <w:rsid w:val="00FC693F"/>
     <w:rPr>
-      <w:rFonts w:asciiTheme="majorHAnsi" w:eastAsiaTheme="majorEastAsia" w:hAnsiTheme="majorHAnsi" w:cstheme="majorBidi"/>
+      <w:rFonts w:ascii="Arial" w:hAnsi="Arial" w:cs="Arial" w:eastAsia="Arial"/>
       <w:b/>
       <w:bCs/>
       <w:color w:val="4F81BD" w:themeColor="accent1"/>
-      <w:sz w:val="26"/>
-      <w:szCs w:val="26"/>
+      <w:sz w:val="24"/>
+      <w:szCs w:val="24"/>
     </w:rPr>
   </w:style>
   <w:style w:type="character" w:customStyle="1" w:styleId="Heading3Char">
@@ -962,7 +1122,7 @@
     <w:uiPriority w:val="9"/>
     <w:rsid w:val="00FC693F"/>
     <w:rPr>
-      <w:rFonts w:asciiTheme="majorHAnsi" w:eastAsiaTheme="majorEastAsia" w:hAnsiTheme="majorHAnsi" w:cstheme="majorBidi"/>
+      <w:rFonts w:ascii="Arial" w:hAnsi="Arial" w:cs="Arial" w:eastAsia="Arial"/>
       <w:b/>
       <w:bCs/>
       <w:color w:val="4F81BD" w:themeColor="accent1"/>
@@ -980,16 +1140,17 @@
       <w:pBdr>
         <w:bottom w:val="single" w:sz="8" w:space="4" w:color="4F81BD" w:themeColor="accent1"/>
       </w:pBdr>
-      <w:spacing w:after="300" w:line="240" w:lineRule="auto"/>
+      <w:spacing w:after="300" w:line="480" w:lineRule="auto"/>
       <w:contextualSpacing/>
     </w:pPr>
     <w:rPr>
-      <w:rFonts w:asciiTheme="majorHAnsi" w:eastAsiaTheme="majorEastAsia" w:hAnsiTheme="majorHAnsi" w:cstheme="majorBidi"/>
+      <w:rFonts w:ascii="Arial" w:hAnsi="Arial" w:cs="Arial" w:eastAsia="Arial"/>
+      <w:b/>
       <w:color w:val="17365D" w:themeColor="text2" w:themeShade="BF"/>
       <w:spacing w:val="5"/>
       <w:kern w:val="28"/>
-      <w:sz w:val="52"/>
-      <w:szCs w:val="52"/>
+      <w:sz w:val="24"/>
+      <w:szCs w:val="24"/>
     </w:rPr>
   </w:style>
   <w:style w:type="character" w:customStyle="1" w:styleId="TitleChar">
@@ -999,12 +1160,12 @@
     <w:uiPriority w:val="10"/>
     <w:rsid w:val="00FC693F"/>
     <w:rPr>
-      <w:rFonts w:asciiTheme="majorHAnsi" w:eastAsiaTheme="majorEastAsia" w:hAnsiTheme="majorHAnsi" w:cstheme="majorBidi"/>
+      <w:rFonts w:ascii="Arial" w:hAnsi="Arial" w:cs="Arial" w:eastAsia="Arial"/>
       <w:color w:val="17365D" w:themeColor="text2" w:themeShade="BF"/>
       <w:spacing w:val="5"/>
       <w:kern w:val="28"/>
-      <w:sz w:val="52"/>
-      <w:szCs w:val="52"/>
+      <w:sz w:val="24"/>
+      <w:szCs w:val="24"/>
     </w:rPr>
   </w:style>
   <w:style w:type="paragraph" w:styleId="Subtitle">
@@ -1021,7 +1182,7 @@
       </w:numPr>
     </w:pPr>
     <w:rPr>
-      <w:rFonts w:asciiTheme="majorHAnsi" w:eastAsiaTheme="majorEastAsia" w:hAnsiTheme="majorHAnsi" w:cstheme="majorBidi"/>
+      <w:rFonts w:ascii="Arial" w:hAnsi="Arial" w:cs="Arial" w:eastAsia="Arial"/>
       <w:i/>
       <w:iCs/>
       <w:color w:val="4F81BD" w:themeColor="accent1"/>
@@ -1037,7 +1198,7 @@
     <w:uiPriority w:val="11"/>
     <w:rsid w:val="00FC693F"/>
     <w:rPr>
-      <w:rFonts w:asciiTheme="majorHAnsi" w:eastAsiaTheme="majorEastAsia" w:hAnsiTheme="majorHAnsi" w:cstheme="majorBidi"/>
+      <w:rFonts w:ascii="Arial" w:hAnsi="Arial" w:cs="Arial" w:eastAsia="Arial"/>
       <w:i/>
       <w:iCs/>
       <w:color w:val="4F81BD" w:themeColor="accent1"/>
@@ -1104,8 +1265,9 @@
       <w:spacing w:after="120"/>
     </w:pPr>
     <w:rPr>
-      <w:sz w:val="16"/>
-      <w:szCs w:val="16"/>
+      <w:rFonts w:ascii="Arial" w:hAnsi="Arial" w:cs="Arial" w:eastAsia="Arial"/>
+      <w:sz w:val="24"/>
+      <w:szCs w:val="24"/>
     </w:rPr>
   </w:style>
   <w:style w:type="character" w:customStyle="1" w:styleId="BodyText3Char">
@@ -1115,8 +1277,9 @@
     <w:uiPriority w:val="99"/>
     <w:rsid w:val="00AA1D8D"/>
     <w:rPr>
-      <w:sz w:val="16"/>
-      <w:szCs w:val="16"/>
+      <w:rFonts w:ascii="Arial" w:hAnsi="Arial" w:cs="Arial" w:eastAsia="Arial"/>
+      <w:sz w:val="24"/>
+      <w:szCs w:val="24"/>
     </w:rPr>
   </w:style>
   <w:style w:type="paragraph" w:styleId="List">
@@ -1284,9 +1447,9 @@
       </w:tabs>
     </w:pPr>
     <w:rPr>
-      <w:rFonts w:ascii="Courier" w:hAnsi="Courier"/>
-      <w:sz w:val="20"/>
-      <w:szCs w:val="20"/>
+      <w:rFonts w:ascii="Arial" w:hAnsi="Arial" w:cs="Arial" w:eastAsia="Arial"/>
+      <w:sz w:val="24"/>
+      <w:szCs w:val="24"/>
     </w:rPr>
   </w:style>
   <w:style w:type="character" w:customStyle="1" w:styleId="MacroTextChar">
@@ -1296,9 +1459,9 @@
     <w:uiPriority w:val="99"/>
     <w:rsid w:val="0029639D"/>
     <w:rPr>
-      <w:rFonts w:ascii="Courier" w:hAnsi="Courier"/>
-      <w:sz w:val="20"/>
-      <w:szCs w:val="20"/>
+      <w:rFonts w:ascii="Arial" w:hAnsi="Arial" w:cs="Arial" w:eastAsia="Arial"/>
+      <w:sz w:val="24"/>
+      <w:szCs w:val="24"/>
     </w:rPr>
   </w:style>
   <w:style w:type="paragraph" w:styleId="Quote">
@@ -1310,6 +1473,7 @@
     <w:qFormat/>
     <w:rsid w:val="00FC693F"/>
     <w:rPr>
+      <w:rFonts w:ascii="Arial" w:hAnsi="Arial" w:cs="Arial" w:eastAsia="Arial"/>
       <w:i/>
       <w:iCs/>
       <w:color w:val="000000" w:themeColor="text1"/>
@@ -1322,6 +1486,7 @@
     <w:uiPriority w:val="29"/>
     <w:rsid w:val="00FC693F"/>
     <w:rPr>
+      <w:rFonts w:ascii="Arial" w:hAnsi="Arial" w:cs="Arial" w:eastAsia="Arial"/>
       <w:i/>
       <w:iCs/>
       <w:color w:val="000000" w:themeColor="text1"/>
@@ -1335,7 +1500,7 @@
     <w:semiHidden/>
     <w:rsid w:val="00FC693F"/>
     <w:rPr>
-      <w:rFonts w:asciiTheme="majorHAnsi" w:eastAsiaTheme="majorEastAsia" w:hAnsiTheme="majorHAnsi" w:cstheme="majorBidi"/>
+      <w:rFonts w:ascii="Arial" w:hAnsi="Arial" w:cs="Arial" w:eastAsia="Arial"/>
       <w:b/>
       <w:bCs/>
       <w:i/>
@@ -1351,7 +1516,7 @@
     <w:semiHidden/>
     <w:rsid w:val="00FC693F"/>
     <w:rPr>
-      <w:rFonts w:asciiTheme="majorHAnsi" w:eastAsiaTheme="majorEastAsia" w:hAnsiTheme="majorHAnsi" w:cstheme="majorBidi"/>
+      <w:rFonts w:ascii="Arial" w:hAnsi="Arial" w:cs="Arial" w:eastAsia="Arial"/>
       <w:color w:val="243F60" w:themeColor="accent1" w:themeShade="7F"/>
     </w:rPr>
   </w:style>
@@ -1363,7 +1528,7 @@
     <w:semiHidden/>
     <w:rsid w:val="00FC693F"/>
     <w:rPr>
-      <w:rFonts w:asciiTheme="majorHAnsi" w:eastAsiaTheme="majorEastAsia" w:hAnsiTheme="majorHAnsi" w:cstheme="majorBidi"/>
+      <w:rFonts w:ascii="Arial" w:hAnsi="Arial" w:cs="Arial" w:eastAsia="Arial"/>
       <w:i/>
       <w:iCs/>
       <w:color w:val="243F60" w:themeColor="accent1" w:themeShade="7F"/>
@@ -1377,7 +1542,7 @@
     <w:semiHidden/>
     <w:rsid w:val="00FC693F"/>
     <w:rPr>
-      <w:rFonts w:asciiTheme="majorHAnsi" w:eastAsiaTheme="majorEastAsia" w:hAnsiTheme="majorHAnsi" w:cstheme="majorBidi"/>
+      <w:rFonts w:ascii="Arial" w:hAnsi="Arial" w:cs="Arial" w:eastAsia="Arial"/>
       <w:i/>
       <w:iCs/>
       <w:color w:val="404040" w:themeColor="text1" w:themeTint="BF"/>
@@ -1391,10 +1556,10 @@
     <w:semiHidden/>
     <w:rsid w:val="00FC693F"/>
     <w:rPr>
-      <w:rFonts w:asciiTheme="majorHAnsi" w:eastAsiaTheme="majorEastAsia" w:hAnsiTheme="majorHAnsi" w:cstheme="majorBidi"/>
+      <w:rFonts w:ascii="Arial" w:hAnsi="Arial" w:cs="Arial" w:eastAsia="Arial"/>
       <w:color w:val="4F81BD" w:themeColor="accent1"/>
-      <w:sz w:val="20"/>
-      <w:szCs w:val="20"/>
+      <w:sz w:val="24"/>
+      <w:szCs w:val="24"/>
     </w:rPr>
   </w:style>
   <w:style w:type="character" w:customStyle="1" w:styleId="Heading9Char">
@@ -1405,12 +1570,12 @@
     <w:semiHidden/>
     <w:rsid w:val="00FC693F"/>
     <w:rPr>
-      <w:rFonts w:asciiTheme="majorHAnsi" w:eastAsiaTheme="majorEastAsia" w:hAnsiTheme="majorHAnsi" w:cstheme="majorBidi"/>
+      <w:rFonts w:ascii="Arial" w:hAnsi="Arial" w:cs="Arial" w:eastAsia="Arial"/>
       <w:i/>
       <w:iCs/>
       <w:color w:val="404040" w:themeColor="text1" w:themeTint="BF"/>
-      <w:sz w:val="20"/>
-      <w:szCs w:val="20"/>
+      <w:sz w:val="24"/>
+      <w:szCs w:val="24"/>
     </w:rPr>
   </w:style>
   <w:style w:type="paragraph" w:styleId="Caption">
@@ -1423,14 +1588,15 @@
     <w:qFormat/>
     <w:rsid w:val="00FC693F"/>
     <w:pPr>
-      <w:spacing w:line="240" w:lineRule="auto"/>
+      <w:spacing w:line="480" w:lineRule="auto"/>
     </w:pPr>
     <w:rPr>
+      <w:rFonts w:ascii="Arial" w:hAnsi="Arial" w:cs="Arial" w:eastAsia="Arial"/>
       <w:b/>
       <w:bCs/>
       <w:color w:val="4F81BD" w:themeColor="accent1"/>
-      <w:sz w:val="18"/>
-      <w:szCs w:val="18"/>
+      <w:sz w:val="24"/>
+      <w:szCs w:val="24"/>
     </w:rPr>
   </w:style>
   <w:style w:type="character" w:styleId="Strong">
@@ -1440,6 +1606,7 @@
     <w:qFormat/>
     <w:rsid w:val="00FC693F"/>
     <w:rPr>
+      <w:rFonts w:ascii="Arial" w:hAnsi="Arial" w:cs="Arial" w:eastAsia="Arial"/>
       <w:b/>
       <w:bCs/>
     </w:rPr>
@@ -1451,6 +1618,7 @@
     <w:qFormat/>
     <w:rsid w:val="00FC693F"/>
     <w:rPr>
+      <w:rFonts w:ascii="Arial" w:hAnsi="Arial" w:cs="Arial" w:eastAsia="Arial"/>
       <w:i/>
       <w:iCs/>
     </w:rPr>
@@ -1471,6 +1639,7 @@
       <w:ind w:left="936" w:right="936"/>
     </w:pPr>
     <w:rPr>
+      <w:rFonts w:ascii="Arial" w:hAnsi="Arial" w:cs="Arial" w:eastAsia="Arial"/>
       <w:b/>
       <w:bCs/>
       <w:i/>
@@ -1485,6 +1654,7 @@
     <w:uiPriority w:val="30"/>
     <w:rsid w:val="00FC693F"/>
     <w:rPr>
+      <w:rFonts w:ascii="Arial" w:hAnsi="Arial" w:cs="Arial" w:eastAsia="Arial"/>
       <w:b/>
       <w:bCs/>
       <w:i/>
@@ -1499,6 +1669,7 @@
     <w:qFormat/>
     <w:rsid w:val="00FC693F"/>
     <w:rPr>
+      <w:rFonts w:ascii="Arial" w:hAnsi="Arial" w:cs="Arial" w:eastAsia="Arial"/>
       <w:i/>
       <w:iCs/>
       <w:color w:val="808080" w:themeColor="text1" w:themeTint="7F"/>
@@ -1511,6 +1682,7 @@
     <w:qFormat/>
     <w:rsid w:val="00FC693F"/>
     <w:rPr>
+      <w:rFonts w:ascii="Arial" w:hAnsi="Arial" w:cs="Arial" w:eastAsia="Arial"/>
       <w:b/>
       <w:bCs/>
       <w:i/>
@@ -1525,6 +1697,7 @@
     <w:qFormat/>
     <w:rsid w:val="00FC693F"/>
     <w:rPr>
+      <w:rFonts w:ascii="Arial" w:hAnsi="Arial" w:cs="Arial" w:eastAsia="Arial"/>
       <w:smallCaps/>
       <w:color w:val="C0504D" w:themeColor="accent2"/>
       <w:u w:val="single"/>
@@ -1537,6 +1710,7 @@
     <w:qFormat/>
     <w:rsid w:val="00FC693F"/>
     <w:rPr>
+      <w:rFonts w:ascii="Arial" w:hAnsi="Arial" w:cs="Arial" w:eastAsia="Arial"/>
       <w:b/>
       <w:bCs/>
       <w:smallCaps/>
@@ -1552,6 +1726,7 @@
     <w:qFormat/>
     <w:rsid w:val="00FC693F"/>
     <w:rPr>
+      <w:rFonts w:ascii="Arial" w:hAnsi="Arial" w:cs="Arial" w:eastAsia="Arial"/>
       <w:b/>
       <w:bCs/>
       <w:smallCaps/>
@@ -1577,7 +1752,7 @@
     <w:uiPriority w:val="59"/>
     <w:rsid w:val="00FC693F"/>
     <w:pPr>
-      <w:spacing w:after="0" w:line="240" w:lineRule="auto"/>
+      <w:spacing w:after="0" w:line="480" w:lineRule="auto"/>
     </w:pPr>
     <w:tblPr>
       <w:tblInd w:w="0" w:type="dxa"/>
@@ -1603,9 +1778,10 @@
     <w:uiPriority w:val="60"/>
     <w:rsid w:val="00FC693F"/>
     <w:pPr>
-      <w:spacing w:after="0" w:line="240" w:lineRule="auto"/>
+      <w:spacing w:after="0" w:line="480" w:lineRule="auto"/>
     </w:pPr>
     <w:rPr>
+      <w:rFonts w:ascii="Arial" w:hAnsi="Arial" w:cs="Arial" w:eastAsia="Arial"/>
       <w:color w:val="000000" w:themeColor="text1" w:themeShade="BF"/>
     </w:rPr>
     <w:tblPr>
@@ -1628,6 +1804,7 @@
         <w:spacing w:before="0" w:after="0" w:line="240" w:lineRule="auto"/>
       </w:pPr>
       <w:rPr>
+        <w:rFonts w:ascii="Arial" w:hAnsi="Arial" w:cs="Arial" w:eastAsia="Arial"/>
         <w:b/>
         <w:bCs/>
       </w:rPr>
@@ -1648,6 +1825,7 @@
         <w:spacing w:before="0" w:after="0" w:line="240" w:lineRule="auto"/>
       </w:pPr>
       <w:rPr>
+        <w:rFonts w:ascii="Arial" w:hAnsi="Arial" w:cs="Arial" w:eastAsia="Arial"/>
         <w:b/>
         <w:bCs/>
       </w:rPr>
@@ -1665,12 +1843,14 @@
     </w:tblStylePr>
     <w:tblStylePr w:type="firstCol">
       <w:rPr>
+        <w:rFonts w:ascii="Arial" w:hAnsi="Arial" w:cs="Arial" w:eastAsia="Arial"/>
         <w:b/>
         <w:bCs/>
       </w:rPr>
     </w:tblStylePr>
     <w:tblStylePr w:type="lastCol">
       <w:rPr>
+        <w:rFonts w:ascii="Arial" w:hAnsi="Arial" w:cs="Arial" w:eastAsia="Arial"/>
         <w:b/>
         <w:bCs/>
       </w:rPr>
@@ -1706,9 +1886,10 @@
     <w:uiPriority w:val="60"/>
     <w:rsid w:val="00FC693F"/>
     <w:pPr>
-      <w:spacing w:after="0" w:line="240" w:lineRule="auto"/>
+      <w:spacing w:after="0" w:line="480" w:lineRule="auto"/>
     </w:pPr>
     <w:rPr>
+      <w:rFonts w:ascii="Arial" w:hAnsi="Arial" w:cs="Arial" w:eastAsia="Arial"/>
       <w:color w:val="365F91" w:themeColor="accent1" w:themeShade="BF"/>
     </w:rPr>
     <w:tblPr>
@@ -1731,6 +1912,7 @@
         <w:spacing w:before="0" w:after="0" w:line="240" w:lineRule="auto"/>
       </w:pPr>
       <w:rPr>
+        <w:rFonts w:ascii="Arial" w:hAnsi="Arial" w:cs="Arial" w:eastAsia="Arial"/>
         <w:b/>
         <w:bCs/>
       </w:rPr>
@@ -1751,6 +1933,7 @@
         <w:spacing w:before="0" w:after="0" w:line="240" w:lineRule="auto"/>
       </w:pPr>
       <w:rPr>
+        <w:rFonts w:ascii="Arial" w:hAnsi="Arial" w:cs="Arial" w:eastAsia="Arial"/>
         <w:b/>
         <w:bCs/>
       </w:rPr>
@@ -1768,12 +1951,14 @@
     </w:tblStylePr>
     <w:tblStylePr w:type="firstCol">
       <w:rPr>
+        <w:rFonts w:ascii="Arial" w:hAnsi="Arial" w:cs="Arial" w:eastAsia="Arial"/>
         <w:b/>
         <w:bCs/>
       </w:rPr>
     </w:tblStylePr>
     <w:tblStylePr w:type="lastCol">
       <w:rPr>
+        <w:rFonts w:ascii="Arial" w:hAnsi="Arial" w:cs="Arial" w:eastAsia="Arial"/>
         <w:b/>
         <w:bCs/>
       </w:rPr>
@@ -1809,9 +1994,10 @@
     <w:uiPriority w:val="60"/>
     <w:rsid w:val="00FC693F"/>
     <w:pPr>
-      <w:spacing w:after="0" w:line="240" w:lineRule="auto"/>
+      <w:spacing w:after="0" w:line="480" w:lineRule="auto"/>
     </w:pPr>
     <w:rPr>
+      <w:rFonts w:ascii="Arial" w:hAnsi="Arial" w:cs="Arial" w:eastAsia="Arial"/>
       <w:color w:val="943634" w:themeColor="accent2" w:themeShade="BF"/>
     </w:rPr>
     <w:tblPr>
@@ -1834,6 +2020,7 @@
         <w:spacing w:before="0" w:after="0" w:line="240" w:lineRule="auto"/>
       </w:pPr>
       <w:rPr>
+        <w:rFonts w:ascii="Arial" w:hAnsi="Arial" w:cs="Arial" w:eastAsia="Arial"/>
         <w:b/>
         <w:bCs/>
       </w:rPr>
@@ -1854,6 +2041,7 @@
         <w:spacing w:before="0" w:after="0" w:line="240" w:lineRule="auto"/>
       </w:pPr>
       <w:rPr>
+        <w:rFonts w:ascii="Arial" w:hAnsi="Arial" w:cs="Arial" w:eastAsia="Arial"/>
         <w:b/>
         <w:bCs/>
       </w:rPr>
@@ -1871,12 +2059,14 @@
     </w:tblStylePr>
     <w:tblStylePr w:type="firstCol">
       <w:rPr>
+        <w:rFonts w:ascii="Arial" w:hAnsi="Arial" w:cs="Arial" w:eastAsia="Arial"/>
         <w:b/>
         <w:bCs/>
       </w:rPr>
     </w:tblStylePr>
     <w:tblStylePr w:type="lastCol">
       <w:rPr>
+        <w:rFonts w:ascii="Arial" w:hAnsi="Arial" w:cs="Arial" w:eastAsia="Arial"/>
         <w:b/>
         <w:bCs/>
       </w:rPr>
@@ -1912,9 +2102,10 @@
     <w:uiPriority w:val="60"/>
     <w:rsid w:val="00FC693F"/>
     <w:pPr>
-      <w:spacing w:after="0" w:line="240" w:lineRule="auto"/>
+      <w:spacing w:after="0" w:line="480" w:lineRule="auto"/>
     </w:pPr>
     <w:rPr>
+      <w:rFonts w:ascii="Arial" w:hAnsi="Arial" w:cs="Arial" w:eastAsia="Arial"/>
       <w:color w:val="76923C" w:themeColor="accent3" w:themeShade="BF"/>
     </w:rPr>
     <w:tblPr>
@@ -1937,6 +2128,7 @@
         <w:spacing w:before="0" w:after="0" w:line="240" w:lineRule="auto"/>
       </w:pPr>
       <w:rPr>
+        <w:rFonts w:ascii="Arial" w:hAnsi="Arial" w:cs="Arial" w:eastAsia="Arial"/>
         <w:b/>
         <w:bCs/>
       </w:rPr>
@@ -1957,6 +2149,7 @@
         <w:spacing w:before="0" w:after="0" w:line="240" w:lineRule="auto"/>
       </w:pPr>
       <w:rPr>
+        <w:rFonts w:ascii="Arial" w:hAnsi="Arial" w:cs="Arial" w:eastAsia="Arial"/>
         <w:b/>
         <w:bCs/>
       </w:rPr>
@@ -1974,12 +2167,14 @@
     </w:tblStylePr>
     <w:tblStylePr w:type="firstCol">
       <w:rPr>
+        <w:rFonts w:ascii="Arial" w:hAnsi="Arial" w:cs="Arial" w:eastAsia="Arial"/>
         <w:b/>
         <w:bCs/>
       </w:rPr>
     </w:tblStylePr>
     <w:tblStylePr w:type="lastCol">
       <w:rPr>
+        <w:rFonts w:ascii="Arial" w:hAnsi="Arial" w:cs="Arial" w:eastAsia="Arial"/>
         <w:b/>
         <w:bCs/>
       </w:rPr>
@@ -2015,9 +2210,10 @@
     <w:uiPriority w:val="60"/>
     <w:rsid w:val="00FC693F"/>
     <w:pPr>
-      <w:spacing w:after="0" w:line="240" w:lineRule="auto"/>
+      <w:spacing w:after="0" w:line="480" w:lineRule="auto"/>
     </w:pPr>
     <w:rPr>
+      <w:rFonts w:ascii="Arial" w:hAnsi="Arial" w:cs="Arial" w:eastAsia="Arial"/>
       <w:color w:val="5F497A" w:themeColor="accent4" w:themeShade="BF"/>
     </w:rPr>
     <w:tblPr>
@@ -2040,6 +2236,7 @@
         <w:spacing w:before="0" w:after="0" w:line="240" w:lineRule="auto"/>
       </w:pPr>
       <w:rPr>
+        <w:rFonts w:ascii="Arial" w:hAnsi="Arial" w:cs="Arial" w:eastAsia="Arial"/>
         <w:b/>
         <w:bCs/>
       </w:rPr>
@@ -2060,6 +2257,7 @@
         <w:spacing w:before="0" w:after="0" w:line="240" w:lineRule="auto"/>
       </w:pPr>
       <w:rPr>
+        <w:rFonts w:ascii="Arial" w:hAnsi="Arial" w:cs="Arial" w:eastAsia="Arial"/>
         <w:b/>
         <w:bCs/>
       </w:rPr>
@@ -2077,12 +2275,14 @@
     </w:tblStylePr>
     <w:tblStylePr w:type="firstCol">
       <w:rPr>
+        <w:rFonts w:ascii="Arial" w:hAnsi="Arial" w:cs="Arial" w:eastAsia="Arial"/>
         <w:b/>
         <w:bCs/>
       </w:rPr>
     </w:tblStylePr>
     <w:tblStylePr w:type="lastCol">
       <w:rPr>
+        <w:rFonts w:ascii="Arial" w:hAnsi="Arial" w:cs="Arial" w:eastAsia="Arial"/>
         <w:b/>
         <w:bCs/>
       </w:rPr>
@@ -2118,9 +2318,10 @@
     <w:uiPriority w:val="60"/>
     <w:rsid w:val="00FC693F"/>
     <w:pPr>
-      <w:spacing w:after="0" w:line="240" w:lineRule="auto"/>
+      <w:spacing w:after="0" w:line="480" w:lineRule="auto"/>
     </w:pPr>
     <w:rPr>
+      <w:rFonts w:ascii="Arial" w:hAnsi="Arial" w:cs="Arial" w:eastAsia="Arial"/>
       <w:color w:val="31849B" w:themeColor="accent5" w:themeShade="BF"/>
     </w:rPr>
     <w:tblPr>
@@ -2143,6 +2344,7 @@
         <w:spacing w:before="0" w:after="0" w:line="240" w:lineRule="auto"/>
       </w:pPr>
       <w:rPr>
+        <w:rFonts w:ascii="Arial" w:hAnsi="Arial" w:cs="Arial" w:eastAsia="Arial"/>
         <w:b/>
         <w:bCs/>
       </w:rPr>
@@ -2163,6 +2365,7 @@
         <w:spacing w:before="0" w:after="0" w:line="240" w:lineRule="auto"/>
       </w:pPr>
       <w:rPr>
+        <w:rFonts w:ascii="Arial" w:hAnsi="Arial" w:cs="Arial" w:eastAsia="Arial"/>
         <w:b/>
         <w:bCs/>
       </w:rPr>
@@ -2180,12 +2383,14 @@
     </w:tblStylePr>
     <w:tblStylePr w:type="firstCol">
       <w:rPr>
+        <w:rFonts w:ascii="Arial" w:hAnsi="Arial" w:cs="Arial" w:eastAsia="Arial"/>
         <w:b/>
         <w:bCs/>
       </w:rPr>
     </w:tblStylePr>
     <w:tblStylePr w:type="lastCol">
       <w:rPr>
+        <w:rFonts w:ascii="Arial" w:hAnsi="Arial" w:cs="Arial" w:eastAsia="Arial"/>
         <w:b/>
         <w:bCs/>
       </w:rPr>
@@ -2221,9 +2426,10 @@
     <w:uiPriority w:val="60"/>
     <w:rsid w:val="00FC693F"/>
     <w:pPr>
-      <w:spacing w:after="0" w:line="240" w:lineRule="auto"/>
+      <w:spacing w:after="0" w:line="480" w:lineRule="auto"/>
     </w:pPr>
     <w:rPr>
+      <w:rFonts w:ascii="Arial" w:hAnsi="Arial" w:cs="Arial" w:eastAsia="Arial"/>
       <w:color w:val="E36C0A" w:themeColor="accent6" w:themeShade="BF"/>
     </w:rPr>
     <w:tblPr>
@@ -2246,6 +2452,7 @@
         <w:spacing w:before="0" w:after="0" w:line="240" w:lineRule="auto"/>
       </w:pPr>
       <w:rPr>
+        <w:rFonts w:ascii="Arial" w:hAnsi="Arial" w:cs="Arial" w:eastAsia="Arial"/>
         <w:b/>
         <w:bCs/>
       </w:rPr>
@@ -2266,6 +2473,7 @@
         <w:spacing w:before="0" w:after="0" w:line="240" w:lineRule="auto"/>
       </w:pPr>
       <w:rPr>
+        <w:rFonts w:ascii="Arial" w:hAnsi="Arial" w:cs="Arial" w:eastAsia="Arial"/>
         <w:b/>
         <w:bCs/>
       </w:rPr>
@@ -2283,12 +2491,14 @@
     </w:tblStylePr>
     <w:tblStylePr w:type="firstCol">
       <w:rPr>
+        <w:rFonts w:ascii="Arial" w:hAnsi="Arial" w:cs="Arial" w:eastAsia="Arial"/>
         <w:b/>
         <w:bCs/>
       </w:rPr>
     </w:tblStylePr>
     <w:tblStylePr w:type="lastCol">
       <w:rPr>
+        <w:rFonts w:ascii="Arial" w:hAnsi="Arial" w:cs="Arial" w:eastAsia="Arial"/>
         <w:b/>
         <w:bCs/>
       </w:rPr>
@@ -2324,7 +2534,7 @@
     <w:uiPriority w:val="61"/>
     <w:rsid w:val="00FC693F"/>
     <w:pPr>
-      <w:spacing w:after="0" w:line="240" w:lineRule="auto"/>
+      <w:spacing w:after="0" w:line="480" w:lineRule="auto"/>
     </w:pPr>
     <w:tblPr>
       <w:tblStyleRowBandSize w:val="1"/>
@@ -2348,6 +2558,7 @@
         <w:spacing w:before="0" w:after="0" w:line="240" w:lineRule="auto"/>
       </w:pPr>
       <w:rPr>
+        <w:rFonts w:ascii="Arial" w:hAnsi="Arial" w:cs="Arial" w:eastAsia="Arial"/>
         <w:b/>
         <w:bCs/>
         <w:color w:val="FFFFFF" w:themeColor="background1"/>
@@ -2362,6 +2573,7 @@
         <w:spacing w:before="0" w:after="0" w:line="240" w:lineRule="auto"/>
       </w:pPr>
       <w:rPr>
+        <w:rFonts w:ascii="Arial" w:hAnsi="Arial" w:cs="Arial" w:eastAsia="Arial"/>
         <w:b/>
         <w:bCs/>
       </w:rPr>
@@ -2377,12 +2589,14 @@
     </w:tblStylePr>
     <w:tblStylePr w:type="firstCol">
       <w:rPr>
+        <w:rFonts w:ascii="Arial" w:hAnsi="Arial" w:cs="Arial" w:eastAsia="Arial"/>
         <w:b/>
         <w:bCs/>
       </w:rPr>
     </w:tblStylePr>
     <w:tblStylePr w:type="lastCol">
       <w:rPr>
+        <w:rFonts w:ascii="Arial" w:hAnsi="Arial" w:cs="Arial" w:eastAsia="Arial"/>
         <w:b/>
         <w:bCs/>
       </w:rPr>
@@ -2416,7 +2630,7 @@
     <w:uiPriority w:val="61"/>
     <w:rsid w:val="00FC693F"/>
     <w:pPr>
-      <w:spacing w:after="0" w:line="240" w:lineRule="auto"/>
+      <w:spacing w:after="0" w:line="480" w:lineRule="auto"/>
     </w:pPr>
     <w:tblPr>
       <w:tblStyleRowBandSize w:val="1"/>
@@ -2440,6 +2654,7 @@
         <w:spacing w:before="0" w:after="0" w:line="240" w:lineRule="auto"/>
       </w:pPr>
       <w:rPr>
+        <w:rFonts w:ascii="Arial" w:hAnsi="Arial" w:cs="Arial" w:eastAsia="Arial"/>
         <w:b/>
         <w:bCs/>
         <w:color w:val="FFFFFF" w:themeColor="background1"/>
@@ -2454,6 +2669,7 @@
         <w:spacing w:before="0" w:after="0" w:line="240" w:lineRule="auto"/>
       </w:pPr>
       <w:rPr>
+        <w:rFonts w:ascii="Arial" w:hAnsi="Arial" w:cs="Arial" w:eastAsia="Arial"/>
         <w:b/>
         <w:bCs/>
       </w:rPr>
@@ -2469,12 +2685,14 @@
     </w:tblStylePr>
     <w:tblStylePr w:type="firstCol">
       <w:rPr>
+        <w:rFonts w:ascii="Arial" w:hAnsi="Arial" w:cs="Arial" w:eastAsia="Arial"/>
         <w:b/>
         <w:bCs/>
       </w:rPr>
     </w:tblStylePr>
     <w:tblStylePr w:type="lastCol">
       <w:rPr>
+        <w:rFonts w:ascii="Arial" w:hAnsi="Arial" w:cs="Arial" w:eastAsia="Arial"/>
         <w:b/>
         <w:bCs/>
       </w:rPr>
@@ -2508,7 +2726,7 @@
     <w:uiPriority w:val="61"/>
     <w:rsid w:val="00CB0664"/>
     <w:pPr>
-      <w:spacing w:after="0" w:line="240" w:lineRule="auto"/>
+      <w:spacing w:after="0" w:line="480" w:lineRule="auto"/>
     </w:pPr>
     <w:tblPr>
       <w:tblStyleRowBandSize w:val="1"/>
@@ -2532,6 +2750,7 @@
         <w:spacing w:before="0" w:after="0" w:line="240" w:lineRule="auto"/>
       </w:pPr>
       <w:rPr>
+        <w:rFonts w:ascii="Arial" w:hAnsi="Arial" w:cs="Arial" w:eastAsia="Arial"/>
         <w:b/>
         <w:bCs/>
         <w:color w:val="FFFFFF" w:themeColor="background1"/>
@@ -2546,6 +2765,7 @@
         <w:spacing w:before="0" w:after="0" w:line="240" w:lineRule="auto"/>
       </w:pPr>
       <w:rPr>
+        <w:rFonts w:ascii="Arial" w:hAnsi="Arial" w:cs="Arial" w:eastAsia="Arial"/>
         <w:b/>
         <w:bCs/>
       </w:rPr>
@@ -2561,12 +2781,14 @@
     </w:tblStylePr>
     <w:tblStylePr w:type="firstCol">
       <w:rPr>
+        <w:rFonts w:ascii="Arial" w:hAnsi="Arial" w:cs="Arial" w:eastAsia="Arial"/>
         <w:b/>
         <w:bCs/>
       </w:rPr>
     </w:tblStylePr>
     <w:tblStylePr w:type="lastCol">
       <w:rPr>
+        <w:rFonts w:ascii="Arial" w:hAnsi="Arial" w:cs="Arial" w:eastAsia="Arial"/>
         <w:b/>
         <w:bCs/>
       </w:rPr>
@@ -2600,7 +2822,7 @@
     <w:uiPriority w:val="61"/>
     <w:rsid w:val="00CB0664"/>
     <w:pPr>
-      <w:spacing w:after="0" w:line="240" w:lineRule="auto"/>
+      <w:spacing w:after="0" w:line="480" w:lineRule="auto"/>
     </w:pPr>
     <w:tblPr>
       <w:tblStyleRowBandSize w:val="1"/>
@@ -2624,6 +2846,7 @@
         <w:spacing w:before="0" w:after="0" w:line="240" w:lineRule="auto"/>
       </w:pPr>
       <w:rPr>
+        <w:rFonts w:ascii="Arial" w:hAnsi="Arial" w:cs="Arial" w:eastAsia="Arial"/>
         <w:b/>
         <w:bCs/>
         <w:color w:val="FFFFFF" w:themeColor="background1"/>
@@ -2638,6 +2861,7 @@
         <w:spacing w:before="0" w:after="0" w:line="240" w:lineRule="auto"/>
       </w:pPr>
       <w:rPr>
+        <w:rFonts w:ascii="Arial" w:hAnsi="Arial" w:cs="Arial" w:eastAsia="Arial"/>
         <w:b/>
         <w:bCs/>
       </w:rPr>
@@ -2653,12 +2877,14 @@
     </w:tblStylePr>
     <w:tblStylePr w:type="firstCol">
       <w:rPr>
+        <w:rFonts w:ascii="Arial" w:hAnsi="Arial" w:cs="Arial" w:eastAsia="Arial"/>
         <w:b/>
         <w:bCs/>
       </w:rPr>
     </w:tblStylePr>
     <w:tblStylePr w:type="lastCol">
       <w:rPr>
+        <w:rFonts w:ascii="Arial" w:hAnsi="Arial" w:cs="Arial" w:eastAsia="Arial"/>
         <w:b/>
         <w:bCs/>
       </w:rPr>
@@ -2692,7 +2918,7 @@
     <w:uiPriority w:val="61"/>
     <w:rsid w:val="00CB0664"/>
     <w:pPr>
-      <w:spacing w:after="0" w:line="240" w:lineRule="auto"/>
+      <w:spacing w:after="0" w:line="480" w:lineRule="auto"/>
     </w:pPr>
     <w:tblPr>
       <w:tblStyleRowBandSize w:val="1"/>
@@ -2716,6 +2942,7 @@
         <w:spacing w:before="0" w:after="0" w:line="240" w:lineRule="auto"/>
       </w:pPr>
       <w:rPr>
+        <w:rFonts w:ascii="Arial" w:hAnsi="Arial" w:cs="Arial" w:eastAsia="Arial"/>
         <w:b/>
         <w:bCs/>
         <w:color w:val="FFFFFF" w:themeColor="background1"/>
@@ -2730,6 +2957,7 @@
         <w:spacing w:before="0" w:after="0" w:line="240" w:lineRule="auto"/>
       </w:pPr>
       <w:rPr>
+        <w:rFonts w:ascii="Arial" w:hAnsi="Arial" w:cs="Arial" w:eastAsia="Arial"/>
         <w:b/>
         <w:bCs/>
       </w:rPr>
@@ -2745,12 +2973,14 @@
     </w:tblStylePr>
     <w:tblStylePr w:type="firstCol">
       <w:rPr>
+        <w:rFonts w:ascii="Arial" w:hAnsi="Arial" w:cs="Arial" w:eastAsia="Arial"/>
         <w:b/>
         <w:bCs/>
       </w:rPr>
     </w:tblStylePr>
     <w:tblStylePr w:type="lastCol">
       <w:rPr>
+        <w:rFonts w:ascii="Arial" w:hAnsi="Arial" w:cs="Arial" w:eastAsia="Arial"/>
         <w:b/>
         <w:bCs/>
       </w:rPr>
@@ -2784,7 +3014,7 @@
     <w:uiPriority w:val="61"/>
     <w:rsid w:val="00CB0664"/>
     <w:pPr>
-      <w:spacing w:after="0" w:line="240" w:lineRule="auto"/>
+      <w:spacing w:after="0" w:line="480" w:lineRule="auto"/>
     </w:pPr>
     <w:tblPr>
       <w:tblStyleRowBandSize w:val="1"/>
@@ -2808,6 +3038,7 @@
         <w:spacing w:before="0" w:after="0" w:line="240" w:lineRule="auto"/>
       </w:pPr>
       <w:rPr>
+        <w:rFonts w:ascii="Arial" w:hAnsi="Arial" w:cs="Arial" w:eastAsia="Arial"/>
         <w:b/>
         <w:bCs/>
         <w:color w:val="FFFFFF" w:themeColor="background1"/>
@@ -2822,6 +3053,7 @@
         <w:spacing w:before="0" w:after="0" w:line="240" w:lineRule="auto"/>
       </w:pPr>
       <w:rPr>
+        <w:rFonts w:ascii="Arial" w:hAnsi="Arial" w:cs="Arial" w:eastAsia="Arial"/>
         <w:b/>
         <w:bCs/>
       </w:rPr>
@@ -2837,12 +3069,14 @@
     </w:tblStylePr>
     <w:tblStylePr w:type="firstCol">
       <w:rPr>
+        <w:rFonts w:ascii="Arial" w:hAnsi="Arial" w:cs="Arial" w:eastAsia="Arial"/>
         <w:b/>
         <w:bCs/>
       </w:rPr>
     </w:tblStylePr>
     <w:tblStylePr w:type="lastCol">
       <w:rPr>
+        <w:rFonts w:ascii="Arial" w:hAnsi="Arial" w:cs="Arial" w:eastAsia="Arial"/>
         <w:b/>
         <w:bCs/>
       </w:rPr>
@@ -2876,7 +3110,7 @@
     <w:uiPriority w:val="61"/>
     <w:rsid w:val="00CB0664"/>
     <w:pPr>
-      <w:spacing w:after="0" w:line="240" w:lineRule="auto"/>
+      <w:spacing w:after="0" w:line="480" w:lineRule="auto"/>
     </w:pPr>
     <w:tblPr>
       <w:tblStyleRowBandSize w:val="1"/>
@@ -2900,6 +3134,7 @@
         <w:spacing w:before="0" w:after="0" w:line="240" w:lineRule="auto"/>
       </w:pPr>
       <w:rPr>
+        <w:rFonts w:ascii="Arial" w:hAnsi="Arial" w:cs="Arial" w:eastAsia="Arial"/>
         <w:b/>
         <w:bCs/>
         <w:color w:val="FFFFFF" w:themeColor="background1"/>
@@ -2914,6 +3149,7 @@
         <w:spacing w:before="0" w:after="0" w:line="240" w:lineRule="auto"/>
       </w:pPr>
       <w:rPr>
+        <w:rFonts w:ascii="Arial" w:hAnsi="Arial" w:cs="Arial" w:eastAsia="Arial"/>
         <w:b/>
         <w:bCs/>
       </w:rPr>
@@ -2929,12 +3165,14 @@
     </w:tblStylePr>
     <w:tblStylePr w:type="firstCol">
       <w:rPr>
+        <w:rFonts w:ascii="Arial" w:hAnsi="Arial" w:cs="Arial" w:eastAsia="Arial"/>
         <w:b/>
         <w:bCs/>
       </w:rPr>
     </w:tblStylePr>
     <w:tblStylePr w:type="lastCol">
       <w:rPr>
+        <w:rFonts w:ascii="Arial" w:hAnsi="Arial" w:cs="Arial" w:eastAsia="Arial"/>
         <w:b/>
         <w:bCs/>
       </w:rPr>
@@ -2968,7 +3206,7 @@
     <w:uiPriority w:val="62"/>
     <w:rsid w:val="00CB0664"/>
     <w:pPr>
-      <w:spacing w:after="0" w:line="240" w:lineRule="auto"/>
+      <w:spacing w:after="0" w:line="480" w:lineRule="auto"/>
     </w:pPr>
     <w:tblPr>
       <w:tblStyleRowBandSize w:val="1"/>
@@ -2994,7 +3232,7 @@
         <w:spacing w:before="0" w:after="0" w:line="240" w:lineRule="auto"/>
       </w:pPr>
       <w:rPr>
-        <w:rFonts w:asciiTheme="majorHAnsi" w:eastAsiaTheme="majorEastAsia" w:hAnsiTheme="majorHAnsi" w:cstheme="majorBidi"/>
+        <w:rFonts w:ascii="Arial" w:hAnsi="Arial" w:cs="Arial" w:eastAsia="Arial"/>
         <w:b/>
         <w:bCs/>
       </w:rPr>
@@ -3015,7 +3253,7 @@
         <w:spacing w:before="0" w:after="0" w:line="240" w:lineRule="auto"/>
       </w:pPr>
       <w:rPr>
-        <w:rFonts w:asciiTheme="majorHAnsi" w:eastAsiaTheme="majorEastAsia" w:hAnsiTheme="majorHAnsi" w:cstheme="majorBidi"/>
+        <w:rFonts w:ascii="Arial" w:hAnsi="Arial" w:cs="Arial" w:eastAsia="Arial"/>
         <w:b/>
         <w:bCs/>
       </w:rPr>
@@ -3033,14 +3271,14 @@
     </w:tblStylePr>
     <w:tblStylePr w:type="firstCol">
       <w:rPr>
-        <w:rFonts w:asciiTheme="majorHAnsi" w:eastAsiaTheme="majorEastAsia" w:hAnsiTheme="majorHAnsi" w:cstheme="majorBidi"/>
+        <w:rFonts w:ascii="Arial" w:hAnsi="Arial" w:cs="Arial" w:eastAsia="Arial"/>
         <w:b/>
         <w:bCs/>
       </w:rPr>
     </w:tblStylePr>
     <w:tblStylePr w:type="lastCol">
       <w:rPr>
-        <w:rFonts w:asciiTheme="majorHAnsi" w:eastAsiaTheme="majorEastAsia" w:hAnsiTheme="majorHAnsi" w:cstheme="majorBidi"/>
+        <w:rFonts w:ascii="Arial" w:hAnsi="Arial" w:cs="Arial" w:eastAsia="Arial"/>
         <w:b/>
         <w:bCs/>
       </w:rPr>
@@ -3098,7 +3336,7 @@
     <w:uiPriority w:val="62"/>
     <w:rsid w:val="00CB0664"/>
     <w:pPr>
-      <w:spacing w:after="0" w:line="240" w:lineRule="auto"/>
+      <w:spacing w:after="0" w:line="480" w:lineRule="auto"/>
     </w:pPr>
     <w:tblPr>
       <w:tblStyleRowBandSize w:val="1"/>
@@ -3124,7 +3362,7 @@
         <w:spacing w:before="0" w:after="0" w:line="240" w:lineRule="auto"/>
       </w:pPr>
       <w:rPr>
-        <w:rFonts w:asciiTheme="majorHAnsi" w:eastAsiaTheme="majorEastAsia" w:hAnsiTheme="majorHAnsi" w:cstheme="majorBidi"/>
+        <w:rFonts w:ascii="Arial" w:hAnsi="Arial" w:cs="Arial" w:eastAsia="Arial"/>
         <w:b/>
         <w:bCs/>
       </w:rPr>
@@ -3145,7 +3383,7 @@
         <w:spacing w:before="0" w:after="0" w:line="240" w:lineRule="auto"/>
       </w:pPr>
       <w:rPr>
-        <w:rFonts w:asciiTheme="majorHAnsi" w:eastAsiaTheme="majorEastAsia" w:hAnsiTheme="majorHAnsi" w:cstheme="majorBidi"/>
+        <w:rFonts w:ascii="Arial" w:hAnsi="Arial" w:cs="Arial" w:eastAsia="Arial"/>
         <w:b/>
         <w:bCs/>
       </w:rPr>
@@ -3163,14 +3401,14 @@
     </w:tblStylePr>
     <w:tblStylePr w:type="firstCol">
       <w:rPr>
-        <w:rFonts w:asciiTheme="majorHAnsi" w:eastAsiaTheme="majorEastAsia" w:hAnsiTheme="majorHAnsi" w:cstheme="majorBidi"/>
+        <w:rFonts w:ascii="Arial" w:hAnsi="Arial" w:cs="Arial" w:eastAsia="Arial"/>
         <w:b/>
         <w:bCs/>
       </w:rPr>
     </w:tblStylePr>
     <w:tblStylePr w:type="lastCol">
       <w:rPr>
-        <w:rFonts w:asciiTheme="majorHAnsi" w:eastAsiaTheme="majorEastAsia" w:hAnsiTheme="majorHAnsi" w:cstheme="majorBidi"/>
+        <w:rFonts w:ascii="Arial" w:hAnsi="Arial" w:cs="Arial" w:eastAsia="Arial"/>
         <w:b/>
         <w:bCs/>
       </w:rPr>
@@ -3228,7 +3466,7 @@
     <w:uiPriority w:val="62"/>
     <w:rsid w:val="00CB0664"/>
     <w:pPr>
-      <w:spacing w:after="0" w:line="240" w:lineRule="auto"/>
+      <w:spacing w:after="0" w:line="480" w:lineRule="auto"/>
     </w:pPr>
     <w:tblPr>
       <w:tblStyleRowBandSize w:val="1"/>
@@ -3254,7 +3492,7 @@
         <w:spacing w:before="0" w:after="0" w:line="240" w:lineRule="auto"/>
       </w:pPr>
       <w:rPr>
-        <w:rFonts w:asciiTheme="majorHAnsi" w:eastAsiaTheme="majorEastAsia" w:hAnsiTheme="majorHAnsi" w:cstheme="majorBidi"/>
+        <w:rFonts w:ascii="Arial" w:hAnsi="Arial" w:cs="Arial" w:eastAsia="Arial"/>
         <w:b/>
         <w:bCs/>
       </w:rPr>
@@ -3275,7 +3513,7 @@
         <w:spacing w:before="0" w:after="0" w:line="240" w:lineRule="auto"/>
       </w:pPr>
       <w:rPr>
-        <w:rFonts w:asciiTheme="majorHAnsi" w:eastAsiaTheme="majorEastAsia" w:hAnsiTheme="majorHAnsi" w:cstheme="majorBidi"/>
+        <w:rFonts w:ascii="Arial" w:hAnsi="Arial" w:cs="Arial" w:eastAsia="Arial"/>
         <w:b/>
         <w:bCs/>
       </w:rPr>
@@ -3293,14 +3531,14 @@
     </w:tblStylePr>
     <w:tblStylePr w:type="firstCol">
       <w:rPr>
-        <w:rFonts w:asciiTheme="majorHAnsi" w:eastAsiaTheme="majorEastAsia" w:hAnsiTheme="majorHAnsi" w:cstheme="majorBidi"/>
+        <w:rFonts w:ascii="Arial" w:hAnsi="Arial" w:cs="Arial" w:eastAsia="Arial"/>
         <w:b/>
         <w:bCs/>
       </w:rPr>
     </w:tblStylePr>
     <w:tblStylePr w:type="lastCol">
       <w:rPr>
-        <w:rFonts w:asciiTheme="majorHAnsi" w:eastAsiaTheme="majorEastAsia" w:hAnsiTheme="majorHAnsi" w:cstheme="majorBidi"/>
+        <w:rFonts w:ascii="Arial" w:hAnsi="Arial" w:cs="Arial" w:eastAsia="Arial"/>
         <w:b/>
         <w:bCs/>
       </w:rPr>
@@ -3358,7 +3596,7 @@
     <w:uiPriority w:val="62"/>
     <w:rsid w:val="00CB0664"/>
     <w:pPr>
-      <w:spacing w:after="0" w:line="240" w:lineRule="auto"/>
+      <w:spacing w:after="0" w:line="480" w:lineRule="auto"/>
     </w:pPr>
     <w:tblPr>
       <w:tblStyleRowBandSize w:val="1"/>
@@ -3384,7 +3622,7 @@
         <w:spacing w:before="0" w:after="0" w:line="240" w:lineRule="auto"/>
       </w:pPr>
       <w:rPr>
-        <w:rFonts w:asciiTheme="majorHAnsi" w:eastAsiaTheme="majorEastAsia" w:hAnsiTheme="majorHAnsi" w:cstheme="majorBidi"/>
+        <w:rFonts w:ascii="Arial" w:hAnsi="Arial" w:cs="Arial" w:eastAsia="Arial"/>
         <w:b/>
         <w:bCs/>
       </w:rPr>
@@ -3405,7 +3643,7 @@
         <w:spacing w:before="0" w:after="0" w:line="240" w:lineRule="auto"/>
       </w:pPr>
       <w:rPr>
-        <w:rFonts w:asciiTheme="majorHAnsi" w:eastAsiaTheme="majorEastAsia" w:hAnsiTheme="majorHAnsi" w:cstheme="majorBidi"/>
+        <w:rFonts w:ascii="Arial" w:hAnsi="Arial" w:cs="Arial" w:eastAsia="Arial"/>
         <w:b/>
         <w:bCs/>
       </w:rPr>
@@ -3423,14 +3661,14 @@
     </w:tblStylePr>
     <w:tblStylePr w:type="firstCol">
       <w:rPr>
-        <w:rFonts w:asciiTheme="majorHAnsi" w:eastAsiaTheme="majorEastAsia" w:hAnsiTheme="majorHAnsi" w:cstheme="majorBidi"/>
+        <w:rFonts w:ascii="Arial" w:hAnsi="Arial" w:cs="Arial" w:eastAsia="Arial"/>
         <w:b/>
         <w:bCs/>
       </w:rPr>
     </w:tblStylePr>
     <w:tblStylePr w:type="lastCol">
       <w:rPr>
-        <w:rFonts w:asciiTheme="majorHAnsi" w:eastAsiaTheme="majorEastAsia" w:hAnsiTheme="majorHAnsi" w:cstheme="majorBidi"/>
+        <w:rFonts w:ascii="Arial" w:hAnsi="Arial" w:cs="Arial" w:eastAsia="Arial"/>
         <w:b/>
         <w:bCs/>
       </w:rPr>
@@ -3488,7 +3726,7 @@
     <w:uiPriority w:val="62"/>
     <w:rsid w:val="00CB0664"/>
     <w:pPr>
-      <w:spacing w:after="0" w:line="240" w:lineRule="auto"/>
+      <w:spacing w:after="0" w:line="480" w:lineRule="auto"/>
     </w:pPr>
     <w:tblPr>
       <w:tblStyleRowBandSize w:val="1"/>
@@ -3514,7 +3752,7 @@
         <w:spacing w:before="0" w:after="0" w:line="240" w:lineRule="auto"/>
       </w:pPr>
       <w:rPr>
-        <w:rFonts w:asciiTheme="majorHAnsi" w:eastAsiaTheme="majorEastAsia" w:hAnsiTheme="majorHAnsi" w:cstheme="majorBidi"/>
+        <w:rFonts w:ascii="Arial" w:hAnsi="Arial" w:cs="Arial" w:eastAsia="Arial"/>
         <w:b/>
         <w:bCs/>
       </w:rPr>
@@ -3535,7 +3773,7 @@
         <w:spacing w:before="0" w:after="0" w:line="240" w:lineRule="auto"/>
       </w:pPr>
       <w:rPr>
-        <w:rFonts w:asciiTheme="majorHAnsi" w:eastAsiaTheme="majorEastAsia" w:hAnsiTheme="majorHAnsi" w:cstheme="majorBidi"/>
+        <w:rFonts w:ascii="Arial" w:hAnsi="Arial" w:cs="Arial" w:eastAsia="Arial"/>
         <w:b/>
         <w:bCs/>
       </w:rPr>
@@ -3553,14 +3791,14 @@
     </w:tblStylePr>
     <w:tblStylePr w:type="firstCol">
       <w:rPr>
-        <w:rFonts w:asciiTheme="majorHAnsi" w:eastAsiaTheme="majorEastAsia" w:hAnsiTheme="majorHAnsi" w:cstheme="majorBidi"/>
+        <w:rFonts w:ascii="Arial" w:hAnsi="Arial" w:cs="Arial" w:eastAsia="Arial"/>
         <w:b/>
         <w:bCs/>
       </w:rPr>
     </w:tblStylePr>
     <w:tblStylePr w:type="lastCol">
       <w:rPr>
-        <w:rFonts w:asciiTheme="majorHAnsi" w:eastAsiaTheme="majorEastAsia" w:hAnsiTheme="majorHAnsi" w:cstheme="majorBidi"/>
+        <w:rFonts w:ascii="Arial" w:hAnsi="Arial" w:cs="Arial" w:eastAsia="Arial"/>
         <w:b/>
         <w:bCs/>
       </w:rPr>
@@ -3618,7 +3856,7 @@
     <w:uiPriority w:val="62"/>
     <w:rsid w:val="00CB0664"/>
     <w:pPr>
-      <w:spacing w:after="0" w:line="240" w:lineRule="auto"/>
+      <w:spacing w:after="0" w:line="480" w:lineRule="auto"/>
     </w:pPr>
     <w:tblPr>
       <w:tblStyleRowBandSize w:val="1"/>
@@ -3644,7 +3882,7 @@
         <w:spacing w:before="0" w:after="0" w:line="240" w:lineRule="auto"/>
       </w:pPr>
       <w:rPr>
-        <w:rFonts w:asciiTheme="majorHAnsi" w:eastAsiaTheme="majorEastAsia" w:hAnsiTheme="majorHAnsi" w:cstheme="majorBidi"/>
+        <w:rFonts w:ascii="Arial" w:hAnsi="Arial" w:cs="Arial" w:eastAsia="Arial"/>
         <w:b/>
         <w:bCs/>
       </w:rPr>
@@ -3665,7 +3903,7 @@
         <w:spacing w:before="0" w:after="0" w:line="240" w:lineRule="auto"/>
       </w:pPr>
       <w:rPr>
-        <w:rFonts w:asciiTheme="majorHAnsi" w:eastAsiaTheme="majorEastAsia" w:hAnsiTheme="majorHAnsi" w:cstheme="majorBidi"/>
+        <w:rFonts w:ascii="Arial" w:hAnsi="Arial" w:cs="Arial" w:eastAsia="Arial"/>
         <w:b/>
         <w:bCs/>
       </w:rPr>
@@ -3683,14 +3921,14 @@
     </w:tblStylePr>
     <w:tblStylePr w:type="firstCol">
       <w:rPr>
-        <w:rFonts w:asciiTheme="majorHAnsi" w:eastAsiaTheme="majorEastAsia" w:hAnsiTheme="majorHAnsi" w:cstheme="majorBidi"/>
+        <w:rFonts w:ascii="Arial" w:hAnsi="Arial" w:cs="Arial" w:eastAsia="Arial"/>
         <w:b/>
         <w:bCs/>
       </w:rPr>
     </w:tblStylePr>
     <w:tblStylePr w:type="lastCol">
       <w:rPr>
-        <w:rFonts w:asciiTheme="majorHAnsi" w:eastAsiaTheme="majorEastAsia" w:hAnsiTheme="majorHAnsi" w:cstheme="majorBidi"/>
+        <w:rFonts w:ascii="Arial" w:hAnsi="Arial" w:cs="Arial" w:eastAsia="Arial"/>
         <w:b/>
         <w:bCs/>
       </w:rPr>
@@ -3748,7 +3986,7 @@
     <w:uiPriority w:val="62"/>
     <w:rsid w:val="00CB0664"/>
     <w:pPr>
-      <w:spacing w:after="0" w:line="240" w:lineRule="auto"/>
+      <w:spacing w:after="0" w:line="480" w:lineRule="auto"/>
     </w:pPr>
     <w:tblPr>
       <w:tblStyleRowBandSize w:val="1"/>
@@ -3774,7 +4012,7 @@
         <w:spacing w:before="0" w:after="0" w:line="240" w:lineRule="auto"/>
       </w:pPr>
       <w:rPr>
-        <w:rFonts w:asciiTheme="majorHAnsi" w:eastAsiaTheme="majorEastAsia" w:hAnsiTheme="majorHAnsi" w:cstheme="majorBidi"/>
+        <w:rFonts w:ascii="Arial" w:hAnsi="Arial" w:cs="Arial" w:eastAsia="Arial"/>
         <w:b/>
         <w:bCs/>
       </w:rPr>
@@ -3795,7 +4033,7 @@
         <w:spacing w:before="0" w:after="0" w:line="240" w:lineRule="auto"/>
       </w:pPr>
       <w:rPr>
-        <w:rFonts w:asciiTheme="majorHAnsi" w:eastAsiaTheme="majorEastAsia" w:hAnsiTheme="majorHAnsi" w:cstheme="majorBidi"/>
+        <w:rFonts w:ascii="Arial" w:hAnsi="Arial" w:cs="Arial" w:eastAsia="Arial"/>
         <w:b/>
         <w:bCs/>
       </w:rPr>
@@ -3813,14 +4051,14 @@
     </w:tblStylePr>
     <w:tblStylePr w:type="firstCol">
       <w:rPr>
-        <w:rFonts w:asciiTheme="majorHAnsi" w:eastAsiaTheme="majorEastAsia" w:hAnsiTheme="majorHAnsi" w:cstheme="majorBidi"/>
+        <w:rFonts w:ascii="Arial" w:hAnsi="Arial" w:cs="Arial" w:eastAsia="Arial"/>
         <w:b/>
         <w:bCs/>
       </w:rPr>
     </w:tblStylePr>
     <w:tblStylePr w:type="lastCol">
       <w:rPr>
-        <w:rFonts w:asciiTheme="majorHAnsi" w:eastAsiaTheme="majorEastAsia" w:hAnsiTheme="majorHAnsi" w:cstheme="majorBidi"/>
+        <w:rFonts w:ascii="Arial" w:hAnsi="Arial" w:cs="Arial" w:eastAsia="Arial"/>
         <w:b/>
         <w:bCs/>
       </w:rPr>
@@ -3878,7 +4116,7 @@
     <w:uiPriority w:val="63"/>
     <w:rsid w:val="00CB0664"/>
     <w:pPr>
-      <w:spacing w:after="0" w:line="240" w:lineRule="auto"/>
+      <w:spacing w:after="0" w:line="480" w:lineRule="auto"/>
     </w:pPr>
     <w:tblPr>
       <w:tblStyleRowBandSize w:val="1"/>
@@ -3903,6 +4141,7 @@
         <w:spacing w:before="0" w:after="0" w:line="240" w:lineRule="auto"/>
       </w:pPr>
       <w:rPr>
+        <w:rFonts w:ascii="Arial" w:hAnsi="Arial" w:cs="Arial" w:eastAsia="Arial"/>
         <w:b/>
         <w:bCs/>
         <w:color w:val="FFFFFF" w:themeColor="background1"/>
@@ -3925,6 +4164,7 @@
         <w:spacing w:before="0" w:after="0" w:line="240" w:lineRule="auto"/>
       </w:pPr>
       <w:rPr>
+        <w:rFonts w:ascii="Arial" w:hAnsi="Arial" w:cs="Arial" w:eastAsia="Arial"/>
         <w:b/>
         <w:bCs/>
       </w:rPr>
@@ -3942,12 +4182,14 @@
     </w:tblStylePr>
     <w:tblStylePr w:type="firstCol">
       <w:rPr>
+        <w:rFonts w:ascii="Arial" w:hAnsi="Arial" w:cs="Arial" w:eastAsia="Arial"/>
         <w:b/>
         <w:bCs/>
       </w:rPr>
     </w:tblStylePr>
     <w:tblStylePr w:type="lastCol">
       <w:rPr>
+        <w:rFonts w:ascii="Arial" w:hAnsi="Arial" w:cs="Arial" w:eastAsia="Arial"/>
         <w:b/>
         <w:bCs/>
       </w:rPr>
@@ -3984,7 +4226,7 @@
     <w:uiPriority w:val="63"/>
     <w:rsid w:val="00CB0664"/>
     <w:pPr>
-      <w:spacing w:after="0" w:line="240" w:lineRule="auto"/>
+      <w:spacing w:after="0" w:line="480" w:lineRule="auto"/>
     </w:pPr>
     <w:tblPr>
       <w:tblStyleRowBandSize w:val="1"/>
@@ -4009,6 +4251,7 @@
         <w:spacing w:before="0" w:after="0" w:line="240" w:lineRule="auto"/>
       </w:pPr>
       <w:rPr>
+        <w:rFonts w:ascii="Arial" w:hAnsi="Arial" w:cs="Arial" w:eastAsia="Arial"/>
         <w:b/>
         <w:bCs/>
         <w:color w:val="FFFFFF" w:themeColor="background1"/>
@@ -4031,6 +4274,7 @@
         <w:spacing w:before="0" w:after="0" w:line="240" w:lineRule="auto"/>
       </w:pPr>
       <w:rPr>
+        <w:rFonts w:ascii="Arial" w:hAnsi="Arial" w:cs="Arial" w:eastAsia="Arial"/>
         <w:b/>
         <w:bCs/>
       </w:rPr>
@@ -4048,12 +4292,14 @@
     </w:tblStylePr>
     <w:tblStylePr w:type="firstCol">
       <w:rPr>
+        <w:rFonts w:ascii="Arial" w:hAnsi="Arial" w:cs="Arial" w:eastAsia="Arial"/>
         <w:b/>
         <w:bCs/>
       </w:rPr>
     </w:tblStylePr>
     <w:tblStylePr w:type="lastCol">
       <w:rPr>
+        <w:rFonts w:ascii="Arial" w:hAnsi="Arial" w:cs="Arial" w:eastAsia="Arial"/>
         <w:b/>
         <w:bCs/>
       </w:rPr>
@@ -4090,7 +4336,7 @@
     <w:uiPriority w:val="63"/>
     <w:rsid w:val="00CB0664"/>
     <w:pPr>
-      <w:spacing w:after="0" w:line="240" w:lineRule="auto"/>
+      <w:spacing w:after="0" w:line="480" w:lineRule="auto"/>
     </w:pPr>
     <w:tblPr>
       <w:tblStyleRowBandSize w:val="1"/>
@@ -4115,6 +4361,7 @@
         <w:spacing w:before="0" w:after="0" w:line="240" w:lineRule="auto"/>
       </w:pPr>
       <w:rPr>
+        <w:rFonts w:ascii="Arial" w:hAnsi="Arial" w:cs="Arial" w:eastAsia="Arial"/>
         <w:b/>
         <w:bCs/>
         <w:color w:val="FFFFFF" w:themeColor="background1"/>
@@ -4137,6 +4384,7 @@
         <w:spacing w:before="0" w:after="0" w:line="240" w:lineRule="auto"/>
       </w:pPr>
       <w:rPr>
+        <w:rFonts w:ascii="Arial" w:hAnsi="Arial" w:cs="Arial" w:eastAsia="Arial"/>
         <w:b/>
         <w:bCs/>
       </w:rPr>
@@ -4154,12 +4402,14 @@
     </w:tblStylePr>
     <w:tblStylePr w:type="firstCol">
       <w:rPr>
+        <w:rFonts w:ascii="Arial" w:hAnsi="Arial" w:cs="Arial" w:eastAsia="Arial"/>
         <w:b/>
         <w:bCs/>
       </w:rPr>
     </w:tblStylePr>
     <w:tblStylePr w:type="lastCol">
       <w:rPr>
+        <w:rFonts w:ascii="Arial" w:hAnsi="Arial" w:cs="Arial" w:eastAsia="Arial"/>
         <w:b/>
         <w:bCs/>
       </w:rPr>
@@ -4196,7 +4446,7 @@
     <w:uiPriority w:val="63"/>
     <w:rsid w:val="00CB0664"/>
     <w:pPr>
-      <w:spacing w:after="0" w:line="240" w:lineRule="auto"/>
+      <w:spacing w:after="0" w:line="480" w:lineRule="auto"/>
     </w:pPr>
     <w:tblPr>
       <w:tblStyleRowBandSize w:val="1"/>
@@ -4221,6 +4471,7 @@
         <w:spacing w:before="0" w:after="0" w:line="240" w:lineRule="auto"/>
       </w:pPr>
       <w:rPr>
+        <w:rFonts w:ascii="Arial" w:hAnsi="Arial" w:cs="Arial" w:eastAsia="Arial"/>
         <w:b/>
         <w:bCs/>
         <w:color w:val="FFFFFF" w:themeColor="background1"/>
@@ -4243,6 +4494,7 @@
         <w:spacing w:before="0" w:after="0" w:line="240" w:lineRule="auto"/>
       </w:pPr>
       <w:rPr>
+        <w:rFonts w:ascii="Arial" w:hAnsi="Arial" w:cs="Arial" w:eastAsia="Arial"/>
         <w:b/>
         <w:bCs/>
       </w:rPr>
@@ -4260,12 +4512,14 @@
     </w:tblStylePr>
     <w:tblStylePr w:type="firstCol">
       <w:rPr>
+        <w:rFonts w:ascii="Arial" w:hAnsi="Arial" w:cs="Arial" w:eastAsia="Arial"/>
         <w:b/>
         <w:bCs/>
       </w:rPr>
     </w:tblStylePr>
     <w:tblStylePr w:type="lastCol">
       <w:rPr>
+        <w:rFonts w:ascii="Arial" w:hAnsi="Arial" w:cs="Arial" w:eastAsia="Arial"/>
         <w:b/>
         <w:bCs/>
       </w:rPr>
@@ -4302,7 +4556,7 @@
     <w:uiPriority w:val="63"/>
     <w:rsid w:val="00CB0664"/>
     <w:pPr>
-      <w:spacing w:after="0" w:line="240" w:lineRule="auto"/>
+      <w:spacing w:after="0" w:line="480" w:lineRule="auto"/>
     </w:pPr>
     <w:tblPr>
       <w:tblStyleRowBandSize w:val="1"/>
@@ -4327,6 +4581,7 @@
         <w:spacing w:before="0" w:after="0" w:line="240" w:lineRule="auto"/>
       </w:pPr>
       <w:rPr>
+        <w:rFonts w:ascii="Arial" w:hAnsi="Arial" w:cs="Arial" w:eastAsia="Arial"/>
         <w:b/>
         <w:bCs/>
         <w:color w:val="FFFFFF" w:themeColor="background1"/>
@@ -4349,6 +4604,7 @@
         <w:spacing w:before="0" w:after="0" w:line="240" w:lineRule="auto"/>
       </w:pPr>
       <w:rPr>
+        <w:rFonts w:ascii="Arial" w:hAnsi="Arial" w:cs="Arial" w:eastAsia="Arial"/>
         <w:b/>
         <w:bCs/>
       </w:rPr>
@@ -4366,12 +4622,14 @@
     </w:tblStylePr>
     <w:tblStylePr w:type="firstCol">
       <w:rPr>
+        <w:rFonts w:ascii="Arial" w:hAnsi="Arial" w:cs="Arial" w:eastAsia="Arial"/>
         <w:b/>
         <w:bCs/>
       </w:rPr>
     </w:tblStylePr>
     <w:tblStylePr w:type="lastCol">
       <w:rPr>
+        <w:rFonts w:ascii="Arial" w:hAnsi="Arial" w:cs="Arial" w:eastAsia="Arial"/>
         <w:b/>
         <w:bCs/>
       </w:rPr>
@@ -4408,7 +4666,7 @@
     <w:uiPriority w:val="63"/>
     <w:rsid w:val="00CB0664"/>
     <w:pPr>
-      <w:spacing w:after="0" w:line="240" w:lineRule="auto"/>
+      <w:spacing w:after="0" w:line="480" w:lineRule="auto"/>
     </w:pPr>
     <w:tblPr>
       <w:tblStyleRowBandSize w:val="1"/>
@@ -4433,6 +4691,7 @@
         <w:spacing w:before="0" w:after="0" w:line="240" w:lineRule="auto"/>
       </w:pPr>
       <w:rPr>
+        <w:rFonts w:ascii="Arial" w:hAnsi="Arial" w:cs="Arial" w:eastAsia="Arial"/>
         <w:b/>
         <w:bCs/>
         <w:color w:val="FFFFFF" w:themeColor="background1"/>
@@ -4455,6 +4714,7 @@
         <w:spacing w:before="0" w:after="0" w:line="240" w:lineRule="auto"/>
       </w:pPr>
       <w:rPr>
+        <w:rFonts w:ascii="Arial" w:hAnsi="Arial" w:cs="Arial" w:eastAsia="Arial"/>
         <w:b/>
         <w:bCs/>
       </w:rPr>
@@ -4472,12 +4732,14 @@
     </w:tblStylePr>
     <w:tblStylePr w:type="firstCol">
       <w:rPr>
+        <w:rFonts w:ascii="Arial" w:hAnsi="Arial" w:cs="Arial" w:eastAsia="Arial"/>
         <w:b/>
         <w:bCs/>
       </w:rPr>
     </w:tblStylePr>
     <w:tblStylePr w:type="lastCol">
       <w:rPr>
+        <w:rFonts w:ascii="Arial" w:hAnsi="Arial" w:cs="Arial" w:eastAsia="Arial"/>
         <w:b/>
         <w:bCs/>
       </w:rPr>
@@ -4514,7 +4776,7 @@
     <w:uiPriority w:val="63"/>
     <w:rsid w:val="00CB0664"/>
     <w:pPr>
-      <w:spacing w:after="0" w:line="240" w:lineRule="auto"/>
+      <w:spacing w:after="0" w:line="480" w:lineRule="auto"/>
     </w:pPr>
     <w:tblPr>
       <w:tblStyleRowBandSize w:val="1"/>
@@ -4539,6 +4801,7 @@
         <w:spacing w:before="0" w:after="0" w:line="240" w:lineRule="auto"/>
       </w:pPr>
       <w:rPr>
+        <w:rFonts w:ascii="Arial" w:hAnsi="Arial" w:cs="Arial" w:eastAsia="Arial"/>
         <w:b/>
         <w:bCs/>
         <w:color w:val="FFFFFF" w:themeColor="background1"/>
@@ -4561,6 +4824,7 @@
         <w:spacing w:before="0" w:after="0" w:line="240" w:lineRule="auto"/>
       </w:pPr>
       <w:rPr>
+        <w:rFonts w:ascii="Arial" w:hAnsi="Arial" w:cs="Arial" w:eastAsia="Arial"/>
         <w:b/>
         <w:bCs/>
       </w:rPr>
@@ -4578,12 +4842,14 @@
     </w:tblStylePr>
     <w:tblStylePr w:type="firstCol">
       <w:rPr>
+        <w:rFonts w:ascii="Arial" w:hAnsi="Arial" w:cs="Arial" w:eastAsia="Arial"/>
         <w:b/>
         <w:bCs/>
       </w:rPr>
     </w:tblStylePr>
     <w:tblStylePr w:type="lastCol">
       <w:rPr>
+        <w:rFonts w:ascii="Arial" w:hAnsi="Arial" w:cs="Arial" w:eastAsia="Arial"/>
         <w:b/>
         <w:bCs/>
       </w:rPr>
@@ -4620,7 +4886,7 @@
     <w:uiPriority w:val="64"/>
     <w:rsid w:val="00CB0664"/>
     <w:pPr>
-      <w:spacing w:after="0" w:line="240" w:lineRule="auto"/>
+      <w:spacing w:after="0" w:line="480" w:lineRule="auto"/>
     </w:pPr>
     <w:tblPr>
       <w:tblStyleRowBandSize w:val="1"/>
@@ -4642,6 +4908,7 @@
         <w:spacing w:before="0" w:after="0" w:line="240" w:lineRule="auto"/>
       </w:pPr>
       <w:rPr>
+        <w:rFonts w:ascii="Arial" w:hAnsi="Arial" w:cs="Arial" w:eastAsia="Arial"/>
         <w:b/>
         <w:bCs/>
         <w:color w:val="FFFFFF" w:themeColor="background1"/>
@@ -4664,6 +4931,7 @@
         <w:spacing w:before="0" w:after="0" w:line="240" w:lineRule="auto"/>
       </w:pPr>
       <w:rPr>
+        <w:rFonts w:ascii="Arial" w:hAnsi="Arial" w:cs="Arial" w:eastAsia="Arial"/>
         <w:color w:val="auto"/>
       </w:rPr>
       <w:tblPr/>
@@ -4681,6 +4949,7 @@
     </w:tblStylePr>
     <w:tblStylePr w:type="firstCol">
       <w:rPr>
+        <w:rFonts w:ascii="Arial" w:hAnsi="Arial" w:cs="Arial" w:eastAsia="Arial"/>
         <w:b/>
         <w:bCs/>
         <w:color w:val="FFFFFF" w:themeColor="background1"/>
@@ -4700,6 +4969,7 @@
     </w:tblStylePr>
     <w:tblStylePr w:type="lastCol">
       <w:rPr>
+        <w:rFonts w:ascii="Arial" w:hAnsi="Arial" w:cs="Arial" w:eastAsia="Arial"/>
         <w:b/>
         <w:bCs/>
         <w:color w:val="FFFFFF" w:themeColor="background1"/>
@@ -4748,6 +5018,7 @@
     </w:tblStylePr>
     <w:tblStylePr w:type="nwCell">
       <w:rPr>
+        <w:rFonts w:ascii="Arial" w:hAnsi="Arial" w:cs="Arial" w:eastAsia="Arial"/>
         <w:color w:val="FFFFFF" w:themeColor="background1"/>
       </w:rPr>
       <w:tblPr/>
@@ -4769,7 +5040,7 @@
     <w:uiPriority w:val="64"/>
     <w:rsid w:val="00CB0664"/>
     <w:pPr>
-      <w:spacing w:after="0" w:line="240" w:lineRule="auto"/>
+      <w:spacing w:after="0" w:line="480" w:lineRule="auto"/>
     </w:pPr>
     <w:tblPr>
       <w:tblStyleRowBandSize w:val="1"/>
@@ -4791,6 +5062,7 @@
         <w:spacing w:before="0" w:after="0" w:line="240" w:lineRule="auto"/>
       </w:pPr>
       <w:rPr>
+        <w:rFonts w:ascii="Arial" w:hAnsi="Arial" w:cs="Arial" w:eastAsia="Arial"/>
         <w:b/>
         <w:bCs/>
         <w:color w:val="FFFFFF" w:themeColor="background1"/>
@@ -4813,6 +5085,7 @@
         <w:spacing w:before="0" w:after="0" w:line="240" w:lineRule="auto"/>
       </w:pPr>
       <w:rPr>
+        <w:rFonts w:ascii="Arial" w:hAnsi="Arial" w:cs="Arial" w:eastAsia="Arial"/>
         <w:color w:val="auto"/>
       </w:rPr>
       <w:tblPr/>
@@ -4830,6 +5103,7 @@
     </w:tblStylePr>
     <w:tblStylePr w:type="firstCol">
       <w:rPr>
+        <w:rFonts w:ascii="Arial" w:hAnsi="Arial" w:cs="Arial" w:eastAsia="Arial"/>
         <w:b/>
         <w:bCs/>
         <w:color w:val="FFFFFF" w:themeColor="background1"/>
@@ -4849,6 +5123,7 @@
     </w:tblStylePr>
     <w:tblStylePr w:type="lastCol">
       <w:rPr>
+        <w:rFonts w:ascii="Arial" w:hAnsi="Arial" w:cs="Arial" w:eastAsia="Arial"/>
         <w:b/>
         <w:bCs/>
         <w:color w:val="FFFFFF" w:themeColor="background1"/>
@@ -4897,6 +5172,7 @@
     </w:tblStylePr>
     <w:tblStylePr w:type="nwCell">
       <w:rPr>
+        <w:rFonts w:ascii="Arial" w:hAnsi="Arial" w:cs="Arial" w:eastAsia="Arial"/>
         <w:color w:val="FFFFFF" w:themeColor="background1"/>
       </w:rPr>
       <w:tblPr/>
@@ -4918,7 +5194,7 @@
     <w:uiPriority w:val="64"/>
     <w:rsid w:val="00CB0664"/>
     <w:pPr>
-      <w:spacing w:after="0" w:line="240" w:lineRule="auto"/>
+      <w:spacing w:after="0" w:line="480" w:lineRule="auto"/>
     </w:pPr>
     <w:tblPr>
       <w:tblStyleRowBandSize w:val="1"/>
@@ -4940,6 +5216,7 @@
         <w:spacing w:before="0" w:after="0" w:line="240" w:lineRule="auto"/>
       </w:pPr>
       <w:rPr>
+        <w:rFonts w:ascii="Arial" w:hAnsi="Arial" w:cs="Arial" w:eastAsia="Arial"/>
         <w:b/>
         <w:bCs/>
         <w:color w:val="FFFFFF" w:themeColor="background1"/>
@@ -4962,6 +5239,7 @@
         <w:spacing w:before="0" w:after="0" w:line="240" w:lineRule="auto"/>
       </w:pPr>
       <w:rPr>
+        <w:rFonts w:ascii="Arial" w:hAnsi="Arial" w:cs="Arial" w:eastAsia="Arial"/>
         <w:color w:val="auto"/>
       </w:rPr>
       <w:tblPr/>
@@ -4979,6 +5257,7 @@
     </w:tblStylePr>
     <w:tblStylePr w:type="firstCol">
       <w:rPr>
+        <w:rFonts w:ascii="Arial" w:hAnsi="Arial" w:cs="Arial" w:eastAsia="Arial"/>
         <w:b/>
         <w:bCs/>
         <w:color w:val="FFFFFF" w:themeColor="background1"/>
@@ -4998,6 +5277,7 @@
     </w:tblStylePr>
     <w:tblStylePr w:type="lastCol">
       <w:rPr>
+        <w:rFonts w:ascii="Arial" w:hAnsi="Arial" w:cs="Arial" w:eastAsia="Arial"/>
         <w:b/>
         <w:bCs/>
         <w:color w:val="FFFFFF" w:themeColor="background1"/>
@@ -5046,6 +5326,7 @@
     </w:tblStylePr>
     <w:tblStylePr w:type="nwCell">
       <w:rPr>
+        <w:rFonts w:ascii="Arial" w:hAnsi="Arial" w:cs="Arial" w:eastAsia="Arial"/>
         <w:color w:val="FFFFFF" w:themeColor="background1"/>
       </w:rPr>
       <w:tblPr/>
@@ -5067,7 +5348,7 @@
     <w:uiPriority w:val="64"/>
     <w:rsid w:val="00CB0664"/>
     <w:pPr>
-      <w:spacing w:after="0" w:line="240" w:lineRule="auto"/>
+      <w:spacing w:after="0" w:line="480" w:lineRule="auto"/>
     </w:pPr>
     <w:tblPr>
       <w:tblStyleRowBandSize w:val="1"/>
@@ -5089,6 +5370,7 @@
         <w:spacing w:before="0" w:after="0" w:line="240" w:lineRule="auto"/>
       </w:pPr>
       <w:rPr>
+        <w:rFonts w:ascii="Arial" w:hAnsi="Arial" w:cs="Arial" w:eastAsia="Arial"/>
         <w:b/>
         <w:bCs/>
         <w:color w:val="FFFFFF" w:themeColor="background1"/>
@@ -5111,6 +5393,7 @@
         <w:spacing w:before="0" w:after="0" w:line="240" w:lineRule="auto"/>
       </w:pPr>
       <w:rPr>
+        <w:rFonts w:ascii="Arial" w:hAnsi="Arial" w:cs="Arial" w:eastAsia="Arial"/>
         <w:color w:val="auto"/>
       </w:rPr>
       <w:tblPr/>
@@ -5128,6 +5411,7 @@
     </w:tblStylePr>
     <w:tblStylePr w:type="firstCol">
       <w:rPr>
+        <w:rFonts w:ascii="Arial" w:hAnsi="Arial" w:cs="Arial" w:eastAsia="Arial"/>
         <w:b/>
         <w:bCs/>
         <w:color w:val="FFFFFF" w:themeColor="background1"/>
@@ -5147,6 +5431,7 @@
     </w:tblStylePr>
     <w:tblStylePr w:type="lastCol">
       <w:rPr>
+        <w:rFonts w:ascii="Arial" w:hAnsi="Arial" w:cs="Arial" w:eastAsia="Arial"/>
         <w:b/>
         <w:bCs/>
         <w:color w:val="FFFFFF" w:themeColor="background1"/>
@@ -5195,6 +5480,7 @@
     </w:tblStylePr>
     <w:tblStylePr w:type="nwCell">
       <w:rPr>
+        <w:rFonts w:ascii="Arial" w:hAnsi="Arial" w:cs="Arial" w:eastAsia="Arial"/>
         <w:color w:val="FFFFFF" w:themeColor="background1"/>
       </w:rPr>
       <w:tblPr/>
@@ -5216,7 +5502,7 @@
     <w:uiPriority w:val="64"/>
     <w:rsid w:val="00CB0664"/>
     <w:pPr>
-      <w:spacing w:after="0" w:line="240" w:lineRule="auto"/>
+      <w:spacing w:after="0" w:line="480" w:lineRule="auto"/>
     </w:pPr>
     <w:tblPr>
       <w:tblStyleRowBandSize w:val="1"/>
@@ -5238,6 +5524,7 @@
         <w:spacing w:before="0" w:after="0" w:line="240" w:lineRule="auto"/>
       </w:pPr>
       <w:rPr>
+        <w:rFonts w:ascii="Arial" w:hAnsi="Arial" w:cs="Arial" w:eastAsia="Arial"/>
         <w:b/>
         <w:bCs/>
         <w:color w:val="FFFFFF" w:themeColor="background1"/>
@@ -5260,6 +5547,7 @@
         <w:spacing w:before="0" w:after="0" w:line="240" w:lineRule="auto"/>
       </w:pPr>
       <w:rPr>
+        <w:rFonts w:ascii="Arial" w:hAnsi="Arial" w:cs="Arial" w:eastAsia="Arial"/>
         <w:color w:val="auto"/>
       </w:rPr>
       <w:tblPr/>
@@ -5277,6 +5565,7 @@
     </w:tblStylePr>
     <w:tblStylePr w:type="firstCol">
       <w:rPr>
+        <w:rFonts w:ascii="Arial" w:hAnsi="Arial" w:cs="Arial" w:eastAsia="Arial"/>
         <w:b/>
         <w:bCs/>
         <w:color w:val="FFFFFF" w:themeColor="background1"/>
@@ -5296,6 +5585,7 @@
     </w:tblStylePr>
     <w:tblStylePr w:type="lastCol">
       <w:rPr>
+        <w:rFonts w:ascii="Arial" w:hAnsi="Arial" w:cs="Arial" w:eastAsia="Arial"/>
         <w:b/>
         <w:bCs/>
         <w:color w:val="FFFFFF" w:themeColor="background1"/>
@@ -5344,6 +5634,7 @@
     </w:tblStylePr>
     <w:tblStylePr w:type="nwCell">
       <w:rPr>
+        <w:rFonts w:ascii="Arial" w:hAnsi="Arial" w:cs="Arial" w:eastAsia="Arial"/>
         <w:color w:val="FFFFFF" w:themeColor="background1"/>
       </w:rPr>
       <w:tblPr/>
@@ -5365,7 +5656,7 @@
     <w:uiPriority w:val="64"/>
     <w:rsid w:val="00CB0664"/>
     <w:pPr>
-      <w:spacing w:after="0" w:line="240" w:lineRule="auto"/>
+      <w:spacing w:after="0" w:line="480" w:lineRule="auto"/>
     </w:pPr>
     <w:tblPr>
       <w:tblStyleRowBandSize w:val="1"/>
@@ -5387,6 +5678,7 @@
         <w:spacing w:before="0" w:after="0" w:line="240" w:lineRule="auto"/>
       </w:pPr>
       <w:rPr>
+        <w:rFonts w:ascii="Arial" w:hAnsi="Arial" w:cs="Arial" w:eastAsia="Arial"/>
         <w:b/>
         <w:bCs/>
         <w:color w:val="FFFFFF" w:themeColor="background1"/>
@@ -5409,6 +5701,7 @@
         <w:spacing w:before="0" w:after="0" w:line="240" w:lineRule="auto"/>
       </w:pPr>
       <w:rPr>
+        <w:rFonts w:ascii="Arial" w:hAnsi="Arial" w:cs="Arial" w:eastAsia="Arial"/>
         <w:color w:val="auto"/>
       </w:rPr>
       <w:tblPr/>
@@ -5426,6 +5719,7 @@
     </w:tblStylePr>
     <w:tblStylePr w:type="firstCol">
       <w:rPr>
+        <w:rFonts w:ascii="Arial" w:hAnsi="Arial" w:cs="Arial" w:eastAsia="Arial"/>
         <w:b/>
         <w:bCs/>
         <w:color w:val="FFFFFF" w:themeColor="background1"/>
@@ -5445,6 +5739,7 @@
     </w:tblStylePr>
     <w:tblStylePr w:type="lastCol">
       <w:rPr>
+        <w:rFonts w:ascii="Arial" w:hAnsi="Arial" w:cs="Arial" w:eastAsia="Arial"/>
         <w:b/>
         <w:bCs/>
         <w:color w:val="FFFFFF" w:themeColor="background1"/>
@@ -5493,6 +5788,7 @@
     </w:tblStylePr>
     <w:tblStylePr w:type="nwCell">
       <w:rPr>
+        <w:rFonts w:ascii="Arial" w:hAnsi="Arial" w:cs="Arial" w:eastAsia="Arial"/>
         <w:color w:val="FFFFFF" w:themeColor="background1"/>
       </w:rPr>
       <w:tblPr/>
@@ -5514,7 +5810,7 @@
     <w:uiPriority w:val="64"/>
     <w:rsid w:val="00CB0664"/>
     <w:pPr>
-      <w:spacing w:after="0" w:line="240" w:lineRule="auto"/>
+      <w:spacing w:after="0" w:line="480" w:lineRule="auto"/>
     </w:pPr>
     <w:tblPr>
       <w:tblStyleRowBandSize w:val="1"/>
@@ -5536,6 +5832,7 @@
         <w:spacing w:before="0" w:after="0" w:line="240" w:lineRule="auto"/>
       </w:pPr>
       <w:rPr>
+        <w:rFonts w:ascii="Arial" w:hAnsi="Arial" w:cs="Arial" w:eastAsia="Arial"/>
         <w:b/>
         <w:bCs/>
         <w:color w:val="FFFFFF" w:themeColor="background1"/>
@@ -5558,6 +5855,7 @@
         <w:spacing w:before="0" w:after="0" w:line="240" w:lineRule="auto"/>
       </w:pPr>
       <w:rPr>
+        <w:rFonts w:ascii="Arial" w:hAnsi="Arial" w:cs="Arial" w:eastAsia="Arial"/>
         <w:color w:val="auto"/>
       </w:rPr>
       <w:tblPr/>
@@ -5575,6 +5873,7 @@
     </w:tblStylePr>
     <w:tblStylePr w:type="firstCol">
       <w:rPr>
+        <w:rFonts w:ascii="Arial" w:hAnsi="Arial" w:cs="Arial" w:eastAsia="Arial"/>
         <w:b/>
         <w:bCs/>
         <w:color w:val="FFFFFF" w:themeColor="background1"/>
@@ -5594,6 +5893,7 @@
     </w:tblStylePr>
     <w:tblStylePr w:type="lastCol">
       <w:rPr>
+        <w:rFonts w:ascii="Arial" w:hAnsi="Arial" w:cs="Arial" w:eastAsia="Arial"/>
         <w:b/>
         <w:bCs/>
         <w:color w:val="FFFFFF" w:themeColor="background1"/>
@@ -5642,6 +5942,7 @@
     </w:tblStylePr>
     <w:tblStylePr w:type="nwCell">
       <w:rPr>
+        <w:rFonts w:ascii="Arial" w:hAnsi="Arial" w:cs="Arial" w:eastAsia="Arial"/>
         <w:color w:val="FFFFFF" w:themeColor="background1"/>
       </w:rPr>
       <w:tblPr/>
@@ -5663,9 +5964,10 @@
     <w:uiPriority w:val="65"/>
     <w:rsid w:val="00CB0664"/>
     <w:pPr>
-      <w:spacing w:after="0" w:line="240" w:lineRule="auto"/>
+      <w:spacing w:after="0" w:line="480" w:lineRule="auto"/>
     </w:pPr>
     <w:rPr>
+      <w:rFonts w:ascii="Arial" w:hAnsi="Arial" w:cs="Arial" w:eastAsia="Arial"/>
       <w:color w:val="000000" w:themeColor="text1"/>
     </w:rPr>
     <w:tblPr>
@@ -5685,7 +5987,7 @@
     </w:tblPr>
     <w:tblStylePr w:type="firstRow">
       <w:rPr>
-        <w:rFonts w:asciiTheme="majorHAnsi" w:eastAsiaTheme="majorEastAsia" w:hAnsiTheme="majorHAnsi" w:cstheme="majorBidi"/>
+        <w:rFonts w:ascii="Arial" w:hAnsi="Arial" w:cs="Arial" w:eastAsia="Arial"/>
       </w:rPr>
       <w:tblPr/>
       <w:tcPr>
@@ -5697,6 +5999,7 @@
     </w:tblStylePr>
     <w:tblStylePr w:type="lastRow">
       <w:rPr>
+        <w:rFonts w:ascii="Arial" w:hAnsi="Arial" w:cs="Arial" w:eastAsia="Arial"/>
         <w:b/>
         <w:bCs/>
         <w:color w:val="1F497D" w:themeColor="text2"/>
@@ -5711,12 +6014,14 @@
     </w:tblStylePr>
     <w:tblStylePr w:type="firstCol">
       <w:rPr>
+        <w:rFonts w:ascii="Arial" w:hAnsi="Arial" w:cs="Arial" w:eastAsia="Arial"/>
         <w:b/>
         <w:bCs/>
       </w:rPr>
     </w:tblStylePr>
     <w:tblStylePr w:type="lastCol">
       <w:rPr>
+        <w:rFonts w:ascii="Arial" w:hAnsi="Arial" w:cs="Arial" w:eastAsia="Arial"/>
         <w:b/>
         <w:bCs/>
       </w:rPr>
@@ -5747,9 +6052,10 @@
     <w:uiPriority w:val="65"/>
     <w:rsid w:val="00CB0664"/>
     <w:pPr>
-      <w:spacing w:after="0" w:line="240" w:lineRule="auto"/>
+      <w:spacing w:after="0" w:line="480" w:lineRule="auto"/>
     </w:pPr>
     <w:rPr>
+      <w:rFonts w:ascii="Arial" w:hAnsi="Arial" w:cs="Arial" w:eastAsia="Arial"/>
       <w:color w:val="000000" w:themeColor="text1"/>
     </w:rPr>
     <w:tblPr>
@@ -5769,7 +6075,7 @@
     </w:tblPr>
     <w:tblStylePr w:type="firstRow">
       <w:rPr>
-        <w:rFonts w:asciiTheme="majorHAnsi" w:eastAsiaTheme="majorEastAsia" w:hAnsiTheme="majorHAnsi" w:cstheme="majorBidi"/>
+        <w:rFonts w:ascii="Arial" w:hAnsi="Arial" w:cs="Arial" w:eastAsia="Arial"/>
       </w:rPr>
       <w:tblPr/>
       <w:tcPr>
@@ -5781,6 +6087,7 @@
     </w:tblStylePr>
     <w:tblStylePr w:type="lastRow">
       <w:rPr>
+        <w:rFonts w:ascii="Arial" w:hAnsi="Arial" w:cs="Arial" w:eastAsia="Arial"/>
         <w:b/>
         <w:bCs/>
         <w:color w:val="1F497D" w:themeColor="text2"/>
@@ -5795,12 +6102,14 @@
     </w:tblStylePr>
     <w:tblStylePr w:type="firstCol">
       <w:rPr>
+        <w:rFonts w:ascii="Arial" w:hAnsi="Arial" w:cs="Arial" w:eastAsia="Arial"/>
         <w:b/>
         <w:bCs/>
       </w:rPr>
     </w:tblStylePr>
     <w:tblStylePr w:type="lastCol">
       <w:rPr>
+        <w:rFonts w:ascii="Arial" w:hAnsi="Arial" w:cs="Arial" w:eastAsia="Arial"/>
         <w:b/>
         <w:bCs/>
       </w:rPr>
@@ -5831,9 +6140,10 @@
     <w:uiPriority w:val="65"/>
     <w:rsid w:val="00CB0664"/>
     <w:pPr>
-      <w:spacing w:after="0" w:line="240" w:lineRule="auto"/>
+      <w:spacing w:after="0" w:line="480" w:lineRule="auto"/>
     </w:pPr>
     <w:rPr>
+      <w:rFonts w:ascii="Arial" w:hAnsi="Arial" w:cs="Arial" w:eastAsia="Arial"/>
       <w:color w:val="000000" w:themeColor="text1"/>
     </w:rPr>
     <w:tblPr>
@@ -5853,7 +6163,7 @@
     </w:tblPr>
     <w:tblStylePr w:type="firstRow">
       <w:rPr>
-        <w:rFonts w:asciiTheme="majorHAnsi" w:eastAsiaTheme="majorEastAsia" w:hAnsiTheme="majorHAnsi" w:cstheme="majorBidi"/>
+        <w:rFonts w:ascii="Arial" w:hAnsi="Arial" w:cs="Arial" w:eastAsia="Arial"/>
       </w:rPr>
       <w:tblPr/>
       <w:tcPr>
@@ -5865,6 +6175,7 @@
     </w:tblStylePr>
     <w:tblStylePr w:type="lastRow">
       <w:rPr>
+        <w:rFonts w:ascii="Arial" w:hAnsi="Arial" w:cs="Arial" w:eastAsia="Arial"/>
         <w:b/>
         <w:bCs/>
         <w:color w:val="1F497D" w:themeColor="text2"/>
@@ -5879,12 +6190,14 @@
     </w:tblStylePr>
     <w:tblStylePr w:type="firstCol">
       <w:rPr>
+        <w:rFonts w:ascii="Arial" w:hAnsi="Arial" w:cs="Arial" w:eastAsia="Arial"/>
         <w:b/>
         <w:bCs/>
       </w:rPr>
     </w:tblStylePr>
     <w:tblStylePr w:type="lastCol">
       <w:rPr>
+        <w:rFonts w:ascii="Arial" w:hAnsi="Arial" w:cs="Arial" w:eastAsia="Arial"/>
         <w:b/>
         <w:bCs/>
       </w:rPr>
@@ -5915,9 +6228,10 @@
     <w:uiPriority w:val="65"/>
     <w:rsid w:val="00CB0664"/>
     <w:pPr>
-      <w:spacing w:after="0" w:line="240" w:lineRule="auto"/>
+      <w:spacing w:after="0" w:line="480" w:lineRule="auto"/>
     </w:pPr>
     <w:rPr>
+      <w:rFonts w:ascii="Arial" w:hAnsi="Arial" w:cs="Arial" w:eastAsia="Arial"/>
       <w:color w:val="000000" w:themeColor="text1"/>
     </w:rPr>
     <w:tblPr>
@@ -5937,7 +6251,7 @@
     </w:tblPr>
     <w:tblStylePr w:type="firstRow">
       <w:rPr>
-        <w:rFonts w:asciiTheme="majorHAnsi" w:eastAsiaTheme="majorEastAsia" w:hAnsiTheme="majorHAnsi" w:cstheme="majorBidi"/>
+        <w:rFonts w:ascii="Arial" w:hAnsi="Arial" w:cs="Arial" w:eastAsia="Arial"/>
       </w:rPr>
       <w:tblPr/>
       <w:tcPr>
@@ -5949,6 +6263,7 @@
     </w:tblStylePr>
     <w:tblStylePr w:type="lastRow">
       <w:rPr>
+        <w:rFonts w:ascii="Arial" w:hAnsi="Arial" w:cs="Arial" w:eastAsia="Arial"/>
         <w:b/>
         <w:bCs/>
         <w:color w:val="1F497D" w:themeColor="text2"/>
@@ -5963,12 +6278,14 @@
     </w:tblStylePr>
     <w:tblStylePr w:type="firstCol">
       <w:rPr>
+        <w:rFonts w:ascii="Arial" w:hAnsi="Arial" w:cs="Arial" w:eastAsia="Arial"/>
         <w:b/>
         <w:bCs/>
       </w:rPr>
     </w:tblStylePr>
     <w:tblStylePr w:type="lastCol">
       <w:rPr>
+        <w:rFonts w:ascii="Arial" w:hAnsi="Arial" w:cs="Arial" w:eastAsia="Arial"/>
         <w:b/>
         <w:bCs/>
       </w:rPr>
@@ -5999,9 +6316,10 @@
     <w:uiPriority w:val="65"/>
     <w:rsid w:val="00CB0664"/>
     <w:pPr>
-      <w:spacing w:after="0" w:line="240" w:lineRule="auto"/>
+      <w:spacing w:after="0" w:line="480" w:lineRule="auto"/>
     </w:pPr>
     <w:rPr>
+      <w:rFonts w:ascii="Arial" w:hAnsi="Arial" w:cs="Arial" w:eastAsia="Arial"/>
       <w:color w:val="000000" w:themeColor="text1"/>
     </w:rPr>
     <w:tblPr>
@@ -6021,7 +6339,7 @@
     </w:tblPr>
     <w:tblStylePr w:type="firstRow">
       <w:rPr>
-        <w:rFonts w:asciiTheme="majorHAnsi" w:eastAsiaTheme="majorEastAsia" w:hAnsiTheme="majorHAnsi" w:cstheme="majorBidi"/>
+        <w:rFonts w:ascii="Arial" w:hAnsi="Arial" w:cs="Arial" w:eastAsia="Arial"/>
       </w:rPr>
       <w:tblPr/>
       <w:tcPr>
@@ -6033,6 +6351,7 @@
     </w:tblStylePr>
     <w:tblStylePr w:type="lastRow">
       <w:rPr>
+        <w:rFonts w:ascii="Arial" w:hAnsi="Arial" w:cs="Arial" w:eastAsia="Arial"/>
         <w:b/>
         <w:bCs/>
         <w:color w:val="1F497D" w:themeColor="text2"/>
@@ -6047,12 +6366,14 @@
     </w:tblStylePr>
     <w:tblStylePr w:type="firstCol">
       <w:rPr>
+        <w:rFonts w:ascii="Arial" w:hAnsi="Arial" w:cs="Arial" w:eastAsia="Arial"/>
         <w:b/>
         <w:bCs/>
       </w:rPr>
     </w:tblStylePr>
     <w:tblStylePr w:type="lastCol">
       <w:rPr>
+        <w:rFonts w:ascii="Arial" w:hAnsi="Arial" w:cs="Arial" w:eastAsia="Arial"/>
         <w:b/>
         <w:bCs/>
       </w:rPr>
@@ -6083,9 +6404,10 @@
     <w:uiPriority w:val="65"/>
     <w:rsid w:val="00CB0664"/>
     <w:pPr>
-      <w:spacing w:after="0" w:line="240" w:lineRule="auto"/>
+      <w:spacing w:after="0" w:line="480" w:lineRule="auto"/>
     </w:pPr>
     <w:rPr>
+      <w:rFonts w:ascii="Arial" w:hAnsi="Arial" w:cs="Arial" w:eastAsia="Arial"/>
       <w:color w:val="000000" w:themeColor="text1"/>
     </w:rPr>
     <w:tblPr>
@@ -6105,7 +6427,7 @@
     </w:tblPr>
     <w:tblStylePr w:type="firstRow">
       <w:rPr>
-        <w:rFonts w:asciiTheme="majorHAnsi" w:eastAsiaTheme="majorEastAsia" w:hAnsiTheme="majorHAnsi" w:cstheme="majorBidi"/>
+        <w:rFonts w:ascii="Arial" w:hAnsi="Arial" w:cs="Arial" w:eastAsia="Arial"/>
       </w:rPr>
       <w:tblPr/>
       <w:tcPr>
@@ -6117,6 +6439,7 @@
     </w:tblStylePr>
     <w:tblStylePr w:type="lastRow">
       <w:rPr>
+        <w:rFonts w:ascii="Arial" w:hAnsi="Arial" w:cs="Arial" w:eastAsia="Arial"/>
         <w:b/>
         <w:bCs/>
         <w:color w:val="1F497D" w:themeColor="text2"/>
@@ -6131,12 +6454,14 @@
     </w:tblStylePr>
     <w:tblStylePr w:type="firstCol">
       <w:rPr>
+        <w:rFonts w:ascii="Arial" w:hAnsi="Arial" w:cs="Arial" w:eastAsia="Arial"/>
         <w:b/>
         <w:bCs/>
       </w:rPr>
     </w:tblStylePr>
     <w:tblStylePr w:type="lastCol">
       <w:rPr>
+        <w:rFonts w:ascii="Arial" w:hAnsi="Arial" w:cs="Arial" w:eastAsia="Arial"/>
         <w:b/>
         <w:bCs/>
       </w:rPr>
@@ -6167,9 +6492,10 @@
     <w:uiPriority w:val="65"/>
     <w:rsid w:val="00CB0664"/>
     <w:pPr>
-      <w:spacing w:after="0" w:line="240" w:lineRule="auto"/>
+      <w:spacing w:after="0" w:line="480" w:lineRule="auto"/>
     </w:pPr>
     <w:rPr>
+      <w:rFonts w:ascii="Arial" w:hAnsi="Arial" w:cs="Arial" w:eastAsia="Arial"/>
       <w:color w:val="000000" w:themeColor="text1"/>
     </w:rPr>
     <w:tblPr>
@@ -6189,7 +6515,7 @@
     </w:tblPr>
     <w:tblStylePr w:type="firstRow">
       <w:rPr>
-        <w:rFonts w:asciiTheme="majorHAnsi" w:eastAsiaTheme="majorEastAsia" w:hAnsiTheme="majorHAnsi" w:cstheme="majorBidi"/>
+        <w:rFonts w:ascii="Arial" w:hAnsi="Arial" w:cs="Arial" w:eastAsia="Arial"/>
       </w:rPr>
       <w:tblPr/>
       <w:tcPr>
@@ -6201,6 +6527,7 @@
     </w:tblStylePr>
     <w:tblStylePr w:type="lastRow">
       <w:rPr>
+        <w:rFonts w:ascii="Arial" w:hAnsi="Arial" w:cs="Arial" w:eastAsia="Arial"/>
         <w:b/>
         <w:bCs/>
         <w:color w:val="1F497D" w:themeColor="text2"/>
@@ -6215,12 +6542,14 @@
     </w:tblStylePr>
     <w:tblStylePr w:type="firstCol">
       <w:rPr>
+        <w:rFonts w:ascii="Arial" w:hAnsi="Arial" w:cs="Arial" w:eastAsia="Arial"/>
         <w:b/>
         <w:bCs/>
       </w:rPr>
     </w:tblStylePr>
     <w:tblStylePr w:type="lastCol">
       <w:rPr>
+        <w:rFonts w:ascii="Arial" w:hAnsi="Arial" w:cs="Arial" w:eastAsia="Arial"/>
         <w:b/>
         <w:bCs/>
       </w:rPr>
@@ -6251,10 +6580,10 @@
     <w:uiPriority w:val="66"/>
     <w:rsid w:val="00CB0664"/>
     <w:pPr>
-      <w:spacing w:after="0" w:line="240" w:lineRule="auto"/>
+      <w:spacing w:after="0" w:line="480" w:lineRule="auto"/>
     </w:pPr>
     <w:rPr>
-      <w:rFonts w:asciiTheme="majorHAnsi" w:eastAsiaTheme="majorEastAsia" w:hAnsiTheme="majorHAnsi" w:cstheme="majorBidi"/>
+      <w:rFonts w:ascii="Arial" w:hAnsi="Arial" w:cs="Arial" w:eastAsia="Arial"/>
       <w:color w:val="000000" w:themeColor="text1"/>
     </w:rPr>
     <w:tblPr>
@@ -6276,6 +6605,7 @@
     </w:tblPr>
     <w:tblStylePr w:type="firstRow">
       <w:rPr>
+        <w:rFonts w:ascii="Arial" w:hAnsi="Arial" w:cs="Arial" w:eastAsia="Arial"/>
         <w:sz w:val="24"/>
         <w:szCs w:val="24"/>
       </w:rPr>
@@ -6379,10 +6709,10 @@
     <w:uiPriority w:val="66"/>
     <w:rsid w:val="00CB0664"/>
     <w:pPr>
-      <w:spacing w:after="0" w:line="240" w:lineRule="auto"/>
+      <w:spacing w:after="0" w:line="480" w:lineRule="auto"/>
     </w:pPr>
     <w:rPr>
-      <w:rFonts w:asciiTheme="majorHAnsi" w:eastAsiaTheme="majorEastAsia" w:hAnsiTheme="majorHAnsi" w:cstheme="majorBidi"/>
+      <w:rFonts w:ascii="Arial" w:hAnsi="Arial" w:cs="Arial" w:eastAsia="Arial"/>
       <w:color w:val="000000" w:themeColor="text1"/>
     </w:rPr>
     <w:tblPr>
@@ -6404,6 +6734,7 @@
     </w:tblPr>
     <w:tblStylePr w:type="firstRow">
       <w:rPr>
+        <w:rFonts w:ascii="Arial" w:hAnsi="Arial" w:cs="Arial" w:eastAsia="Arial"/>
         <w:sz w:val="24"/>
         <w:szCs w:val="24"/>
       </w:rPr>
@@ -6507,10 +6838,10 @@
     <w:uiPriority w:val="66"/>
     <w:rsid w:val="00CB0664"/>
     <w:pPr>
-      <w:spacing w:after="0" w:line="240" w:lineRule="auto"/>
+      <w:spacing w:after="0" w:line="480" w:lineRule="auto"/>
     </w:pPr>
     <w:rPr>
-      <w:rFonts w:asciiTheme="majorHAnsi" w:eastAsiaTheme="majorEastAsia" w:hAnsiTheme="majorHAnsi" w:cstheme="majorBidi"/>
+      <w:rFonts w:ascii="Arial" w:hAnsi="Arial" w:cs="Arial" w:eastAsia="Arial"/>
       <w:color w:val="000000" w:themeColor="text1"/>
     </w:rPr>
     <w:tblPr>
@@ -6532,6 +6863,7 @@
     </w:tblPr>
     <w:tblStylePr w:type="firstRow">
       <w:rPr>
+        <w:rFonts w:ascii="Arial" w:hAnsi="Arial" w:cs="Arial" w:eastAsia="Arial"/>
         <w:sz w:val="24"/>
         <w:szCs w:val="24"/>
       </w:rPr>
@@ -6635,10 +6967,10 @@
     <w:uiPriority w:val="66"/>
     <w:rsid w:val="00CB0664"/>
     <w:pPr>
-      <w:spacing w:after="0" w:line="240" w:lineRule="auto"/>
+      <w:spacing w:after="0" w:line="480" w:lineRule="auto"/>
     </w:pPr>
     <w:rPr>
-      <w:rFonts w:asciiTheme="majorHAnsi" w:eastAsiaTheme="majorEastAsia" w:hAnsiTheme="majorHAnsi" w:cstheme="majorBidi"/>
+      <w:rFonts w:ascii="Arial" w:hAnsi="Arial" w:cs="Arial" w:eastAsia="Arial"/>
       <w:color w:val="000000" w:themeColor="text1"/>
     </w:rPr>
     <w:tblPr>
@@ -6660,6 +6992,7 @@
     </w:tblPr>
     <w:tblStylePr w:type="firstRow">
       <w:rPr>
+        <w:rFonts w:ascii="Arial" w:hAnsi="Arial" w:cs="Arial" w:eastAsia="Arial"/>
         <w:sz w:val="24"/>
         <w:szCs w:val="24"/>
       </w:rPr>
@@ -6763,10 +7096,10 @@
     <w:uiPriority w:val="66"/>
     <w:rsid w:val="00CB0664"/>
     <w:pPr>
-      <w:spacing w:after="0" w:line="240" w:lineRule="auto"/>
+      <w:spacing w:after="0" w:line="480" w:lineRule="auto"/>
     </w:pPr>
     <w:rPr>
-      <w:rFonts w:asciiTheme="majorHAnsi" w:eastAsiaTheme="majorEastAsia" w:hAnsiTheme="majorHAnsi" w:cstheme="majorBidi"/>
+      <w:rFonts w:ascii="Arial" w:hAnsi="Arial" w:cs="Arial" w:eastAsia="Arial"/>
       <w:color w:val="000000" w:themeColor="text1"/>
     </w:rPr>
     <w:tblPr>
@@ -6788,6 +7121,7 @@
     </w:tblPr>
     <w:tblStylePr w:type="firstRow">
       <w:rPr>
+        <w:rFonts w:ascii="Arial" w:hAnsi="Arial" w:cs="Arial" w:eastAsia="Arial"/>
         <w:sz w:val="24"/>
         <w:szCs w:val="24"/>
       </w:rPr>
@@ -6891,10 +7225,10 @@
     <w:uiPriority w:val="66"/>
     <w:rsid w:val="00CB0664"/>
     <w:pPr>
-      <w:spacing w:after="0" w:line="240" w:lineRule="auto"/>
+      <w:spacing w:after="0" w:line="480" w:lineRule="auto"/>
     </w:pPr>
     <w:rPr>
-      <w:rFonts w:asciiTheme="majorHAnsi" w:eastAsiaTheme="majorEastAsia" w:hAnsiTheme="majorHAnsi" w:cstheme="majorBidi"/>
+      <w:rFonts w:ascii="Arial" w:hAnsi="Arial" w:cs="Arial" w:eastAsia="Arial"/>
       <w:color w:val="000000" w:themeColor="text1"/>
     </w:rPr>
     <w:tblPr>
@@ -6916,6 +7250,7 @@
     </w:tblPr>
     <w:tblStylePr w:type="firstRow">
       <w:rPr>
+        <w:rFonts w:ascii="Arial" w:hAnsi="Arial" w:cs="Arial" w:eastAsia="Arial"/>
         <w:sz w:val="24"/>
         <w:szCs w:val="24"/>
       </w:rPr>
@@ -7019,10 +7354,10 @@
     <w:uiPriority w:val="66"/>
     <w:rsid w:val="00CB0664"/>
     <w:pPr>
-      <w:spacing w:after="0" w:line="240" w:lineRule="auto"/>
+      <w:spacing w:after="0" w:line="480" w:lineRule="auto"/>
     </w:pPr>
     <w:rPr>
-      <w:rFonts w:asciiTheme="majorHAnsi" w:eastAsiaTheme="majorEastAsia" w:hAnsiTheme="majorHAnsi" w:cstheme="majorBidi"/>
+      <w:rFonts w:ascii="Arial" w:hAnsi="Arial" w:cs="Arial" w:eastAsia="Arial"/>
       <w:color w:val="000000" w:themeColor="text1"/>
     </w:rPr>
     <w:tblPr>
@@ -7044,6 +7379,7 @@
     </w:tblPr>
     <w:tblStylePr w:type="firstRow">
       <w:rPr>
+        <w:rFonts w:ascii="Arial" w:hAnsi="Arial" w:cs="Arial" w:eastAsia="Arial"/>
         <w:sz w:val="24"/>
         <w:szCs w:val="24"/>
       </w:rPr>
@@ -7147,7 +7483,7 @@
     <w:uiPriority w:val="67"/>
     <w:rsid w:val="00CB0664"/>
     <w:pPr>
-      <w:spacing w:after="0" w:line="240" w:lineRule="auto"/>
+      <w:spacing w:after="0" w:line="480" w:lineRule="auto"/>
     </w:pPr>
     <w:tblPr>
       <w:tblStyleRowBandSize w:val="1"/>
@@ -7173,12 +7509,14 @@
     </w:tcPr>
     <w:tblStylePr w:type="firstRow">
       <w:rPr>
+        <w:rFonts w:ascii="Arial" w:hAnsi="Arial" w:cs="Arial" w:eastAsia="Arial"/>
         <w:b/>
         <w:bCs/>
       </w:rPr>
     </w:tblStylePr>
     <w:tblStylePr w:type="lastRow">
       <w:rPr>
+        <w:rFonts w:ascii="Arial" w:hAnsi="Arial" w:cs="Arial" w:eastAsia="Arial"/>
         <w:b/>
         <w:bCs/>
       </w:rPr>
@@ -7191,12 +7529,14 @@
     </w:tblStylePr>
     <w:tblStylePr w:type="firstCol">
       <w:rPr>
+        <w:rFonts w:ascii="Arial" w:hAnsi="Arial" w:cs="Arial" w:eastAsia="Arial"/>
         <w:b/>
         <w:bCs/>
       </w:rPr>
     </w:tblStylePr>
     <w:tblStylePr w:type="lastCol">
       <w:rPr>
+        <w:rFonts w:ascii="Arial" w:hAnsi="Arial" w:cs="Arial" w:eastAsia="Arial"/>
         <w:b/>
         <w:bCs/>
       </w:rPr>
@@ -7220,7 +7560,7 @@
     <w:uiPriority w:val="67"/>
     <w:rsid w:val="00CB0664"/>
     <w:pPr>
-      <w:spacing w:after="0" w:line="240" w:lineRule="auto"/>
+      <w:spacing w:after="0" w:line="480" w:lineRule="auto"/>
     </w:pPr>
     <w:tblPr>
       <w:tblStyleRowBandSize w:val="1"/>
@@ -7246,12 +7586,14 @@
     </w:tcPr>
     <w:tblStylePr w:type="firstRow">
       <w:rPr>
+        <w:rFonts w:ascii="Arial" w:hAnsi="Arial" w:cs="Arial" w:eastAsia="Arial"/>
         <w:b/>
         <w:bCs/>
       </w:rPr>
     </w:tblStylePr>
     <w:tblStylePr w:type="lastRow">
       <w:rPr>
+        <w:rFonts w:ascii="Arial" w:hAnsi="Arial" w:cs="Arial" w:eastAsia="Arial"/>
         <w:b/>
         <w:bCs/>
       </w:rPr>
@@ -7264,12 +7606,14 @@
     </w:tblStylePr>
     <w:tblStylePr w:type="firstCol">
       <w:rPr>
+        <w:rFonts w:ascii="Arial" w:hAnsi="Arial" w:cs="Arial" w:eastAsia="Arial"/>
         <w:b/>
         <w:bCs/>
       </w:rPr>
     </w:tblStylePr>
     <w:tblStylePr w:type="lastCol">
       <w:rPr>
+        <w:rFonts w:ascii="Arial" w:hAnsi="Arial" w:cs="Arial" w:eastAsia="Arial"/>
         <w:b/>
         <w:bCs/>
       </w:rPr>
@@ -7293,7 +7637,7 @@
     <w:uiPriority w:val="67"/>
     <w:rsid w:val="00CB0664"/>
     <w:pPr>
-      <w:spacing w:after="0" w:line="240" w:lineRule="auto"/>
+      <w:spacing w:after="0" w:line="480" w:lineRule="auto"/>
     </w:pPr>
     <w:tblPr>
       <w:tblStyleRowBandSize w:val="1"/>
@@ -7319,12 +7663,14 @@
     </w:tcPr>
     <w:tblStylePr w:type="firstRow">
       <w:rPr>
+        <w:rFonts w:ascii="Arial" w:hAnsi="Arial" w:cs="Arial" w:eastAsia="Arial"/>
         <w:b/>
         <w:bCs/>
       </w:rPr>
     </w:tblStylePr>
     <w:tblStylePr w:type="lastRow">
       <w:rPr>
+        <w:rFonts w:ascii="Arial" w:hAnsi="Arial" w:cs="Arial" w:eastAsia="Arial"/>
         <w:b/>
         <w:bCs/>
       </w:rPr>
@@ -7337,12 +7683,14 @@
     </w:tblStylePr>
     <w:tblStylePr w:type="firstCol">
       <w:rPr>
+        <w:rFonts w:ascii="Arial" w:hAnsi="Arial" w:cs="Arial" w:eastAsia="Arial"/>
         <w:b/>
         <w:bCs/>
       </w:rPr>
     </w:tblStylePr>
     <w:tblStylePr w:type="lastCol">
       <w:rPr>
+        <w:rFonts w:ascii="Arial" w:hAnsi="Arial" w:cs="Arial" w:eastAsia="Arial"/>
         <w:b/>
         <w:bCs/>
       </w:rPr>
@@ -7366,7 +7714,7 @@
     <w:uiPriority w:val="67"/>
     <w:rsid w:val="00CB0664"/>
     <w:pPr>
-      <w:spacing w:after="0" w:line="240" w:lineRule="auto"/>
+      <w:spacing w:after="0" w:line="480" w:lineRule="auto"/>
     </w:pPr>
     <w:tblPr>
       <w:tblStyleRowBandSize w:val="1"/>
@@ -7392,12 +7740,14 @@
     </w:tcPr>
     <w:tblStylePr w:type="firstRow">
       <w:rPr>
+        <w:rFonts w:ascii="Arial" w:hAnsi="Arial" w:cs="Arial" w:eastAsia="Arial"/>
         <w:b/>
         <w:bCs/>
       </w:rPr>
     </w:tblStylePr>
     <w:tblStylePr w:type="lastRow">
       <w:rPr>
+        <w:rFonts w:ascii="Arial" w:hAnsi="Arial" w:cs="Arial" w:eastAsia="Arial"/>
         <w:b/>
         <w:bCs/>
       </w:rPr>
@@ -7410,12 +7760,14 @@
     </w:tblStylePr>
     <w:tblStylePr w:type="firstCol">
       <w:rPr>
+        <w:rFonts w:ascii="Arial" w:hAnsi="Arial" w:cs="Arial" w:eastAsia="Arial"/>
         <w:b/>
         <w:bCs/>
       </w:rPr>
     </w:tblStylePr>
     <w:tblStylePr w:type="lastCol">
       <w:rPr>
+        <w:rFonts w:ascii="Arial" w:hAnsi="Arial" w:cs="Arial" w:eastAsia="Arial"/>
         <w:b/>
         <w:bCs/>
       </w:rPr>
@@ -7439,7 +7791,7 @@
     <w:uiPriority w:val="67"/>
     <w:rsid w:val="00CB0664"/>
     <w:pPr>
-      <w:spacing w:after="0" w:line="240" w:lineRule="auto"/>
+      <w:spacing w:after="0" w:line="480" w:lineRule="auto"/>
     </w:pPr>
     <w:tblPr>
       <w:tblStyleRowBandSize w:val="1"/>
@@ -7465,12 +7817,14 @@
     </w:tcPr>
     <w:tblStylePr w:type="firstRow">
       <w:rPr>
+        <w:rFonts w:ascii="Arial" w:hAnsi="Arial" w:cs="Arial" w:eastAsia="Arial"/>
         <w:b/>
         <w:bCs/>
       </w:rPr>
     </w:tblStylePr>
     <w:tblStylePr w:type="lastRow">
       <w:rPr>
+        <w:rFonts w:ascii="Arial" w:hAnsi="Arial" w:cs="Arial" w:eastAsia="Arial"/>
         <w:b/>
         <w:bCs/>
       </w:rPr>
@@ -7483,12 +7837,14 @@
     </w:tblStylePr>
     <w:tblStylePr w:type="firstCol">
       <w:rPr>
+        <w:rFonts w:ascii="Arial" w:hAnsi="Arial" w:cs="Arial" w:eastAsia="Arial"/>
         <w:b/>
         <w:bCs/>
       </w:rPr>
     </w:tblStylePr>
     <w:tblStylePr w:type="lastCol">
       <w:rPr>
+        <w:rFonts w:ascii="Arial" w:hAnsi="Arial" w:cs="Arial" w:eastAsia="Arial"/>
         <w:b/>
         <w:bCs/>
       </w:rPr>
@@ -7512,7 +7868,7 @@
     <w:uiPriority w:val="67"/>
     <w:rsid w:val="00CB0664"/>
     <w:pPr>
-      <w:spacing w:after="0" w:line="240" w:lineRule="auto"/>
+      <w:spacing w:after="0" w:line="480" w:lineRule="auto"/>
     </w:pPr>
     <w:tblPr>
       <w:tblStyleRowBandSize w:val="1"/>
@@ -7538,12 +7894,14 @@
     </w:tcPr>
     <w:tblStylePr w:type="firstRow">
       <w:rPr>
+        <w:rFonts w:ascii="Arial" w:hAnsi="Arial" w:cs="Arial" w:eastAsia="Arial"/>
         <w:b/>
         <w:bCs/>
       </w:rPr>
     </w:tblStylePr>
     <w:tblStylePr w:type="lastRow">
       <w:rPr>
+        <w:rFonts w:ascii="Arial" w:hAnsi="Arial" w:cs="Arial" w:eastAsia="Arial"/>
         <w:b/>
         <w:bCs/>
       </w:rPr>
@@ -7556,12 +7914,14 @@
     </w:tblStylePr>
     <w:tblStylePr w:type="firstCol">
       <w:rPr>
+        <w:rFonts w:ascii="Arial" w:hAnsi="Arial" w:cs="Arial" w:eastAsia="Arial"/>
         <w:b/>
         <w:bCs/>
       </w:rPr>
     </w:tblStylePr>
     <w:tblStylePr w:type="lastCol">
       <w:rPr>
+        <w:rFonts w:ascii="Arial" w:hAnsi="Arial" w:cs="Arial" w:eastAsia="Arial"/>
         <w:b/>
         <w:bCs/>
       </w:rPr>
@@ -7585,7 +7945,7 @@
     <w:uiPriority w:val="67"/>
     <w:rsid w:val="00CB0664"/>
     <w:pPr>
-      <w:spacing w:after="0" w:line="240" w:lineRule="auto"/>
+      <w:spacing w:after="0" w:line="480" w:lineRule="auto"/>
     </w:pPr>
     <w:tblPr>
       <w:tblStyleRowBandSize w:val="1"/>
@@ -7611,12 +7971,14 @@
     </w:tcPr>
     <w:tblStylePr w:type="firstRow">
       <w:rPr>
+        <w:rFonts w:ascii="Arial" w:hAnsi="Arial" w:cs="Arial" w:eastAsia="Arial"/>
         <w:b/>
         <w:bCs/>
       </w:rPr>
     </w:tblStylePr>
     <w:tblStylePr w:type="lastRow">
       <w:rPr>
+        <w:rFonts w:ascii="Arial" w:hAnsi="Arial" w:cs="Arial" w:eastAsia="Arial"/>
         <w:b/>
         <w:bCs/>
       </w:rPr>
@@ -7629,12 +7991,14 @@
     </w:tblStylePr>
     <w:tblStylePr w:type="firstCol">
       <w:rPr>
+        <w:rFonts w:ascii="Arial" w:hAnsi="Arial" w:cs="Arial" w:eastAsia="Arial"/>
         <w:b/>
         <w:bCs/>
       </w:rPr>
     </w:tblStylePr>
     <w:tblStylePr w:type="lastCol">
       <w:rPr>
+        <w:rFonts w:ascii="Arial" w:hAnsi="Arial" w:cs="Arial" w:eastAsia="Arial"/>
         <w:b/>
         <w:bCs/>
       </w:rPr>
@@ -7658,10 +8022,10 @@
     <w:uiPriority w:val="68"/>
     <w:rsid w:val="00CB0664"/>
     <w:pPr>
-      <w:spacing w:after="0" w:line="240" w:lineRule="auto"/>
+      <w:spacing w:after="0" w:line="480" w:lineRule="auto"/>
     </w:pPr>
     <w:rPr>
-      <w:rFonts w:asciiTheme="majorHAnsi" w:eastAsiaTheme="majorEastAsia" w:hAnsiTheme="majorHAnsi" w:cstheme="majorBidi"/>
+      <w:rFonts w:ascii="Arial" w:hAnsi="Arial" w:cs="Arial" w:eastAsia="Arial"/>
       <w:color w:val="000000" w:themeColor="text1"/>
     </w:rPr>
     <w:tblPr>
@@ -7688,6 +8052,7 @@
     </w:tcPr>
     <w:tblStylePr w:type="firstRow">
       <w:rPr>
+        <w:rFonts w:ascii="Arial" w:hAnsi="Arial" w:cs="Arial" w:eastAsia="Arial"/>
         <w:b/>
         <w:bCs/>
         <w:color w:val="000000" w:themeColor="text1"/>
@@ -7699,6 +8064,7 @@
     </w:tblStylePr>
     <w:tblStylePr w:type="lastRow">
       <w:rPr>
+        <w:rFonts w:ascii="Arial" w:hAnsi="Arial" w:cs="Arial" w:eastAsia="Arial"/>
         <w:b/>
         <w:bCs/>
         <w:color w:val="000000" w:themeColor="text1"/>
@@ -7718,6 +8084,7 @@
     </w:tblStylePr>
     <w:tblStylePr w:type="firstCol">
       <w:rPr>
+        <w:rFonts w:ascii="Arial" w:hAnsi="Arial" w:cs="Arial" w:eastAsia="Arial"/>
         <w:b/>
         <w:bCs/>
         <w:color w:val="000000" w:themeColor="text1"/>
@@ -7737,6 +8104,7 @@
     </w:tblStylePr>
     <w:tblStylePr w:type="lastCol">
       <w:rPr>
+        <w:rFonts w:ascii="Arial" w:hAnsi="Arial" w:cs="Arial" w:eastAsia="Arial"/>
         <w:b w:val="0"/>
         <w:bCs w:val="0"/>
         <w:color w:val="000000" w:themeColor="text1"/>
@@ -7783,10 +8151,10 @@
     <w:uiPriority w:val="68"/>
     <w:rsid w:val="00CB0664"/>
     <w:pPr>
-      <w:spacing w:after="0" w:line="240" w:lineRule="auto"/>
+      <w:spacing w:after="0" w:line="480" w:lineRule="auto"/>
     </w:pPr>
     <w:rPr>
-      <w:rFonts w:asciiTheme="majorHAnsi" w:eastAsiaTheme="majorEastAsia" w:hAnsiTheme="majorHAnsi" w:cstheme="majorBidi"/>
+      <w:rFonts w:ascii="Arial" w:hAnsi="Arial" w:cs="Arial" w:eastAsia="Arial"/>
       <w:color w:val="000000" w:themeColor="text1"/>
     </w:rPr>
     <w:tblPr>
@@ -7813,6 +8181,7 @@
     </w:tcPr>
     <w:tblStylePr w:type="firstRow">
       <w:rPr>
+        <w:rFonts w:ascii="Arial" w:hAnsi="Arial" w:cs="Arial" w:eastAsia="Arial"/>
         <w:b/>
         <w:bCs/>
         <w:color w:val="000000" w:themeColor="text1"/>
@@ -7824,6 +8193,7 @@
     </w:tblStylePr>
     <w:tblStylePr w:type="lastRow">
       <w:rPr>
+        <w:rFonts w:ascii="Arial" w:hAnsi="Arial" w:cs="Arial" w:eastAsia="Arial"/>
         <w:b/>
         <w:bCs/>
         <w:color w:val="000000" w:themeColor="text1"/>
@@ -7843,6 +8213,7 @@
     </w:tblStylePr>
     <w:tblStylePr w:type="firstCol">
       <w:rPr>
+        <w:rFonts w:ascii="Arial" w:hAnsi="Arial" w:cs="Arial" w:eastAsia="Arial"/>
         <w:b/>
         <w:bCs/>
         <w:color w:val="000000" w:themeColor="text1"/>
@@ -7862,6 +8233,7 @@
     </w:tblStylePr>
     <w:tblStylePr w:type="lastCol">
       <w:rPr>
+        <w:rFonts w:ascii="Arial" w:hAnsi="Arial" w:cs="Arial" w:eastAsia="Arial"/>
         <w:b w:val="0"/>
         <w:bCs w:val="0"/>
         <w:color w:val="000000" w:themeColor="text1"/>
@@ -7908,10 +8280,10 @@
     <w:uiPriority w:val="68"/>
     <w:rsid w:val="00CB0664"/>
     <w:pPr>
-      <w:spacing w:after="0" w:line="240" w:lineRule="auto"/>
+      <w:spacing w:after="0" w:line="480" w:lineRule="auto"/>
     </w:pPr>
     <w:rPr>
-      <w:rFonts w:asciiTheme="majorHAnsi" w:eastAsiaTheme="majorEastAsia" w:hAnsiTheme="majorHAnsi" w:cstheme="majorBidi"/>
+      <w:rFonts w:ascii="Arial" w:hAnsi="Arial" w:cs="Arial" w:eastAsia="Arial"/>
       <w:color w:val="000000" w:themeColor="text1"/>
     </w:rPr>
     <w:tblPr>
@@ -7938,6 +8310,7 @@
     </w:tcPr>
     <w:tblStylePr w:type="firstRow">
       <w:rPr>
+        <w:rFonts w:ascii="Arial" w:hAnsi="Arial" w:cs="Arial" w:eastAsia="Arial"/>
         <w:b/>
         <w:bCs/>
         <w:color w:val="000000" w:themeColor="text1"/>
@@ -7949,6 +8322,7 @@
     </w:tblStylePr>
     <w:tblStylePr w:type="lastRow">
       <w:rPr>
+        <w:rFonts w:ascii="Arial" w:hAnsi="Arial" w:cs="Arial" w:eastAsia="Arial"/>
         <w:b/>
         <w:bCs/>
         <w:color w:val="000000" w:themeColor="text1"/>
@@ -7968,6 +8342,7 @@
     </w:tblStylePr>
     <w:tblStylePr w:type="firstCol">
       <w:rPr>
+        <w:rFonts w:ascii="Arial" w:hAnsi="Arial" w:cs="Arial" w:eastAsia="Arial"/>
         <w:b/>
         <w:bCs/>
         <w:color w:val="000000" w:themeColor="text1"/>
@@ -7987,6 +8362,7 @@
     </w:tblStylePr>
     <w:tblStylePr w:type="lastCol">
       <w:rPr>
+        <w:rFonts w:ascii="Arial" w:hAnsi="Arial" w:cs="Arial" w:eastAsia="Arial"/>
         <w:b w:val="0"/>
         <w:bCs w:val="0"/>
         <w:color w:val="000000" w:themeColor="text1"/>
@@ -8033,10 +8409,10 @@
     <w:uiPriority w:val="68"/>
     <w:rsid w:val="00CB0664"/>
     <w:pPr>
-      <w:spacing w:after="0" w:line="240" w:lineRule="auto"/>
+      <w:spacing w:after="0" w:line="480" w:lineRule="auto"/>
     </w:pPr>
     <w:rPr>
-      <w:rFonts w:asciiTheme="majorHAnsi" w:eastAsiaTheme="majorEastAsia" w:hAnsiTheme="majorHAnsi" w:cstheme="majorBidi"/>
+      <w:rFonts w:ascii="Arial" w:hAnsi="Arial" w:cs="Arial" w:eastAsia="Arial"/>
       <w:color w:val="000000" w:themeColor="text1"/>
     </w:rPr>
     <w:tblPr>
@@ -8063,6 +8439,7 @@
     </w:tcPr>
     <w:tblStylePr w:type="firstRow">
       <w:rPr>
+        <w:rFonts w:ascii="Arial" w:hAnsi="Arial" w:cs="Arial" w:eastAsia="Arial"/>
         <w:b/>
         <w:bCs/>
         <w:color w:val="000000" w:themeColor="text1"/>
@@ -8074,6 +8451,7 @@
     </w:tblStylePr>
     <w:tblStylePr w:type="lastRow">
       <w:rPr>
+        <w:rFonts w:ascii="Arial" w:hAnsi="Arial" w:cs="Arial" w:eastAsia="Arial"/>
         <w:b/>
         <w:bCs/>
         <w:color w:val="000000" w:themeColor="text1"/>
@@ -8093,6 +8471,7 @@
     </w:tblStylePr>
     <w:tblStylePr w:type="firstCol">
       <w:rPr>
+        <w:rFonts w:ascii="Arial" w:hAnsi="Arial" w:cs="Arial" w:eastAsia="Arial"/>
         <w:b/>
         <w:bCs/>
         <w:color w:val="000000" w:themeColor="text1"/>
@@ -8112,6 +8491,7 @@
     </w:tblStylePr>
     <w:tblStylePr w:type="lastCol">
       <w:rPr>
+        <w:rFonts w:ascii="Arial" w:hAnsi="Arial" w:cs="Arial" w:eastAsia="Arial"/>
         <w:b w:val="0"/>
         <w:bCs w:val="0"/>
         <w:color w:val="000000" w:themeColor="text1"/>
@@ -8158,10 +8538,10 @@
     <w:uiPriority w:val="68"/>
     <w:rsid w:val="00CB0664"/>
     <w:pPr>
-      <w:spacing w:after="0" w:line="240" w:lineRule="auto"/>
+      <w:spacing w:after="0" w:line="480" w:lineRule="auto"/>
     </w:pPr>
     <w:rPr>
-      <w:rFonts w:asciiTheme="majorHAnsi" w:eastAsiaTheme="majorEastAsia" w:hAnsiTheme="majorHAnsi" w:cstheme="majorBidi"/>
+      <w:rFonts w:ascii="Arial" w:hAnsi="Arial" w:cs="Arial" w:eastAsia="Arial"/>
       <w:color w:val="000000" w:themeColor="text1"/>
     </w:rPr>
     <w:tblPr>
@@ -8188,6 +8568,7 @@
     </w:tcPr>
     <w:tblStylePr w:type="firstRow">
       <w:rPr>
+        <w:rFonts w:ascii="Arial" w:hAnsi="Arial" w:cs="Arial" w:eastAsia="Arial"/>
         <w:b/>
         <w:bCs/>
         <w:color w:val="000000" w:themeColor="text1"/>
@@ -8199,6 +8580,7 @@
     </w:tblStylePr>
     <w:tblStylePr w:type="lastRow">
       <w:rPr>
+        <w:rFonts w:ascii="Arial" w:hAnsi="Arial" w:cs="Arial" w:eastAsia="Arial"/>
         <w:b/>
         <w:bCs/>
         <w:color w:val="000000" w:themeColor="text1"/>
@@ -8218,6 +8600,7 @@
     </w:tblStylePr>
     <w:tblStylePr w:type="firstCol">
       <w:rPr>
+        <w:rFonts w:ascii="Arial" w:hAnsi="Arial" w:cs="Arial" w:eastAsia="Arial"/>
         <w:b/>
         <w:bCs/>
         <w:color w:val="000000" w:themeColor="text1"/>
@@ -8237,6 +8620,7 @@
     </w:tblStylePr>
     <w:tblStylePr w:type="lastCol">
       <w:rPr>
+        <w:rFonts w:ascii="Arial" w:hAnsi="Arial" w:cs="Arial" w:eastAsia="Arial"/>
         <w:b w:val="0"/>
         <w:bCs w:val="0"/>
         <w:color w:val="000000" w:themeColor="text1"/>
@@ -8283,10 +8667,10 @@
     <w:uiPriority w:val="68"/>
     <w:rsid w:val="00CB0664"/>
     <w:pPr>
-      <w:spacing w:after="0" w:line="240" w:lineRule="auto"/>
+      <w:spacing w:after="0" w:line="480" w:lineRule="auto"/>
     </w:pPr>
     <w:rPr>
-      <w:rFonts w:asciiTheme="majorHAnsi" w:eastAsiaTheme="majorEastAsia" w:hAnsiTheme="majorHAnsi" w:cstheme="majorBidi"/>
+      <w:rFonts w:ascii="Arial" w:hAnsi="Arial" w:cs="Arial" w:eastAsia="Arial"/>
       <w:color w:val="000000" w:themeColor="text1"/>
     </w:rPr>
     <w:tblPr>
@@ -8313,6 +8697,7 @@
     </w:tcPr>
     <w:tblStylePr w:type="firstRow">
       <w:rPr>
+        <w:rFonts w:ascii="Arial" w:hAnsi="Arial" w:cs="Arial" w:eastAsia="Arial"/>
         <w:b/>
         <w:bCs/>
         <w:color w:val="000000" w:themeColor="text1"/>
@@ -8324,6 +8709,7 @@
     </w:tblStylePr>
     <w:tblStylePr w:type="lastRow">
       <w:rPr>
+        <w:rFonts w:ascii="Arial" w:hAnsi="Arial" w:cs="Arial" w:eastAsia="Arial"/>
         <w:b/>
         <w:bCs/>
         <w:color w:val="000000" w:themeColor="text1"/>
@@ -8343,6 +8729,7 @@
     </w:tblStylePr>
     <w:tblStylePr w:type="firstCol">
       <w:rPr>
+        <w:rFonts w:ascii="Arial" w:hAnsi="Arial" w:cs="Arial" w:eastAsia="Arial"/>
         <w:b/>
         <w:bCs/>
         <w:color w:val="000000" w:themeColor="text1"/>
@@ -8362,6 +8749,7 @@
     </w:tblStylePr>
     <w:tblStylePr w:type="lastCol">
       <w:rPr>
+        <w:rFonts w:ascii="Arial" w:hAnsi="Arial" w:cs="Arial" w:eastAsia="Arial"/>
         <w:b w:val="0"/>
         <w:bCs w:val="0"/>
         <w:color w:val="000000" w:themeColor="text1"/>
@@ -8408,10 +8796,10 @@
     <w:uiPriority w:val="68"/>
     <w:rsid w:val="00CB0664"/>
     <w:pPr>
-      <w:spacing w:after="0" w:line="240" w:lineRule="auto"/>
+      <w:spacing w:after="0" w:line="480" w:lineRule="auto"/>
     </w:pPr>
     <w:rPr>
-      <w:rFonts w:asciiTheme="majorHAnsi" w:eastAsiaTheme="majorEastAsia" w:hAnsiTheme="majorHAnsi" w:cstheme="majorBidi"/>
+      <w:rFonts w:ascii="Arial" w:hAnsi="Arial" w:cs="Arial" w:eastAsia="Arial"/>
       <w:color w:val="000000" w:themeColor="text1"/>
     </w:rPr>
     <w:tblPr>
@@ -8438,6 +8826,7 @@
     </w:tcPr>
     <w:tblStylePr w:type="firstRow">
       <w:rPr>
+        <w:rFonts w:ascii="Arial" w:hAnsi="Arial" w:cs="Arial" w:eastAsia="Arial"/>
         <w:b/>
         <w:bCs/>
         <w:color w:val="000000" w:themeColor="text1"/>
@@ -8449,6 +8838,7 @@
     </w:tblStylePr>
     <w:tblStylePr w:type="lastRow">
       <w:rPr>
+        <w:rFonts w:ascii="Arial" w:hAnsi="Arial" w:cs="Arial" w:eastAsia="Arial"/>
         <w:b/>
         <w:bCs/>
         <w:color w:val="000000" w:themeColor="text1"/>
@@ -8468,6 +8858,7 @@
     </w:tblStylePr>
     <w:tblStylePr w:type="firstCol">
       <w:rPr>
+        <w:rFonts w:ascii="Arial" w:hAnsi="Arial" w:cs="Arial" w:eastAsia="Arial"/>
         <w:b/>
         <w:bCs/>
         <w:color w:val="000000" w:themeColor="text1"/>
@@ -8487,6 +8878,7 @@
     </w:tblStylePr>
     <w:tblStylePr w:type="lastCol">
       <w:rPr>
+        <w:rFonts w:ascii="Arial" w:hAnsi="Arial" w:cs="Arial" w:eastAsia="Arial"/>
         <w:b w:val="0"/>
         <w:bCs w:val="0"/>
         <w:color w:val="000000" w:themeColor="text1"/>
@@ -8533,7 +8925,7 @@
     <w:uiPriority w:val="69"/>
     <w:rsid w:val="00CB0664"/>
     <w:pPr>
-      <w:spacing w:after="0" w:line="240" w:lineRule="auto"/>
+      <w:spacing w:after="0" w:line="480" w:lineRule="auto"/>
     </w:pPr>
     <w:tblPr>
       <w:tblStyleRowBandSize w:val="1"/>
@@ -8559,6 +8951,7 @@
     </w:tcPr>
     <w:tblStylePr w:type="firstRow">
       <w:rPr>
+        <w:rFonts w:ascii="Arial" w:hAnsi="Arial" w:cs="Arial" w:eastAsia="Arial"/>
         <w:b/>
         <w:bCs/>
         <w:i w:val="0"/>
@@ -8580,6 +8973,7 @@
     </w:tblStylePr>
     <w:tblStylePr w:type="lastRow">
       <w:rPr>
+        <w:rFonts w:ascii="Arial" w:hAnsi="Arial" w:cs="Arial" w:eastAsia="Arial"/>
         <w:b/>
         <w:bCs/>
         <w:i w:val="0"/>
@@ -8601,6 +8995,7 @@
     </w:tblStylePr>
     <w:tblStylePr w:type="firstCol">
       <w:rPr>
+        <w:rFonts w:ascii="Arial" w:hAnsi="Arial" w:cs="Arial" w:eastAsia="Arial"/>
         <w:b/>
         <w:bCs/>
         <w:i w:val="0"/>
@@ -8620,6 +9015,7 @@
     </w:tblStylePr>
     <w:tblStylePr w:type="lastCol">
       <w:rPr>
+        <w:rFonts w:ascii="Arial" w:hAnsi="Arial" w:cs="Arial" w:eastAsia="Arial"/>
         <w:b/>
         <w:bCs/>
         <w:i w:val="0"/>
@@ -8674,7 +9070,7 @@
     <w:uiPriority w:val="69"/>
     <w:rsid w:val="00CB0664"/>
     <w:pPr>
-      <w:spacing w:after="0" w:line="240" w:lineRule="auto"/>
+      <w:spacing w:after="0" w:line="480" w:lineRule="auto"/>
     </w:pPr>
     <w:tblPr>
       <w:tblStyleRowBandSize w:val="1"/>
@@ -8700,6 +9096,7 @@
     </w:tcPr>
     <w:tblStylePr w:type="firstRow">
       <w:rPr>
+        <w:rFonts w:ascii="Arial" w:hAnsi="Arial" w:cs="Arial" w:eastAsia="Arial"/>
         <w:b/>
         <w:bCs/>
         <w:i w:val="0"/>
@@ -8721,6 +9118,7 @@
     </w:tblStylePr>
     <w:tblStylePr w:type="lastRow">
       <w:rPr>
+        <w:rFonts w:ascii="Arial" w:hAnsi="Arial" w:cs="Arial" w:eastAsia="Arial"/>
         <w:b/>
         <w:bCs/>
         <w:i w:val="0"/>
@@ -8742,6 +9140,7 @@
     </w:tblStylePr>
     <w:tblStylePr w:type="firstCol">
       <w:rPr>
+        <w:rFonts w:ascii="Arial" w:hAnsi="Arial" w:cs="Arial" w:eastAsia="Arial"/>
         <w:b/>
         <w:bCs/>
         <w:i w:val="0"/>
@@ -8761,6 +9160,7 @@
     </w:tblStylePr>
     <w:tblStylePr w:type="lastCol">
       <w:rPr>
+        <w:rFonts w:ascii="Arial" w:hAnsi="Arial" w:cs="Arial" w:eastAsia="Arial"/>
         <w:b/>
         <w:bCs/>
         <w:i w:val="0"/>
@@ -8815,7 +9215,7 @@
     <w:uiPriority w:val="69"/>
     <w:rsid w:val="00CB0664"/>
     <w:pPr>
-      <w:spacing w:after="0" w:line="240" w:lineRule="auto"/>
+      <w:spacing w:after="0" w:line="480" w:lineRule="auto"/>
     </w:pPr>
     <w:tblPr>
       <w:tblStyleRowBandSize w:val="1"/>
@@ -8841,6 +9241,7 @@
     </w:tcPr>
     <w:tblStylePr w:type="firstRow">
       <w:rPr>
+        <w:rFonts w:ascii="Arial" w:hAnsi="Arial" w:cs="Arial" w:eastAsia="Arial"/>
         <w:b/>
         <w:bCs/>
         <w:i w:val="0"/>
@@ -8862,6 +9263,7 @@
     </w:tblStylePr>
     <w:tblStylePr w:type="lastRow">
       <w:rPr>
+        <w:rFonts w:ascii="Arial" w:hAnsi="Arial" w:cs="Arial" w:eastAsia="Arial"/>
         <w:b/>
         <w:bCs/>
         <w:i w:val="0"/>
@@ -8883,6 +9285,7 @@
     </w:tblStylePr>
     <w:tblStylePr w:type="firstCol">
       <w:rPr>
+        <w:rFonts w:ascii="Arial" w:hAnsi="Arial" w:cs="Arial" w:eastAsia="Arial"/>
         <w:b/>
         <w:bCs/>
         <w:i w:val="0"/>
@@ -8902,6 +9305,7 @@
     </w:tblStylePr>
     <w:tblStylePr w:type="lastCol">
       <w:rPr>
+        <w:rFonts w:ascii="Arial" w:hAnsi="Arial" w:cs="Arial" w:eastAsia="Arial"/>
         <w:b/>
         <w:bCs/>
         <w:i w:val="0"/>
@@ -8956,7 +9360,7 @@
     <w:uiPriority w:val="69"/>
     <w:rsid w:val="00CB0664"/>
     <w:pPr>
-      <w:spacing w:after="0" w:line="240" w:lineRule="auto"/>
+      <w:spacing w:after="0" w:line="480" w:lineRule="auto"/>
     </w:pPr>
     <w:tblPr>
       <w:tblStyleRowBandSize w:val="1"/>
@@ -8982,6 +9386,7 @@
     </w:tcPr>
     <w:tblStylePr w:type="firstRow">
       <w:rPr>
+        <w:rFonts w:ascii="Arial" w:hAnsi="Arial" w:cs="Arial" w:eastAsia="Arial"/>
         <w:b/>
         <w:bCs/>
         <w:i w:val="0"/>
@@ -9003,6 +9408,7 @@
     </w:tblStylePr>
     <w:tblStylePr w:type="lastRow">
       <w:rPr>
+        <w:rFonts w:ascii="Arial" w:hAnsi="Arial" w:cs="Arial" w:eastAsia="Arial"/>
         <w:b/>
         <w:bCs/>
         <w:i w:val="0"/>
@@ -9024,6 +9430,7 @@
     </w:tblStylePr>
     <w:tblStylePr w:type="firstCol">
       <w:rPr>
+        <w:rFonts w:ascii="Arial" w:hAnsi="Arial" w:cs="Arial" w:eastAsia="Arial"/>
         <w:b/>
         <w:bCs/>
         <w:i w:val="0"/>
@@ -9043,6 +9450,7 @@
     </w:tblStylePr>
     <w:tblStylePr w:type="lastCol">
       <w:rPr>
+        <w:rFonts w:ascii="Arial" w:hAnsi="Arial" w:cs="Arial" w:eastAsia="Arial"/>
         <w:b/>
         <w:bCs/>
         <w:i w:val="0"/>
@@ -9097,7 +9505,7 @@
     <w:uiPriority w:val="69"/>
     <w:rsid w:val="00CB0664"/>
     <w:pPr>
-      <w:spacing w:after="0" w:line="240" w:lineRule="auto"/>
+      <w:spacing w:after="0" w:line="480" w:lineRule="auto"/>
     </w:pPr>
     <w:tblPr>
       <w:tblStyleRowBandSize w:val="1"/>
@@ -9123,6 +9531,7 @@
     </w:tcPr>
     <w:tblStylePr w:type="firstRow">
       <w:rPr>
+        <w:rFonts w:ascii="Arial" w:hAnsi="Arial" w:cs="Arial" w:eastAsia="Arial"/>
         <w:b/>
         <w:bCs/>
         <w:i w:val="0"/>
@@ -9144,6 +9553,7 @@
     </w:tblStylePr>
     <w:tblStylePr w:type="lastRow">
       <w:rPr>
+        <w:rFonts w:ascii="Arial" w:hAnsi="Arial" w:cs="Arial" w:eastAsia="Arial"/>
         <w:b/>
         <w:bCs/>
         <w:i w:val="0"/>
@@ -9165,6 +9575,7 @@
     </w:tblStylePr>
     <w:tblStylePr w:type="firstCol">
       <w:rPr>
+        <w:rFonts w:ascii="Arial" w:hAnsi="Arial" w:cs="Arial" w:eastAsia="Arial"/>
         <w:b/>
         <w:bCs/>
         <w:i w:val="0"/>
@@ -9184,6 +9595,7 @@
     </w:tblStylePr>
     <w:tblStylePr w:type="lastCol">
       <w:rPr>
+        <w:rFonts w:ascii="Arial" w:hAnsi="Arial" w:cs="Arial" w:eastAsia="Arial"/>
         <w:b/>
         <w:bCs/>
         <w:i w:val="0"/>
@@ -9238,7 +9650,7 @@
     <w:uiPriority w:val="69"/>
     <w:rsid w:val="00CB0664"/>
     <w:pPr>
-      <w:spacing w:after="0" w:line="240" w:lineRule="auto"/>
+      <w:spacing w:after="0" w:line="480" w:lineRule="auto"/>
     </w:pPr>
     <w:tblPr>
       <w:tblStyleRowBandSize w:val="1"/>
@@ -9264,6 +9676,7 @@
     </w:tcPr>
     <w:tblStylePr w:type="firstRow">
       <w:rPr>
+        <w:rFonts w:ascii="Arial" w:hAnsi="Arial" w:cs="Arial" w:eastAsia="Arial"/>
         <w:b/>
         <w:bCs/>
         <w:i w:val="0"/>
@@ -9285,6 +9698,7 @@
     </w:tblStylePr>
     <w:tblStylePr w:type="lastRow">
       <w:rPr>
+        <w:rFonts w:ascii="Arial" w:hAnsi="Arial" w:cs="Arial" w:eastAsia="Arial"/>
         <w:b/>
         <w:bCs/>
         <w:i w:val="0"/>
@@ -9306,6 +9720,7 @@
     </w:tblStylePr>
     <w:tblStylePr w:type="firstCol">
       <w:rPr>
+        <w:rFonts w:ascii="Arial" w:hAnsi="Arial" w:cs="Arial" w:eastAsia="Arial"/>
         <w:b/>
         <w:bCs/>
         <w:i w:val="0"/>
@@ -9325,6 +9740,7 @@
     </w:tblStylePr>
     <w:tblStylePr w:type="lastCol">
       <w:rPr>
+        <w:rFonts w:ascii="Arial" w:hAnsi="Arial" w:cs="Arial" w:eastAsia="Arial"/>
         <w:b/>
         <w:bCs/>
         <w:i w:val="0"/>
@@ -9379,7 +9795,7 @@
     <w:uiPriority w:val="69"/>
     <w:rsid w:val="00CB0664"/>
     <w:pPr>
-      <w:spacing w:after="0" w:line="240" w:lineRule="auto"/>
+      <w:spacing w:after="0" w:line="480" w:lineRule="auto"/>
     </w:pPr>
     <w:tblPr>
       <w:tblStyleRowBandSize w:val="1"/>
@@ -9405,6 +9821,7 @@
     </w:tcPr>
     <w:tblStylePr w:type="firstRow">
       <w:rPr>
+        <w:rFonts w:ascii="Arial" w:hAnsi="Arial" w:cs="Arial" w:eastAsia="Arial"/>
         <w:b/>
         <w:bCs/>
         <w:i w:val="0"/>
@@ -9426,6 +9843,7 @@
     </w:tblStylePr>
     <w:tblStylePr w:type="lastRow">
       <w:rPr>
+        <w:rFonts w:ascii="Arial" w:hAnsi="Arial" w:cs="Arial" w:eastAsia="Arial"/>
         <w:b/>
         <w:bCs/>
         <w:i w:val="0"/>
@@ -9447,6 +9865,7 @@
     </w:tblStylePr>
     <w:tblStylePr w:type="firstCol">
       <w:rPr>
+        <w:rFonts w:ascii="Arial" w:hAnsi="Arial" w:cs="Arial" w:eastAsia="Arial"/>
         <w:b/>
         <w:bCs/>
         <w:i w:val="0"/>
@@ -9466,6 +9885,7 @@
     </w:tblStylePr>
     <w:tblStylePr w:type="lastCol">
       <w:rPr>
+        <w:rFonts w:ascii="Arial" w:hAnsi="Arial" w:cs="Arial" w:eastAsia="Arial"/>
         <w:b/>
         <w:bCs/>
         <w:i w:val="0"/>
@@ -9520,9 +9940,10 @@
     <w:uiPriority w:val="70"/>
     <w:rsid w:val="00CB0664"/>
     <w:pPr>
-      <w:spacing w:after="0" w:line="240" w:lineRule="auto"/>
+      <w:spacing w:after="0" w:line="480" w:lineRule="auto"/>
     </w:pPr>
     <w:rPr>
+      <w:rFonts w:ascii="Arial" w:hAnsi="Arial" w:cs="Arial" w:eastAsia="Arial"/>
       <w:color w:val="FFFFFF" w:themeColor="background1"/>
     </w:rPr>
     <w:tblPr>
@@ -9541,6 +9962,7 @@
     </w:tcPr>
     <w:tblStylePr w:type="firstRow">
       <w:rPr>
+        <w:rFonts w:ascii="Arial" w:hAnsi="Arial" w:cs="Arial" w:eastAsia="Arial"/>
         <w:b/>
         <w:bCs/>
       </w:rPr>
@@ -9634,9 +10056,10 @@
     <w:uiPriority w:val="70"/>
     <w:rsid w:val="00CB0664"/>
     <w:pPr>
-      <w:spacing w:after="0" w:line="240" w:lineRule="auto"/>
+      <w:spacing w:after="0" w:line="480" w:lineRule="auto"/>
     </w:pPr>
     <w:rPr>
+      <w:rFonts w:ascii="Arial" w:hAnsi="Arial" w:cs="Arial" w:eastAsia="Arial"/>
       <w:color w:val="FFFFFF" w:themeColor="background1"/>
     </w:rPr>
     <w:tblPr>
@@ -9655,6 +10078,7 @@
     </w:tcPr>
     <w:tblStylePr w:type="firstRow">
       <w:rPr>
+        <w:rFonts w:ascii="Arial" w:hAnsi="Arial" w:cs="Arial" w:eastAsia="Arial"/>
         <w:b/>
         <w:bCs/>
       </w:rPr>
@@ -9748,9 +10172,10 @@
     <w:uiPriority w:val="70"/>
     <w:rsid w:val="00CB0664"/>
     <w:pPr>
-      <w:spacing w:after="0" w:line="240" w:lineRule="auto"/>
+      <w:spacing w:after="0" w:line="480" w:lineRule="auto"/>
     </w:pPr>
     <w:rPr>
+      <w:rFonts w:ascii="Arial" w:hAnsi="Arial" w:cs="Arial" w:eastAsia="Arial"/>
       <w:color w:val="FFFFFF" w:themeColor="background1"/>
     </w:rPr>
     <w:tblPr>
@@ -9769,6 +10194,7 @@
     </w:tcPr>
     <w:tblStylePr w:type="firstRow">
       <w:rPr>
+        <w:rFonts w:ascii="Arial" w:hAnsi="Arial" w:cs="Arial" w:eastAsia="Arial"/>
         <w:b/>
         <w:bCs/>
       </w:rPr>
@@ -9862,9 +10288,10 @@
     <w:uiPriority w:val="70"/>
     <w:rsid w:val="00CB0664"/>
     <w:pPr>
-      <w:spacing w:after="0" w:line="240" w:lineRule="auto"/>
+      <w:spacing w:after="0" w:line="480" w:lineRule="auto"/>
     </w:pPr>
     <w:rPr>
+      <w:rFonts w:ascii="Arial" w:hAnsi="Arial" w:cs="Arial" w:eastAsia="Arial"/>
       <w:color w:val="FFFFFF" w:themeColor="background1"/>
     </w:rPr>
     <w:tblPr>
@@ -9883,6 +10310,7 @@
     </w:tcPr>
     <w:tblStylePr w:type="firstRow">
       <w:rPr>
+        <w:rFonts w:ascii="Arial" w:hAnsi="Arial" w:cs="Arial" w:eastAsia="Arial"/>
         <w:b/>
         <w:bCs/>
       </w:rPr>
@@ -9976,9 +10404,10 @@
     <w:uiPriority w:val="70"/>
     <w:rsid w:val="00CB0664"/>
     <w:pPr>
-      <w:spacing w:after="0" w:line="240" w:lineRule="auto"/>
+      <w:spacing w:after="0" w:line="480" w:lineRule="auto"/>
     </w:pPr>
     <w:rPr>
+      <w:rFonts w:ascii="Arial" w:hAnsi="Arial" w:cs="Arial" w:eastAsia="Arial"/>
       <w:color w:val="FFFFFF" w:themeColor="background1"/>
     </w:rPr>
     <w:tblPr>
@@ -9997,6 +10426,7 @@
     </w:tcPr>
     <w:tblStylePr w:type="firstRow">
       <w:rPr>
+        <w:rFonts w:ascii="Arial" w:hAnsi="Arial" w:cs="Arial" w:eastAsia="Arial"/>
         <w:b/>
         <w:bCs/>
       </w:rPr>
@@ -10090,9 +10520,10 @@
     <w:uiPriority w:val="70"/>
     <w:rsid w:val="00CB0664"/>
     <w:pPr>
-      <w:spacing w:after="0" w:line="240" w:lineRule="auto"/>
+      <w:spacing w:after="0" w:line="480" w:lineRule="auto"/>
     </w:pPr>
     <w:rPr>
+      <w:rFonts w:ascii="Arial" w:hAnsi="Arial" w:cs="Arial" w:eastAsia="Arial"/>
       <w:color w:val="FFFFFF" w:themeColor="background1"/>
     </w:rPr>
     <w:tblPr>
@@ -10111,6 +10542,7 @@
     </w:tcPr>
     <w:tblStylePr w:type="firstRow">
       <w:rPr>
+        <w:rFonts w:ascii="Arial" w:hAnsi="Arial" w:cs="Arial" w:eastAsia="Arial"/>
         <w:b/>
         <w:bCs/>
       </w:rPr>
@@ -10204,9 +10636,10 @@
     <w:uiPriority w:val="70"/>
     <w:rsid w:val="00CB0664"/>
     <w:pPr>
-      <w:spacing w:after="0" w:line="240" w:lineRule="auto"/>
+      <w:spacing w:after="0" w:line="480" w:lineRule="auto"/>
     </w:pPr>
     <w:rPr>
+      <w:rFonts w:ascii="Arial" w:hAnsi="Arial" w:cs="Arial" w:eastAsia="Arial"/>
       <w:color w:val="FFFFFF" w:themeColor="background1"/>
     </w:rPr>
     <w:tblPr>
@@ -10225,6 +10658,7 @@
     </w:tcPr>
     <w:tblStylePr w:type="firstRow">
       <w:rPr>
+        <w:rFonts w:ascii="Arial" w:hAnsi="Arial" w:cs="Arial" w:eastAsia="Arial"/>
         <w:b/>
         <w:bCs/>
       </w:rPr>
@@ -10318,9 +10752,10 @@
     <w:uiPriority w:val="71"/>
     <w:rsid w:val="00CB0664"/>
     <w:pPr>
-      <w:spacing w:after="0" w:line="240" w:lineRule="auto"/>
+      <w:spacing w:after="0" w:line="480" w:lineRule="auto"/>
     </w:pPr>
     <w:rPr>
+      <w:rFonts w:ascii="Arial" w:hAnsi="Arial" w:cs="Arial" w:eastAsia="Arial"/>
       <w:color w:val="000000" w:themeColor="text1"/>
     </w:rPr>
     <w:tblPr>
@@ -10347,6 +10782,7 @@
     </w:tcPr>
     <w:tblStylePr w:type="firstRow">
       <w:rPr>
+        <w:rFonts w:ascii="Arial" w:hAnsi="Arial" w:cs="Arial" w:eastAsia="Arial"/>
         <w:b/>
         <w:bCs/>
       </w:rPr>
@@ -10365,6 +10801,7 @@
     </w:tblStylePr>
     <w:tblStylePr w:type="lastRow">
       <w:rPr>
+        <w:rFonts w:ascii="Arial" w:hAnsi="Arial" w:cs="Arial" w:eastAsia="Arial"/>
         <w:b/>
         <w:bCs/>
         <w:color w:val="FFFFFF" w:themeColor="background1"/>
@@ -10379,6 +10816,7 @@
     </w:tblStylePr>
     <w:tblStylePr w:type="firstCol">
       <w:rPr>
+        <w:rFonts w:ascii="Arial" w:hAnsi="Arial" w:cs="Arial" w:eastAsia="Arial"/>
         <w:color w:val="FFFFFF" w:themeColor="background1"/>
       </w:rPr>
       <w:tblPr/>
@@ -10396,6 +10834,7 @@
     </w:tblStylePr>
     <w:tblStylePr w:type="lastCol">
       <w:rPr>
+        <w:rFonts w:ascii="Arial" w:hAnsi="Arial" w:cs="Arial" w:eastAsia="Arial"/>
         <w:color w:val="FFFFFF" w:themeColor="background1"/>
       </w:rPr>
       <w:tblPr/>
@@ -10425,11 +10864,13 @@
     </w:tblStylePr>
     <w:tblStylePr w:type="neCell">
       <w:rPr>
+        <w:rFonts w:ascii="Arial" w:hAnsi="Arial" w:cs="Arial" w:eastAsia="Arial"/>
         <w:color w:val="000000" w:themeColor="text1"/>
       </w:rPr>
     </w:tblStylePr>
     <w:tblStylePr w:type="nwCell">
       <w:rPr>
+        <w:rFonts w:ascii="Arial" w:hAnsi="Arial" w:cs="Arial" w:eastAsia="Arial"/>
         <w:color w:val="000000" w:themeColor="text1"/>
       </w:rPr>
     </w:tblStylePr>
@@ -10440,9 +10881,10 @@
     <w:uiPriority w:val="71"/>
     <w:rsid w:val="00CB0664"/>
     <w:pPr>
-      <w:spacing w:after="0" w:line="240" w:lineRule="auto"/>
+      <w:spacing w:after="0" w:line="480" w:lineRule="auto"/>
     </w:pPr>
     <w:rPr>
+      <w:rFonts w:ascii="Arial" w:hAnsi="Arial" w:cs="Arial" w:eastAsia="Arial"/>
       <w:color w:val="000000" w:themeColor="text1"/>
     </w:rPr>
     <w:tblPr>
@@ -10469,6 +10911,7 @@
     </w:tcPr>
     <w:tblStylePr w:type="firstRow">
       <w:rPr>
+        <w:rFonts w:ascii="Arial" w:hAnsi="Arial" w:cs="Arial" w:eastAsia="Arial"/>
         <w:b/>
         <w:bCs/>
       </w:rPr>
@@ -10487,6 +10930,7 @@
     </w:tblStylePr>
     <w:tblStylePr w:type="lastRow">
       <w:rPr>
+        <w:rFonts w:ascii="Arial" w:hAnsi="Arial" w:cs="Arial" w:eastAsia="Arial"/>
         <w:b/>
         <w:bCs/>
         <w:color w:val="FFFFFF" w:themeColor="background1"/>
@@ -10501,6 +10945,7 @@
     </w:tblStylePr>
     <w:tblStylePr w:type="firstCol">
       <w:rPr>
+        <w:rFonts w:ascii="Arial" w:hAnsi="Arial" w:cs="Arial" w:eastAsia="Arial"/>
         <w:color w:val="FFFFFF" w:themeColor="background1"/>
       </w:rPr>
       <w:tblPr/>
@@ -10518,6 +10963,7 @@
     </w:tblStylePr>
     <w:tblStylePr w:type="lastCol">
       <w:rPr>
+        <w:rFonts w:ascii="Arial" w:hAnsi="Arial" w:cs="Arial" w:eastAsia="Arial"/>
         <w:color w:val="FFFFFF" w:themeColor="background1"/>
       </w:rPr>
       <w:tblPr/>
@@ -10547,11 +10993,13 @@
     </w:tblStylePr>
     <w:tblStylePr w:type="neCell">
       <w:rPr>
+        <w:rFonts w:ascii="Arial" w:hAnsi="Arial" w:cs="Arial" w:eastAsia="Arial"/>
         <w:color w:val="000000" w:themeColor="text1"/>
       </w:rPr>
     </w:tblStylePr>
     <w:tblStylePr w:type="nwCell">
       <w:rPr>
+        <w:rFonts w:ascii="Arial" w:hAnsi="Arial" w:cs="Arial" w:eastAsia="Arial"/>
         <w:color w:val="000000" w:themeColor="text1"/>
       </w:rPr>
     </w:tblStylePr>
@@ -10562,9 +11010,10 @@
     <w:uiPriority w:val="71"/>
     <w:rsid w:val="00CB0664"/>
     <w:pPr>
-      <w:spacing w:after="0" w:line="240" w:lineRule="auto"/>
+      <w:spacing w:after="0" w:line="480" w:lineRule="auto"/>
     </w:pPr>
     <w:rPr>
+      <w:rFonts w:ascii="Arial" w:hAnsi="Arial" w:cs="Arial" w:eastAsia="Arial"/>
       <w:color w:val="000000" w:themeColor="text1"/>
     </w:rPr>
     <w:tblPr>
@@ -10591,6 +11040,7 @@
     </w:tcPr>
     <w:tblStylePr w:type="firstRow">
       <w:rPr>
+        <w:rFonts w:ascii="Arial" w:hAnsi="Arial" w:cs="Arial" w:eastAsia="Arial"/>
         <w:b/>
         <w:bCs/>
       </w:rPr>
@@ -10609,6 +11059,7 @@
     </w:tblStylePr>
     <w:tblStylePr w:type="lastRow">
       <w:rPr>
+        <w:rFonts w:ascii="Arial" w:hAnsi="Arial" w:cs="Arial" w:eastAsia="Arial"/>
         <w:b/>
         <w:bCs/>
         <w:color w:val="FFFFFF" w:themeColor="background1"/>
@@ -10623,6 +11074,7 @@
     </w:tblStylePr>
     <w:tblStylePr w:type="firstCol">
       <w:rPr>
+        <w:rFonts w:ascii="Arial" w:hAnsi="Arial" w:cs="Arial" w:eastAsia="Arial"/>
         <w:color w:val="FFFFFF" w:themeColor="background1"/>
       </w:rPr>
       <w:tblPr/>
@@ -10640,6 +11092,7 @@
     </w:tblStylePr>
     <w:tblStylePr w:type="lastCol">
       <w:rPr>
+        <w:rFonts w:ascii="Arial" w:hAnsi="Arial" w:cs="Arial" w:eastAsia="Arial"/>
         <w:color w:val="FFFFFF" w:themeColor="background1"/>
       </w:rPr>
       <w:tblPr/>
@@ -10669,11 +11122,13 @@
     </w:tblStylePr>
     <w:tblStylePr w:type="neCell">
       <w:rPr>
+        <w:rFonts w:ascii="Arial" w:hAnsi="Arial" w:cs="Arial" w:eastAsia="Arial"/>
         <w:color w:val="000000" w:themeColor="text1"/>
       </w:rPr>
     </w:tblStylePr>
     <w:tblStylePr w:type="nwCell">
       <w:rPr>
+        <w:rFonts w:ascii="Arial" w:hAnsi="Arial" w:cs="Arial" w:eastAsia="Arial"/>
         <w:color w:val="000000" w:themeColor="text1"/>
       </w:rPr>
     </w:tblStylePr>
@@ -10684,9 +11139,10 @@
     <w:uiPriority w:val="71"/>
     <w:rsid w:val="00CB0664"/>
     <w:pPr>
-      <w:spacing w:after="0" w:line="240" w:lineRule="auto"/>
+      <w:spacing w:after="0" w:line="480" w:lineRule="auto"/>
     </w:pPr>
     <w:rPr>
+      <w:rFonts w:ascii="Arial" w:hAnsi="Arial" w:cs="Arial" w:eastAsia="Arial"/>
       <w:color w:val="000000" w:themeColor="text1"/>
     </w:rPr>
     <w:tblPr>
@@ -10713,6 +11169,7 @@
     </w:tcPr>
     <w:tblStylePr w:type="firstRow">
       <w:rPr>
+        <w:rFonts w:ascii="Arial" w:hAnsi="Arial" w:cs="Arial" w:eastAsia="Arial"/>
         <w:b/>
         <w:bCs/>
       </w:rPr>
@@ -10731,6 +11188,7 @@
     </w:tblStylePr>
     <w:tblStylePr w:type="lastRow">
       <w:rPr>
+        <w:rFonts w:ascii="Arial" w:hAnsi="Arial" w:cs="Arial" w:eastAsia="Arial"/>
         <w:b/>
         <w:bCs/>
         <w:color w:val="FFFFFF" w:themeColor="background1"/>
@@ -10745,6 +11203,7 @@
     </w:tblStylePr>
     <w:tblStylePr w:type="firstCol">
       <w:rPr>
+        <w:rFonts w:ascii="Arial" w:hAnsi="Arial" w:cs="Arial" w:eastAsia="Arial"/>
         <w:color w:val="FFFFFF" w:themeColor="background1"/>
       </w:rPr>
       <w:tblPr/>
@@ -10762,6 +11221,7 @@
     </w:tblStylePr>
     <w:tblStylePr w:type="lastCol">
       <w:rPr>
+        <w:rFonts w:ascii="Arial" w:hAnsi="Arial" w:cs="Arial" w:eastAsia="Arial"/>
         <w:color w:val="FFFFFF" w:themeColor="background1"/>
       </w:rPr>
       <w:tblPr/>
@@ -10796,9 +11256,10 @@
     <w:uiPriority w:val="71"/>
     <w:rsid w:val="00CB0664"/>
     <w:pPr>
-      <w:spacing w:after="0" w:line="240" w:lineRule="auto"/>
+      <w:spacing w:after="0" w:line="480" w:lineRule="auto"/>
     </w:pPr>
     <w:rPr>
+      <w:rFonts w:ascii="Arial" w:hAnsi="Arial" w:cs="Arial" w:eastAsia="Arial"/>
       <w:color w:val="000000" w:themeColor="text1"/>
     </w:rPr>
     <w:tblPr>
@@ -10825,6 +11286,7 @@
     </w:tcPr>
     <w:tblStylePr w:type="firstRow">
       <w:rPr>
+        <w:rFonts w:ascii="Arial" w:hAnsi="Arial" w:cs="Arial" w:eastAsia="Arial"/>
         <w:b/>
         <w:bCs/>
       </w:rPr>
@@ -10843,6 +11305,7 @@
     </w:tblStylePr>
     <w:tblStylePr w:type="lastRow">
       <w:rPr>
+        <w:rFonts w:ascii="Arial" w:hAnsi="Arial" w:cs="Arial" w:eastAsia="Arial"/>
         <w:b/>
         <w:bCs/>
         <w:color w:val="FFFFFF" w:themeColor="background1"/>
@@ -10857,6 +11320,7 @@
     </w:tblStylePr>
     <w:tblStylePr w:type="firstCol">
       <w:rPr>
+        <w:rFonts w:ascii="Arial" w:hAnsi="Arial" w:cs="Arial" w:eastAsia="Arial"/>
         <w:color w:val="FFFFFF" w:themeColor="background1"/>
       </w:rPr>
       <w:tblPr/>
@@ -10874,6 +11338,7 @@
     </w:tblStylePr>
     <w:tblStylePr w:type="lastCol">
       <w:rPr>
+        <w:rFonts w:ascii="Arial" w:hAnsi="Arial" w:cs="Arial" w:eastAsia="Arial"/>
         <w:color w:val="FFFFFF" w:themeColor="background1"/>
       </w:rPr>
       <w:tblPr/>
@@ -10903,11 +11368,13 @@
     </w:tblStylePr>
     <w:tblStylePr w:type="neCell">
       <w:rPr>
+        <w:rFonts w:ascii="Arial" w:hAnsi="Arial" w:cs="Arial" w:eastAsia="Arial"/>
         <w:color w:val="000000" w:themeColor="text1"/>
       </w:rPr>
     </w:tblStylePr>
     <w:tblStylePr w:type="nwCell">
       <w:rPr>
+        <w:rFonts w:ascii="Arial" w:hAnsi="Arial" w:cs="Arial" w:eastAsia="Arial"/>
         <w:color w:val="000000" w:themeColor="text1"/>
       </w:rPr>
     </w:tblStylePr>
@@ -10918,9 +11385,10 @@
     <w:uiPriority w:val="71"/>
     <w:rsid w:val="00CB0664"/>
     <w:pPr>
-      <w:spacing w:after="0" w:line="240" w:lineRule="auto"/>
+      <w:spacing w:after="0" w:line="480" w:lineRule="auto"/>
     </w:pPr>
     <w:rPr>
+      <w:rFonts w:ascii="Arial" w:hAnsi="Arial" w:cs="Arial" w:eastAsia="Arial"/>
       <w:color w:val="000000" w:themeColor="text1"/>
     </w:rPr>
     <w:tblPr>
@@ -10947,6 +11415,7 @@
     </w:tcPr>
     <w:tblStylePr w:type="firstRow">
       <w:rPr>
+        <w:rFonts w:ascii="Arial" w:hAnsi="Arial" w:cs="Arial" w:eastAsia="Arial"/>
         <w:b/>
         <w:bCs/>
       </w:rPr>
@@ -10965,6 +11434,7 @@
     </w:tblStylePr>
     <w:tblStylePr w:type="lastRow">
       <w:rPr>
+        <w:rFonts w:ascii="Arial" w:hAnsi="Arial" w:cs="Arial" w:eastAsia="Arial"/>
         <w:b/>
         <w:bCs/>
         <w:color w:val="FFFFFF" w:themeColor="background1"/>
@@ -10979,6 +11449,7 @@
     </w:tblStylePr>
     <w:tblStylePr w:type="firstCol">
       <w:rPr>
+        <w:rFonts w:ascii="Arial" w:hAnsi="Arial" w:cs="Arial" w:eastAsia="Arial"/>
         <w:color w:val="FFFFFF" w:themeColor="background1"/>
       </w:rPr>
       <w:tblPr/>
@@ -10996,6 +11467,7 @@
     </w:tblStylePr>
     <w:tblStylePr w:type="lastCol">
       <w:rPr>
+        <w:rFonts w:ascii="Arial" w:hAnsi="Arial" w:cs="Arial" w:eastAsia="Arial"/>
         <w:color w:val="FFFFFF" w:themeColor="background1"/>
       </w:rPr>
       <w:tblPr/>
@@ -11025,11 +11497,13 @@
     </w:tblStylePr>
     <w:tblStylePr w:type="neCell">
       <w:rPr>
+        <w:rFonts w:ascii="Arial" w:hAnsi="Arial" w:cs="Arial" w:eastAsia="Arial"/>
         <w:color w:val="000000" w:themeColor="text1"/>
       </w:rPr>
     </w:tblStylePr>
     <w:tblStylePr w:type="nwCell">
       <w:rPr>
+        <w:rFonts w:ascii="Arial" w:hAnsi="Arial" w:cs="Arial" w:eastAsia="Arial"/>
         <w:color w:val="000000" w:themeColor="text1"/>
       </w:rPr>
     </w:tblStylePr>
@@ -11040,9 +11514,10 @@
     <w:uiPriority w:val="71"/>
     <w:rsid w:val="00CB0664"/>
     <w:pPr>
-      <w:spacing w:after="0" w:line="240" w:lineRule="auto"/>
+      <w:spacing w:after="0" w:line="480" w:lineRule="auto"/>
     </w:pPr>
     <w:rPr>
+      <w:rFonts w:ascii="Arial" w:hAnsi="Arial" w:cs="Arial" w:eastAsia="Arial"/>
       <w:color w:val="000000" w:themeColor="text1"/>
     </w:rPr>
     <w:tblPr>
@@ -11069,6 +11544,7 @@
     </w:tcPr>
     <w:tblStylePr w:type="firstRow">
       <w:rPr>
+        <w:rFonts w:ascii="Arial" w:hAnsi="Arial" w:cs="Arial" w:eastAsia="Arial"/>
         <w:b/>
         <w:bCs/>
       </w:rPr>
@@ -11087,6 +11563,7 @@
     </w:tblStylePr>
     <w:tblStylePr w:type="lastRow">
       <w:rPr>
+        <w:rFonts w:ascii="Arial" w:hAnsi="Arial" w:cs="Arial" w:eastAsia="Arial"/>
         <w:b/>
         <w:bCs/>
         <w:color w:val="FFFFFF" w:themeColor="background1"/>
@@ -11101,6 +11578,7 @@
     </w:tblStylePr>
     <w:tblStylePr w:type="firstCol">
       <w:rPr>
+        <w:rFonts w:ascii="Arial" w:hAnsi="Arial" w:cs="Arial" w:eastAsia="Arial"/>
         <w:color w:val="FFFFFF" w:themeColor="background1"/>
       </w:rPr>
       <w:tblPr/>
@@ -11118,6 +11596,7 @@
     </w:tblStylePr>
     <w:tblStylePr w:type="lastCol">
       <w:rPr>
+        <w:rFonts w:ascii="Arial" w:hAnsi="Arial" w:cs="Arial" w:eastAsia="Arial"/>
         <w:color w:val="FFFFFF" w:themeColor="background1"/>
       </w:rPr>
       <w:tblPr/>
@@ -11147,11 +11626,13 @@
     </w:tblStylePr>
     <w:tblStylePr w:type="neCell">
       <w:rPr>
+        <w:rFonts w:ascii="Arial" w:hAnsi="Arial" w:cs="Arial" w:eastAsia="Arial"/>
         <w:color w:val="000000" w:themeColor="text1"/>
       </w:rPr>
     </w:tblStylePr>
     <w:tblStylePr w:type="nwCell">
       <w:rPr>
+        <w:rFonts w:ascii="Arial" w:hAnsi="Arial" w:cs="Arial" w:eastAsia="Arial"/>
         <w:color w:val="000000" w:themeColor="text1"/>
       </w:rPr>
     </w:tblStylePr>
@@ -11162,9 +11643,10 @@
     <w:uiPriority w:val="72"/>
     <w:rsid w:val="00CB0664"/>
     <w:pPr>
-      <w:spacing w:after="0" w:line="240" w:lineRule="auto"/>
+      <w:spacing w:after="0" w:line="480" w:lineRule="auto"/>
     </w:pPr>
     <w:rPr>
+      <w:rFonts w:ascii="Arial" w:hAnsi="Arial" w:cs="Arial" w:eastAsia="Arial"/>
       <w:color w:val="000000" w:themeColor="text1"/>
     </w:rPr>
     <w:tblPr>
@@ -11183,6 +11665,7 @@
     </w:tcPr>
     <w:tblStylePr w:type="firstRow">
       <w:rPr>
+        <w:rFonts w:ascii="Arial" w:hAnsi="Arial" w:cs="Arial" w:eastAsia="Arial"/>
         <w:b/>
         <w:bCs/>
         <w:color w:val="FFFFFF" w:themeColor="background1"/>
@@ -11197,6 +11680,7 @@
     </w:tblStylePr>
     <w:tblStylePr w:type="lastRow">
       <w:rPr>
+        <w:rFonts w:ascii="Arial" w:hAnsi="Arial" w:cs="Arial" w:eastAsia="Arial"/>
         <w:b/>
         <w:bCs/>
         <w:color w:val="9E3A38" w:themeColor="accent2" w:themeShade="CC"/>
@@ -11211,12 +11695,14 @@
     </w:tblStylePr>
     <w:tblStylePr w:type="firstCol">
       <w:rPr>
+        <w:rFonts w:ascii="Arial" w:hAnsi="Arial" w:cs="Arial" w:eastAsia="Arial"/>
         <w:b/>
         <w:bCs/>
       </w:rPr>
     </w:tblStylePr>
     <w:tblStylePr w:type="lastCol">
       <w:rPr>
+        <w:rFonts w:ascii="Arial" w:hAnsi="Arial" w:cs="Arial" w:eastAsia="Arial"/>
         <w:b/>
         <w:bCs/>
       </w:rPr>
@@ -11248,9 +11734,10 @@
     <w:uiPriority w:val="72"/>
     <w:rsid w:val="00CB0664"/>
     <w:pPr>
-      <w:spacing w:after="0" w:line="240" w:lineRule="auto"/>
+      <w:spacing w:after="0" w:line="480" w:lineRule="auto"/>
     </w:pPr>
     <w:rPr>
+      <w:rFonts w:ascii="Arial" w:hAnsi="Arial" w:cs="Arial" w:eastAsia="Arial"/>
       <w:color w:val="000000" w:themeColor="text1"/>
     </w:rPr>
     <w:tblPr>
@@ -11269,6 +11756,7 @@
     </w:tcPr>
     <w:tblStylePr w:type="firstRow">
       <w:rPr>
+        <w:rFonts w:ascii="Arial" w:hAnsi="Arial" w:cs="Arial" w:eastAsia="Arial"/>
         <w:b/>
         <w:bCs/>
         <w:color w:val="FFFFFF" w:themeColor="background1"/>
@@ -11283,6 +11771,7 @@
     </w:tblStylePr>
     <w:tblStylePr w:type="lastRow">
       <w:rPr>
+        <w:rFonts w:ascii="Arial" w:hAnsi="Arial" w:cs="Arial" w:eastAsia="Arial"/>
         <w:b/>
         <w:bCs/>
         <w:color w:val="9E3A38" w:themeColor="accent2" w:themeShade="CC"/>
@@ -11297,12 +11786,14 @@
     </w:tblStylePr>
     <w:tblStylePr w:type="firstCol">
       <w:rPr>
+        <w:rFonts w:ascii="Arial" w:hAnsi="Arial" w:cs="Arial" w:eastAsia="Arial"/>
         <w:b/>
         <w:bCs/>
       </w:rPr>
     </w:tblStylePr>
     <w:tblStylePr w:type="lastCol">
       <w:rPr>
+        <w:rFonts w:ascii="Arial" w:hAnsi="Arial" w:cs="Arial" w:eastAsia="Arial"/>
         <w:b/>
         <w:bCs/>
       </w:rPr>
@@ -11334,9 +11825,10 @@
     <w:uiPriority w:val="72"/>
     <w:rsid w:val="00CB0664"/>
     <w:pPr>
-      <w:spacing w:after="0" w:line="240" w:lineRule="auto"/>
+      <w:spacing w:after="0" w:line="480" w:lineRule="auto"/>
     </w:pPr>
     <w:rPr>
+      <w:rFonts w:ascii="Arial" w:hAnsi="Arial" w:cs="Arial" w:eastAsia="Arial"/>
       <w:color w:val="000000" w:themeColor="text1"/>
     </w:rPr>
     <w:tblPr>
@@ -11355,6 +11847,7 @@
     </w:tcPr>
     <w:tblStylePr w:type="firstRow">
       <w:rPr>
+        <w:rFonts w:ascii="Arial" w:hAnsi="Arial" w:cs="Arial" w:eastAsia="Arial"/>
         <w:b/>
         <w:bCs/>
         <w:color w:val="FFFFFF" w:themeColor="background1"/>
@@ -11369,6 +11862,7 @@
     </w:tblStylePr>
     <w:tblStylePr w:type="lastRow">
       <w:rPr>
+        <w:rFonts w:ascii="Arial" w:hAnsi="Arial" w:cs="Arial" w:eastAsia="Arial"/>
         <w:b/>
         <w:bCs/>
         <w:color w:val="9E3A38" w:themeColor="accent2" w:themeShade="CC"/>
@@ -11383,12 +11877,14 @@
     </w:tblStylePr>
     <w:tblStylePr w:type="firstCol">
       <w:rPr>
+        <w:rFonts w:ascii="Arial" w:hAnsi="Arial" w:cs="Arial" w:eastAsia="Arial"/>
         <w:b/>
         <w:bCs/>
       </w:rPr>
     </w:tblStylePr>
     <w:tblStylePr w:type="lastCol">
       <w:rPr>
+        <w:rFonts w:ascii="Arial" w:hAnsi="Arial" w:cs="Arial" w:eastAsia="Arial"/>
         <w:b/>
         <w:bCs/>
       </w:rPr>
@@ -11420,9 +11916,10 @@
     <w:uiPriority w:val="72"/>
     <w:rsid w:val="00CB0664"/>
     <w:pPr>
-      <w:spacing w:after="0" w:line="240" w:lineRule="auto"/>
+      <w:spacing w:after="0" w:line="480" w:lineRule="auto"/>
     </w:pPr>
     <w:rPr>
+      <w:rFonts w:ascii="Arial" w:hAnsi="Arial" w:cs="Arial" w:eastAsia="Arial"/>
       <w:color w:val="000000" w:themeColor="text1"/>
     </w:rPr>
     <w:tblPr>
@@ -11441,6 +11938,7 @@
     </w:tcPr>
     <w:tblStylePr w:type="firstRow">
       <w:rPr>
+        <w:rFonts w:ascii="Arial" w:hAnsi="Arial" w:cs="Arial" w:eastAsia="Arial"/>
         <w:b/>
         <w:bCs/>
         <w:color w:val="FFFFFF" w:themeColor="background1"/>
@@ -11455,6 +11953,7 @@
     </w:tblStylePr>
     <w:tblStylePr w:type="lastRow">
       <w:rPr>
+        <w:rFonts w:ascii="Arial" w:hAnsi="Arial" w:cs="Arial" w:eastAsia="Arial"/>
         <w:b/>
         <w:bCs/>
         <w:color w:val="664E82" w:themeColor="accent4" w:themeShade="CC"/>
@@ -11469,12 +11968,14 @@
     </w:tblStylePr>
     <w:tblStylePr w:type="firstCol">
       <w:rPr>
+        <w:rFonts w:ascii="Arial" w:hAnsi="Arial" w:cs="Arial" w:eastAsia="Arial"/>
         <w:b/>
         <w:bCs/>
       </w:rPr>
     </w:tblStylePr>
     <w:tblStylePr w:type="lastCol">
       <w:rPr>
+        <w:rFonts w:ascii="Arial" w:hAnsi="Arial" w:cs="Arial" w:eastAsia="Arial"/>
         <w:b/>
         <w:bCs/>
       </w:rPr>
@@ -11506,9 +12007,10 @@
     <w:uiPriority w:val="72"/>
     <w:rsid w:val="00CB0664"/>
     <w:pPr>
-      <w:spacing w:after="0" w:line="240" w:lineRule="auto"/>
+      <w:spacing w:after="0" w:line="480" w:lineRule="auto"/>
     </w:pPr>
     <w:rPr>
+      <w:rFonts w:ascii="Arial" w:hAnsi="Arial" w:cs="Arial" w:eastAsia="Arial"/>
       <w:color w:val="000000" w:themeColor="text1"/>
     </w:rPr>
     <w:tblPr>
@@ -11527,6 +12029,7 @@
     </w:tcPr>
     <w:tblStylePr w:type="firstRow">
       <w:rPr>
+        <w:rFonts w:ascii="Arial" w:hAnsi="Arial" w:cs="Arial" w:eastAsia="Arial"/>
         <w:b/>
         <w:bCs/>
         <w:color w:val="FFFFFF" w:themeColor="background1"/>
@@ -11541,6 +12044,7 @@
     </w:tblStylePr>
     <w:tblStylePr w:type="lastRow">
       <w:rPr>
+        <w:rFonts w:ascii="Arial" w:hAnsi="Arial" w:cs="Arial" w:eastAsia="Arial"/>
         <w:b/>
         <w:bCs/>
         <w:color w:val="7E9C40" w:themeColor="accent3" w:themeShade="CC"/>
@@ -11555,12 +12059,14 @@
     </w:tblStylePr>
     <w:tblStylePr w:type="firstCol">
       <w:rPr>
+        <w:rFonts w:ascii="Arial" w:hAnsi="Arial" w:cs="Arial" w:eastAsia="Arial"/>
         <w:b/>
         <w:bCs/>
       </w:rPr>
     </w:tblStylePr>
     <w:tblStylePr w:type="lastCol">
       <w:rPr>
+        <w:rFonts w:ascii="Arial" w:hAnsi="Arial" w:cs="Arial" w:eastAsia="Arial"/>
         <w:b/>
         <w:bCs/>
       </w:rPr>
@@ -11592,9 +12098,10 @@
     <w:uiPriority w:val="72"/>
     <w:rsid w:val="00CB0664"/>
     <w:pPr>
-      <w:spacing w:after="0" w:line="240" w:lineRule="auto"/>
+      <w:spacing w:after="0" w:line="480" w:lineRule="auto"/>
     </w:pPr>
     <w:rPr>
+      <w:rFonts w:ascii="Arial" w:hAnsi="Arial" w:cs="Arial" w:eastAsia="Arial"/>
       <w:color w:val="000000" w:themeColor="text1"/>
     </w:rPr>
     <w:tblPr>
@@ -11613,6 +12120,7 @@
     </w:tcPr>
     <w:tblStylePr w:type="firstRow">
       <w:rPr>
+        <w:rFonts w:ascii="Arial" w:hAnsi="Arial" w:cs="Arial" w:eastAsia="Arial"/>
         <w:b/>
         <w:bCs/>
         <w:color w:val="FFFFFF" w:themeColor="background1"/>
@@ -11627,6 +12135,7 @@
     </w:tblStylePr>
     <w:tblStylePr w:type="lastRow">
       <w:rPr>
+        <w:rFonts w:ascii="Arial" w:hAnsi="Arial" w:cs="Arial" w:eastAsia="Arial"/>
         <w:b/>
         <w:bCs/>
         <w:color w:val="F2730A" w:themeColor="accent6" w:themeShade="CC"/>
@@ -11641,12 +12150,14 @@
     </w:tblStylePr>
     <w:tblStylePr w:type="firstCol">
       <w:rPr>
+        <w:rFonts w:ascii="Arial" w:hAnsi="Arial" w:cs="Arial" w:eastAsia="Arial"/>
         <w:b/>
         <w:bCs/>
       </w:rPr>
     </w:tblStylePr>
     <w:tblStylePr w:type="lastCol">
       <w:rPr>
+        <w:rFonts w:ascii="Arial" w:hAnsi="Arial" w:cs="Arial" w:eastAsia="Arial"/>
         <w:b/>
         <w:bCs/>
       </w:rPr>
@@ -11678,9 +12189,10 @@
     <w:uiPriority w:val="72"/>
     <w:rsid w:val="00CB0664"/>
     <w:pPr>
-      <w:spacing w:after="0" w:line="240" w:lineRule="auto"/>
+      <w:spacing w:after="0" w:line="480" w:lineRule="auto"/>
     </w:pPr>
     <w:rPr>
+      <w:rFonts w:ascii="Arial" w:hAnsi="Arial" w:cs="Arial" w:eastAsia="Arial"/>
       <w:color w:val="000000" w:themeColor="text1"/>
     </w:rPr>
     <w:tblPr>
@@ -11699,6 +12211,7 @@
     </w:tcPr>
     <w:tblStylePr w:type="firstRow">
       <w:rPr>
+        <w:rFonts w:ascii="Arial" w:hAnsi="Arial" w:cs="Arial" w:eastAsia="Arial"/>
         <w:b/>
         <w:bCs/>
         <w:color w:val="FFFFFF" w:themeColor="background1"/>
@@ -11713,6 +12226,7 @@
     </w:tblStylePr>
     <w:tblStylePr w:type="lastRow">
       <w:rPr>
+        <w:rFonts w:ascii="Arial" w:hAnsi="Arial" w:cs="Arial" w:eastAsia="Arial"/>
         <w:b/>
         <w:bCs/>
         <w:color w:val="348DA5" w:themeColor="accent5" w:themeShade="CC"/>
@@ -11727,12 +12241,14 @@
     </w:tblStylePr>
     <w:tblStylePr w:type="firstCol">
       <w:rPr>
+        <w:rFonts w:ascii="Arial" w:hAnsi="Arial" w:cs="Arial" w:eastAsia="Arial"/>
         <w:b/>
         <w:bCs/>
       </w:rPr>
     </w:tblStylePr>
     <w:tblStylePr w:type="lastCol">
       <w:rPr>
+        <w:rFonts w:ascii="Arial" w:hAnsi="Arial" w:cs="Arial" w:eastAsia="Arial"/>
         <w:b/>
         <w:bCs/>
       </w:rPr>
@@ -11764,9 +12280,10 @@
     <w:uiPriority w:val="73"/>
     <w:rsid w:val="00CB0664"/>
     <w:pPr>
-      <w:spacing w:after="0" w:line="240" w:lineRule="auto"/>
+      <w:spacing w:after="0" w:line="480" w:lineRule="auto"/>
     </w:pPr>
     <w:rPr>
+      <w:rFonts w:ascii="Arial" w:hAnsi="Arial" w:cs="Arial" w:eastAsia="Arial"/>
       <w:color w:val="000000" w:themeColor="text1"/>
     </w:rPr>
     <w:tblPr>
@@ -11788,6 +12305,7 @@
     </w:tcPr>
     <w:tblStylePr w:type="firstRow">
       <w:rPr>
+        <w:rFonts w:ascii="Arial" w:hAnsi="Arial" w:cs="Arial" w:eastAsia="Arial"/>
         <w:b/>
         <w:bCs/>
       </w:rPr>
@@ -11798,6 +12316,7 @@
     </w:tblStylePr>
     <w:tblStylePr w:type="lastRow">
       <w:rPr>
+        <w:rFonts w:ascii="Arial" w:hAnsi="Arial" w:cs="Arial" w:eastAsia="Arial"/>
         <w:b/>
         <w:bCs/>
         <w:color w:val="000000" w:themeColor="text1"/>
@@ -11809,6 +12328,7 @@
     </w:tblStylePr>
     <w:tblStylePr w:type="firstCol">
       <w:rPr>
+        <w:rFonts w:ascii="Arial" w:hAnsi="Arial" w:cs="Arial" w:eastAsia="Arial"/>
         <w:color w:val="FFFFFF" w:themeColor="background1"/>
       </w:rPr>
       <w:tblPr/>
@@ -11818,6 +12338,7 @@
     </w:tblStylePr>
     <w:tblStylePr w:type="lastCol">
       <w:rPr>
+        <w:rFonts w:ascii="Arial" w:hAnsi="Arial" w:cs="Arial" w:eastAsia="Arial"/>
         <w:color w:val="FFFFFF" w:themeColor="background1"/>
       </w:rPr>
       <w:tblPr/>
@@ -11844,9 +12365,10 @@
     <w:uiPriority w:val="73"/>
     <w:rsid w:val="00CB0664"/>
     <w:pPr>
-      <w:spacing w:after="0" w:line="240" w:lineRule="auto"/>
+      <w:spacing w:after="0" w:line="480" w:lineRule="auto"/>
     </w:pPr>
     <w:rPr>
+      <w:rFonts w:ascii="Arial" w:hAnsi="Arial" w:cs="Arial" w:eastAsia="Arial"/>
       <w:color w:val="000000" w:themeColor="text1"/>
     </w:rPr>
     <w:tblPr>
@@ -11868,6 +12390,7 @@
     </w:tcPr>
     <w:tblStylePr w:type="firstRow">
       <w:rPr>
+        <w:rFonts w:ascii="Arial" w:hAnsi="Arial" w:cs="Arial" w:eastAsia="Arial"/>
         <w:b/>
         <w:bCs/>
       </w:rPr>
@@ -11878,6 +12401,7 @@
     </w:tblStylePr>
     <w:tblStylePr w:type="lastRow">
       <w:rPr>
+        <w:rFonts w:ascii="Arial" w:hAnsi="Arial" w:cs="Arial" w:eastAsia="Arial"/>
         <w:b/>
         <w:bCs/>
         <w:color w:val="000000" w:themeColor="text1"/>
@@ -11889,6 +12413,7 @@
     </w:tblStylePr>
     <w:tblStylePr w:type="firstCol">
       <w:rPr>
+        <w:rFonts w:ascii="Arial" w:hAnsi="Arial" w:cs="Arial" w:eastAsia="Arial"/>
         <w:color w:val="FFFFFF" w:themeColor="background1"/>
       </w:rPr>
       <w:tblPr/>
@@ -11898,6 +12423,7 @@
     </w:tblStylePr>
     <w:tblStylePr w:type="lastCol">
       <w:rPr>
+        <w:rFonts w:ascii="Arial" w:hAnsi="Arial" w:cs="Arial" w:eastAsia="Arial"/>
         <w:color w:val="FFFFFF" w:themeColor="background1"/>
       </w:rPr>
       <w:tblPr/>
@@ -11924,9 +12450,10 @@
     <w:uiPriority w:val="73"/>
     <w:rsid w:val="00CB0664"/>
     <w:pPr>
-      <w:spacing w:after="0" w:line="240" w:lineRule="auto"/>
+      <w:spacing w:after="0" w:line="480" w:lineRule="auto"/>
     </w:pPr>
     <w:rPr>
+      <w:rFonts w:ascii="Arial" w:hAnsi="Arial" w:cs="Arial" w:eastAsia="Arial"/>
       <w:color w:val="000000" w:themeColor="text1"/>
     </w:rPr>
     <w:tblPr>
@@ -11948,6 +12475,7 @@
     </w:tcPr>
     <w:tblStylePr w:type="firstRow">
       <w:rPr>
+        <w:rFonts w:ascii="Arial" w:hAnsi="Arial" w:cs="Arial" w:eastAsia="Arial"/>
         <w:b/>
         <w:bCs/>
       </w:rPr>
@@ -11958,6 +12486,7 @@
     </w:tblStylePr>
     <w:tblStylePr w:type="lastRow">
       <w:rPr>
+        <w:rFonts w:ascii="Arial" w:hAnsi="Arial" w:cs="Arial" w:eastAsia="Arial"/>
         <w:b/>
         <w:bCs/>
         <w:color w:val="000000" w:themeColor="text1"/>
@@ -11969,6 +12498,7 @@
     </w:tblStylePr>
     <w:tblStylePr w:type="firstCol">
       <w:rPr>
+        <w:rFonts w:ascii="Arial" w:hAnsi="Arial" w:cs="Arial" w:eastAsia="Arial"/>
         <w:color w:val="FFFFFF" w:themeColor="background1"/>
       </w:rPr>
       <w:tblPr/>
@@ -11978,6 +12508,7 @@
     </w:tblStylePr>
     <w:tblStylePr w:type="lastCol">
       <w:rPr>
+        <w:rFonts w:ascii="Arial" w:hAnsi="Arial" w:cs="Arial" w:eastAsia="Arial"/>
         <w:color w:val="FFFFFF" w:themeColor="background1"/>
       </w:rPr>
       <w:tblPr/>
@@ -12004,9 +12535,10 @@
     <w:uiPriority w:val="73"/>
     <w:rsid w:val="00CB0664"/>
     <w:pPr>
-      <w:spacing w:after="0" w:line="240" w:lineRule="auto"/>
+      <w:spacing w:after="0" w:line="480" w:lineRule="auto"/>
     </w:pPr>
     <w:rPr>
+      <w:rFonts w:ascii="Arial" w:hAnsi="Arial" w:cs="Arial" w:eastAsia="Arial"/>
       <w:color w:val="000000" w:themeColor="text1"/>
     </w:rPr>
     <w:tblPr>
@@ -12028,6 +12560,7 @@
     </w:tcPr>
     <w:tblStylePr w:type="firstRow">
       <w:rPr>
+        <w:rFonts w:ascii="Arial" w:hAnsi="Arial" w:cs="Arial" w:eastAsia="Arial"/>
         <w:b/>
         <w:bCs/>
       </w:rPr>
@@ -12038,6 +12571,7 @@
     </w:tblStylePr>
     <w:tblStylePr w:type="lastRow">
       <w:rPr>
+        <w:rFonts w:ascii="Arial" w:hAnsi="Arial" w:cs="Arial" w:eastAsia="Arial"/>
         <w:b/>
         <w:bCs/>
         <w:color w:val="000000" w:themeColor="text1"/>
@@ -12049,6 +12583,7 @@
     </w:tblStylePr>
     <w:tblStylePr w:type="firstCol">
       <w:rPr>
+        <w:rFonts w:ascii="Arial" w:hAnsi="Arial" w:cs="Arial" w:eastAsia="Arial"/>
         <w:color w:val="FFFFFF" w:themeColor="background1"/>
       </w:rPr>
       <w:tblPr/>
@@ -12058,6 +12593,7 @@
     </w:tblStylePr>
     <w:tblStylePr w:type="lastCol">
       <w:rPr>
+        <w:rFonts w:ascii="Arial" w:hAnsi="Arial" w:cs="Arial" w:eastAsia="Arial"/>
         <w:color w:val="FFFFFF" w:themeColor="background1"/>
       </w:rPr>
       <w:tblPr/>
@@ -12084,9 +12620,10 @@
     <w:uiPriority w:val="73"/>
     <w:rsid w:val="00CB0664"/>
     <w:pPr>
-      <w:spacing w:after="0" w:line="240" w:lineRule="auto"/>
+      <w:spacing w:after="0" w:line="480" w:lineRule="auto"/>
     </w:pPr>
     <w:rPr>
+      <w:rFonts w:ascii="Arial" w:hAnsi="Arial" w:cs="Arial" w:eastAsia="Arial"/>
       <w:color w:val="000000" w:themeColor="text1"/>
     </w:rPr>
     <w:tblPr>
@@ -12108,6 +12645,7 @@
     </w:tcPr>
     <w:tblStylePr w:type="firstRow">
       <w:rPr>
+        <w:rFonts w:ascii="Arial" w:hAnsi="Arial" w:cs="Arial" w:eastAsia="Arial"/>
         <w:b/>
         <w:bCs/>
       </w:rPr>
@@ -12118,6 +12656,7 @@
     </w:tblStylePr>
     <w:tblStylePr w:type="lastRow">
       <w:rPr>
+        <w:rFonts w:ascii="Arial" w:hAnsi="Arial" w:cs="Arial" w:eastAsia="Arial"/>
         <w:b/>
         <w:bCs/>
         <w:color w:val="000000" w:themeColor="text1"/>
@@ -12129,6 +12668,7 @@
     </w:tblStylePr>
     <w:tblStylePr w:type="firstCol">
       <w:rPr>
+        <w:rFonts w:ascii="Arial" w:hAnsi="Arial" w:cs="Arial" w:eastAsia="Arial"/>
         <w:color w:val="FFFFFF" w:themeColor="background1"/>
       </w:rPr>
       <w:tblPr/>
@@ -12138,6 +12678,7 @@
     </w:tblStylePr>
     <w:tblStylePr w:type="lastCol">
       <w:rPr>
+        <w:rFonts w:ascii="Arial" w:hAnsi="Arial" w:cs="Arial" w:eastAsia="Arial"/>
         <w:color w:val="FFFFFF" w:themeColor="background1"/>
       </w:rPr>
       <w:tblPr/>
@@ -12164,9 +12705,10 @@
     <w:uiPriority w:val="73"/>
     <w:rsid w:val="00CB0664"/>
     <w:pPr>
-      <w:spacing w:after="0" w:line="240" w:lineRule="auto"/>
+      <w:spacing w:after="0" w:line="480" w:lineRule="auto"/>
     </w:pPr>
     <w:rPr>
+      <w:rFonts w:ascii="Arial" w:hAnsi="Arial" w:cs="Arial" w:eastAsia="Arial"/>
       <w:color w:val="000000" w:themeColor="text1"/>
     </w:rPr>
     <w:tblPr>
@@ -12188,6 +12730,7 @@
     </w:tcPr>
     <w:tblStylePr w:type="firstRow">
       <w:rPr>
+        <w:rFonts w:ascii="Arial" w:hAnsi="Arial" w:cs="Arial" w:eastAsia="Arial"/>
         <w:b/>
         <w:bCs/>
       </w:rPr>
@@ -12198,6 +12741,7 @@
     </w:tblStylePr>
     <w:tblStylePr w:type="lastRow">
       <w:rPr>
+        <w:rFonts w:ascii="Arial" w:hAnsi="Arial" w:cs="Arial" w:eastAsia="Arial"/>
         <w:b/>
         <w:bCs/>
         <w:color w:val="000000" w:themeColor="text1"/>
@@ -12209,6 +12753,7 @@
     </w:tblStylePr>
     <w:tblStylePr w:type="firstCol">
       <w:rPr>
+        <w:rFonts w:ascii="Arial" w:hAnsi="Arial" w:cs="Arial" w:eastAsia="Arial"/>
         <w:color w:val="FFFFFF" w:themeColor="background1"/>
       </w:rPr>
       <w:tblPr/>
@@ -12218,6 +12763,7 @@
     </w:tblStylePr>
     <w:tblStylePr w:type="lastCol">
       <w:rPr>
+        <w:rFonts w:ascii="Arial" w:hAnsi="Arial" w:cs="Arial" w:eastAsia="Arial"/>
         <w:color w:val="FFFFFF" w:themeColor="background1"/>
       </w:rPr>
       <w:tblPr/>
@@ -12244,9 +12790,10 @@
     <w:uiPriority w:val="73"/>
     <w:rsid w:val="00CB0664"/>
     <w:pPr>
-      <w:spacing w:after="0" w:line="240" w:lineRule="auto"/>
+      <w:spacing w:after="0" w:line="480" w:lineRule="auto"/>
     </w:pPr>
     <w:rPr>
+      <w:rFonts w:ascii="Arial" w:hAnsi="Arial" w:cs="Arial" w:eastAsia="Arial"/>
       <w:color w:val="000000" w:themeColor="text1"/>
     </w:rPr>
     <w:tblPr>
@@ -12268,6 +12815,7 @@
     </w:tcPr>
     <w:tblStylePr w:type="firstRow">
       <w:rPr>
+        <w:rFonts w:ascii="Arial" w:hAnsi="Arial" w:cs="Arial" w:eastAsia="Arial"/>
         <w:b/>
         <w:bCs/>
       </w:rPr>
@@ -12278,6 +12826,7 @@
     </w:tblStylePr>
     <w:tblStylePr w:type="lastRow">
       <w:rPr>
+        <w:rFonts w:ascii="Arial" w:hAnsi="Arial" w:cs="Arial" w:eastAsia="Arial"/>
         <w:b/>
         <w:bCs/>
         <w:color w:val="000000" w:themeColor="text1"/>
@@ -12289,6 +12838,7 @@
     </w:tblStylePr>
     <w:tblStylePr w:type="firstCol">
       <w:rPr>
+        <w:rFonts w:ascii="Arial" w:hAnsi="Arial" w:cs="Arial" w:eastAsia="Arial"/>
         <w:color w:val="FFFFFF" w:themeColor="background1"/>
       </w:rPr>
       <w:tblPr/>
@@ -12298,6 +12848,7 @@
     </w:tblStylePr>
     <w:tblStylePr w:type="lastCol">
       <w:rPr>
+        <w:rFonts w:ascii="Arial" w:hAnsi="Arial" w:cs="Arial" w:eastAsia="Arial"/>
         <w:color w:val="FFFFFF" w:themeColor="background1"/>
       </w:rPr>
       <w:tblPr/>

</xml_diff>